<commit_message>
Deployed 22c23b5 with MkDocs version: 1.6.1
</commit_message>
<xml_diff>
--- a/SafeVixAI_MASTER.docx
+++ b/SafeVixAI_MASTER.docx
@@ -33723,7 +33723,7 @@
           <w:i w:val="0"/>
           <w:sz w:val="22"/>
         </w:rPr>
-        <w:t>🕐 Last auto-updated: 2026-05-08 23:09 IST</w:t>
+        <w:t>🕐 Last auto-updated: 2026-05-11 21:28 IST</w:t>
       </w:r>
     </w:p>
     <w:p>
@@ -33747,16 +33747,216 @@
         <w:t>Repository Overview</w:t>
       </w:r>
     </w:p>
-    <w:p>
-      <w:r>
-        <w:rPr>
-          <w:b w:val="0"/>
-          <w:i/>
-          <w:sz w:val="20"/>
-        </w:rPr>
-        <w:t>⚠ Could not fetch repository statistics.</w:t>
-      </w:r>
-    </w:p>
+    <w:tbl>
+      <w:tblPr>
+        <w:tblStyle w:val="LightGrid-Accent1"/>
+        <w:tblW w:type="auto" w:w="0"/>
+        <w:jc w:val="center"/>
+        <w:tblLook w:firstColumn="1" w:firstRow="1" w:lastColumn="0" w:lastRow="0" w:noHBand="0" w:noVBand="1" w:val="04A0"/>
+      </w:tblPr>
+      <w:tblGrid>
+        <w:gridCol w:w="4320"/>
+        <w:gridCol w:w="4320"/>
+      </w:tblGrid>
+      <w:tr>
+        <w:tc>
+          <w:tcPr>
+            <w:tcW w:type="dxa" w:w="4320"/>
+          </w:tcPr>
+          <w:p>
+            <w:r>
+              <w:rPr>
+                <w:b/>
+                <w:sz w:val="18"/>
+              </w:rPr>
+              <w:t>Metric</w:t>
+            </w:r>
+          </w:p>
+        </w:tc>
+        <w:tc>
+          <w:tcPr>
+            <w:tcW w:type="dxa" w:w="4320"/>
+          </w:tcPr>
+          <w:p>
+            <w:r>
+              <w:rPr>
+                <w:b/>
+                <w:sz w:val="18"/>
+              </w:rPr>
+              <w:t>Value</w:t>
+            </w:r>
+          </w:p>
+        </w:tc>
+      </w:tr>
+      <w:tr>
+        <w:tc>
+          <w:tcPr>
+            <w:tcW w:type="dxa" w:w="4320"/>
+          </w:tcPr>
+          <w:p>
+            <w:r>
+              <w:rPr>
+                <w:sz w:val="18"/>
+              </w:rPr>
+              <w:t>⭐ Stars</w:t>
+            </w:r>
+          </w:p>
+        </w:tc>
+        <w:tc>
+          <w:tcPr>
+            <w:tcW w:type="dxa" w:w="4320"/>
+          </w:tcPr>
+          <w:p>
+            <w:r>
+              <w:rPr>
+                <w:sz w:val="18"/>
+              </w:rPr>
+              <w:t>0</w:t>
+            </w:r>
+          </w:p>
+        </w:tc>
+      </w:tr>
+      <w:tr>
+        <w:tc>
+          <w:tcPr>
+            <w:tcW w:type="dxa" w:w="4320"/>
+          </w:tcPr>
+          <w:p>
+            <w:r>
+              <w:rPr>
+                <w:sz w:val="18"/>
+              </w:rPr>
+              <w:t>🍴 Forks</w:t>
+            </w:r>
+          </w:p>
+        </w:tc>
+        <w:tc>
+          <w:tcPr>
+            <w:tcW w:type="dxa" w:w="4320"/>
+          </w:tcPr>
+          <w:p>
+            <w:r>
+              <w:rPr>
+                <w:sz w:val="18"/>
+              </w:rPr>
+              <w:t>0</w:t>
+            </w:r>
+          </w:p>
+        </w:tc>
+      </w:tr>
+      <w:tr>
+        <w:tc>
+          <w:tcPr>
+            <w:tcW w:type="dxa" w:w="4320"/>
+          </w:tcPr>
+          <w:p>
+            <w:r>
+              <w:rPr>
+                <w:sz w:val="18"/>
+              </w:rPr>
+              <w:t>📦 Repo Size</w:t>
+            </w:r>
+          </w:p>
+        </w:tc>
+        <w:tc>
+          <w:tcPr>
+            <w:tcW w:type="dxa" w:w="4320"/>
+          </w:tcPr>
+          <w:p>
+            <w:r>
+              <w:rPr>
+                <w:sz w:val="18"/>
+              </w:rPr>
+              <w:t>46 MB</w:t>
+            </w:r>
+          </w:p>
+        </w:tc>
+      </w:tr>
+      <w:tr>
+        <w:tc>
+          <w:tcPr>
+            <w:tcW w:type="dxa" w:w="4320"/>
+          </w:tcPr>
+          <w:p>
+            <w:r>
+              <w:rPr>
+                <w:sz w:val="18"/>
+              </w:rPr>
+              <w:t>🔀 Default Branch</w:t>
+            </w:r>
+          </w:p>
+        </w:tc>
+        <w:tc>
+          <w:tcPr>
+            <w:tcW w:type="dxa" w:w="4320"/>
+          </w:tcPr>
+          <w:p>
+            <w:r>
+              <w:rPr>
+                <w:sz w:val="18"/>
+              </w:rPr>
+              <w:t>main</w:t>
+            </w:r>
+          </w:p>
+        </w:tc>
+      </w:tr>
+      <w:tr>
+        <w:tc>
+          <w:tcPr>
+            <w:tcW w:type="dxa" w:w="4320"/>
+          </w:tcPr>
+          <w:p>
+            <w:r>
+              <w:rPr>
+                <w:sz w:val="18"/>
+              </w:rPr>
+              <w:t>📅 Last Updated</w:t>
+            </w:r>
+          </w:p>
+        </w:tc>
+        <w:tc>
+          <w:tcPr>
+            <w:tcW w:type="dxa" w:w="4320"/>
+          </w:tcPr>
+          <w:p>
+            <w:r>
+              <w:rPr>
+                <w:sz w:val="18"/>
+              </w:rPr>
+              <w:t>2026-05-11</w:t>
+            </w:r>
+          </w:p>
+        </w:tc>
+      </w:tr>
+      <w:tr>
+        <w:tc>
+          <w:tcPr>
+            <w:tcW w:type="dxa" w:w="4320"/>
+          </w:tcPr>
+          <w:p>
+            <w:r>
+              <w:rPr>
+                <w:sz w:val="18"/>
+              </w:rPr>
+              <w:t>🐛 Open Issues</w:t>
+            </w:r>
+          </w:p>
+        </w:tc>
+        <w:tc>
+          <w:tcPr>
+            <w:tcW w:type="dxa" w:w="4320"/>
+          </w:tcPr>
+          <w:p>
+            <w:r>
+              <w:rPr>
+                <w:sz w:val="18"/>
+              </w:rPr>
+              <w:t>1</w:t>
+            </w:r>
+          </w:p>
+        </w:tc>
+      </w:tr>
+    </w:tbl>
     <w:p>
       <w:pPr>
         <w:pStyle w:val="Heading2"/>
@@ -33860,7 +34060,7 @@
               <w:rPr>
                 <w:sz w:val="18"/>
               </w:rPr>
-              <w:t>651ms | HTTP 404 | v?</w:t>
+              <w:t>130ms | HTTP 404 | v?</w:t>
             </w:r>
           </w:p>
         </w:tc>
@@ -33901,7 +34101,7 @@
               <w:rPr>
                 <w:sz w:val="18"/>
               </w:rPr>
-              <w:t>694ms | HTTP 404 | v?</w:t>
+              <w:t>140ms | HTTP 404 | v?</w:t>
             </w:r>
           </w:p>
         </w:tc>
@@ -33942,7 +34142,7 @@
               <w:rPr>
                 <w:sz w:val="18"/>
               </w:rPr>
-              <w:t>617ms | HTTP 200 | v?</w:t>
+              <w:t>173ms | HTTP 200 | v?</w:t>
             </w:r>
           </w:p>
         </w:tc>
@@ -33969,16 +34169,510 @@
         <w:t>Recent CI/CD Runs</w:t>
       </w:r>
     </w:p>
-    <w:p>
-      <w:r>
-        <w:rPr>
-          <w:b w:val="0"/>
-          <w:i/>
-          <w:sz w:val="20"/>
-        </w:rPr>
-        <w:t>No recent CI/CD runs found.</w:t>
-      </w:r>
-    </w:p>
+    <w:tbl>
+      <w:tblPr>
+        <w:tblStyle w:val="LightGrid-Accent1"/>
+        <w:tblW w:type="auto" w:w="0"/>
+        <w:jc w:val="center"/>
+        <w:tblLook w:firstColumn="1" w:firstRow="1" w:lastColumn="0" w:lastRow="0" w:noHBand="0" w:noVBand="1" w:val="04A0"/>
+      </w:tblPr>
+      <w:tblGrid>
+        <w:gridCol w:w="2160"/>
+        <w:gridCol w:w="2160"/>
+        <w:gridCol w:w="2160"/>
+        <w:gridCol w:w="2160"/>
+      </w:tblGrid>
+      <w:tr>
+        <w:tc>
+          <w:tcPr>
+            <w:tcW w:type="dxa" w:w="2160"/>
+          </w:tcPr>
+          <w:p>
+            <w:r>
+              <w:rPr>
+                <w:b/>
+                <w:sz w:val="18"/>
+              </w:rPr>
+              <w:t>Workflow</w:t>
+            </w:r>
+          </w:p>
+        </w:tc>
+        <w:tc>
+          <w:tcPr>
+            <w:tcW w:type="dxa" w:w="2160"/>
+          </w:tcPr>
+          <w:p>
+            <w:r>
+              <w:rPr>
+                <w:b/>
+                <w:sz w:val="18"/>
+              </w:rPr>
+              <w:t>Branch</w:t>
+            </w:r>
+          </w:p>
+        </w:tc>
+        <w:tc>
+          <w:tcPr>
+            <w:tcW w:type="dxa" w:w="2160"/>
+          </w:tcPr>
+          <w:p>
+            <w:r>
+              <w:rPr>
+                <w:b/>
+                <w:sz w:val="18"/>
+              </w:rPr>
+              <w:t>Result</w:t>
+            </w:r>
+          </w:p>
+        </w:tc>
+        <w:tc>
+          <w:tcPr>
+            <w:tcW w:type="dxa" w:w="2160"/>
+          </w:tcPr>
+          <w:p>
+            <w:r>
+              <w:rPr>
+                <w:b/>
+                <w:sz w:val="18"/>
+              </w:rPr>
+              <w:t>Date</w:t>
+            </w:r>
+          </w:p>
+        </w:tc>
+      </w:tr>
+      <w:tr>
+        <w:tc>
+          <w:tcPr>
+            <w:tcW w:type="dxa" w:w="2160"/>
+          </w:tcPr>
+          <w:p>
+            <w:r>
+              <w:rPr>
+                <w:sz w:val="18"/>
+              </w:rPr>
+              <w:t>⏳ Deploy Enterprise Docs</w:t>
+            </w:r>
+          </w:p>
+        </w:tc>
+        <w:tc>
+          <w:tcPr>
+            <w:tcW w:type="dxa" w:w="2160"/>
+          </w:tcPr>
+          <w:p>
+            <w:r>
+              <w:rPr>
+                <w:sz w:val="18"/>
+              </w:rPr>
+              <w:t>main</w:t>
+            </w:r>
+          </w:p>
+        </w:tc>
+        <w:tc>
+          <w:tcPr>
+            <w:tcW w:type="dxa" w:w="2160"/>
+          </w:tcPr>
+          <w:p>
+            <w:r>
+              <w:rPr>
+                <w:sz w:val="18"/>
+              </w:rPr>
+              <w:t>in_progress</w:t>
+            </w:r>
+          </w:p>
+        </w:tc>
+        <w:tc>
+          <w:tcPr>
+            <w:tcW w:type="dxa" w:w="2160"/>
+          </w:tcPr>
+          <w:p>
+            <w:r>
+              <w:rPr>
+                <w:sz w:val="18"/>
+              </w:rPr>
+              <w:t>2026-05-11</w:t>
+            </w:r>
+          </w:p>
+        </w:tc>
+      </w:tr>
+      <w:tr>
+        <w:tc>
+          <w:tcPr>
+            <w:tcW w:type="dxa" w:w="2160"/>
+          </w:tcPr>
+          <w:p>
+            <w:r>
+              <w:rPr>
+                <w:sz w:val="18"/>
+              </w:rPr>
+              <w:t>⏳ Update Master Document</w:t>
+            </w:r>
+          </w:p>
+        </w:tc>
+        <w:tc>
+          <w:tcPr>
+            <w:tcW w:type="dxa" w:w="2160"/>
+          </w:tcPr>
+          <w:p>
+            <w:r>
+              <w:rPr>
+                <w:sz w:val="18"/>
+              </w:rPr>
+              <w:t>main</w:t>
+            </w:r>
+          </w:p>
+        </w:tc>
+        <w:tc>
+          <w:tcPr>
+            <w:tcW w:type="dxa" w:w="2160"/>
+          </w:tcPr>
+          <w:p>
+            <w:r>
+              <w:rPr>
+                <w:sz w:val="18"/>
+              </w:rPr>
+              <w:t>in_progress</w:t>
+            </w:r>
+          </w:p>
+        </w:tc>
+        <w:tc>
+          <w:tcPr>
+            <w:tcW w:type="dxa" w:w="2160"/>
+          </w:tcPr>
+          <w:p>
+            <w:r>
+              <w:rPr>
+                <w:sz w:val="18"/>
+              </w:rPr>
+              <w:t>2026-05-11</w:t>
+            </w:r>
+          </w:p>
+        </w:tc>
+      </w:tr>
+      <w:tr>
+        <w:tc>
+          <w:tcPr>
+            <w:tcW w:type="dxa" w:w="2160"/>
+          </w:tcPr>
+          <w:p>
+            <w:r>
+              <w:rPr>
+                <w:sz w:val="18"/>
+              </w:rPr>
+              <w:t>⏳ Security &amp; SAST Audit</w:t>
+            </w:r>
+          </w:p>
+        </w:tc>
+        <w:tc>
+          <w:tcPr>
+            <w:tcW w:type="dxa" w:w="2160"/>
+          </w:tcPr>
+          <w:p>
+            <w:r>
+              <w:rPr>
+                <w:sz w:val="18"/>
+              </w:rPr>
+              <w:t>main</w:t>
+            </w:r>
+          </w:p>
+        </w:tc>
+        <w:tc>
+          <w:tcPr>
+            <w:tcW w:type="dxa" w:w="2160"/>
+          </w:tcPr>
+          <w:p>
+            <w:r>
+              <w:rPr>
+                <w:sz w:val="18"/>
+              </w:rPr>
+              <w:t>in_progress</w:t>
+            </w:r>
+          </w:p>
+        </w:tc>
+        <w:tc>
+          <w:tcPr>
+            <w:tcW w:type="dxa" w:w="2160"/>
+          </w:tcPr>
+          <w:p>
+            <w:r>
+              <w:rPr>
+                <w:sz w:val="18"/>
+              </w:rPr>
+              <w:t>2026-05-11</w:t>
+            </w:r>
+          </w:p>
+        </w:tc>
+      </w:tr>
+      <w:tr>
+        <w:tc>
+          <w:tcPr>
+            <w:tcW w:type="dxa" w:w="2160"/>
+          </w:tcPr>
+          <w:p>
+            <w:r>
+              <w:rPr>
+                <w:sz w:val="18"/>
+              </w:rPr>
+              <w:t>⏳ Wiki Documentation Sync</w:t>
+            </w:r>
+          </w:p>
+        </w:tc>
+        <w:tc>
+          <w:tcPr>
+            <w:tcW w:type="dxa" w:w="2160"/>
+          </w:tcPr>
+          <w:p>
+            <w:r>
+              <w:rPr>
+                <w:sz w:val="18"/>
+              </w:rPr>
+              <w:t>main</w:t>
+            </w:r>
+          </w:p>
+        </w:tc>
+        <w:tc>
+          <w:tcPr>
+            <w:tcW w:type="dxa" w:w="2160"/>
+          </w:tcPr>
+          <w:p>
+            <w:r>
+              <w:rPr>
+                <w:sz w:val="18"/>
+              </w:rPr>
+              <w:t>in_progress</w:t>
+            </w:r>
+          </w:p>
+        </w:tc>
+        <w:tc>
+          <w:tcPr>
+            <w:tcW w:type="dxa" w:w="2160"/>
+          </w:tcPr>
+          <w:p>
+            <w:r>
+              <w:rPr>
+                <w:sz w:val="18"/>
+              </w:rPr>
+              <w:t>2026-05-11</w:t>
+            </w:r>
+          </w:p>
+        </w:tc>
+      </w:tr>
+      <w:tr>
+        <w:tc>
+          <w:tcPr>
+            <w:tcW w:type="dxa" w:w="2160"/>
+          </w:tcPr>
+          <w:p>
+            <w:r>
+              <w:rPr>
+                <w:sz w:val="18"/>
+              </w:rPr>
+              <w:t>⏳ Code Quality: Push on main</w:t>
+            </w:r>
+          </w:p>
+        </w:tc>
+        <w:tc>
+          <w:tcPr>
+            <w:tcW w:type="dxa" w:w="2160"/>
+          </w:tcPr>
+          <w:p>
+            <w:r>
+              <w:rPr>
+                <w:sz w:val="18"/>
+              </w:rPr>
+              <w:t>main</w:t>
+            </w:r>
+          </w:p>
+        </w:tc>
+        <w:tc>
+          <w:tcPr>
+            <w:tcW w:type="dxa" w:w="2160"/>
+          </w:tcPr>
+          <w:p>
+            <w:r>
+              <w:rPr>
+                <w:sz w:val="18"/>
+              </w:rPr>
+              <w:t>in_progress</w:t>
+            </w:r>
+          </w:p>
+        </w:tc>
+        <w:tc>
+          <w:tcPr>
+            <w:tcW w:type="dxa" w:w="2160"/>
+          </w:tcPr>
+          <w:p>
+            <w:r>
+              <w:rPr>
+                <w:sz w:val="18"/>
+              </w:rPr>
+              <w:t>2026-05-11</w:t>
+            </w:r>
+          </w:p>
+        </w:tc>
+      </w:tr>
+      <w:tr>
+        <w:tc>
+          <w:tcPr>
+            <w:tcW w:type="dxa" w:w="2160"/>
+          </w:tcPr>
+          <w:p>
+            <w:r>
+              <w:rPr>
+                <w:sz w:val="18"/>
+              </w:rPr>
+              <w:t>⏳ Push on main</w:t>
+            </w:r>
+          </w:p>
+        </w:tc>
+        <w:tc>
+          <w:tcPr>
+            <w:tcW w:type="dxa" w:w="2160"/>
+          </w:tcPr>
+          <w:p>
+            <w:r>
+              <w:rPr>
+                <w:sz w:val="18"/>
+              </w:rPr>
+              <w:t>main</w:t>
+            </w:r>
+          </w:p>
+        </w:tc>
+        <w:tc>
+          <w:tcPr>
+            <w:tcW w:type="dxa" w:w="2160"/>
+          </w:tcPr>
+          <w:p>
+            <w:r>
+              <w:rPr>
+                <w:sz w:val="18"/>
+              </w:rPr>
+              <w:t>in_progress</w:t>
+            </w:r>
+          </w:p>
+        </w:tc>
+        <w:tc>
+          <w:tcPr>
+            <w:tcW w:type="dxa" w:w="2160"/>
+          </w:tcPr>
+          <w:p>
+            <w:r>
+              <w:rPr>
+                <w:sz w:val="18"/>
+              </w:rPr>
+              <w:t>2026-05-11</w:t>
+            </w:r>
+          </w:p>
+        </w:tc>
+      </w:tr>
+      <w:tr>
+        <w:tc>
+          <w:tcPr>
+            <w:tcW w:type="dxa" w:w="2160"/>
+          </w:tcPr>
+          <w:p>
+            <w:r>
+              <w:rPr>
+                <w:sz w:val="18"/>
+              </w:rPr>
+              <w:t>✅ Frontend Unit Tests</w:t>
+            </w:r>
+          </w:p>
+        </w:tc>
+        <w:tc>
+          <w:tcPr>
+            <w:tcW w:type="dxa" w:w="2160"/>
+          </w:tcPr>
+          <w:p>
+            <w:r>
+              <w:rPr>
+                <w:sz w:val="18"/>
+              </w:rPr>
+              <w:t>main</w:t>
+            </w:r>
+          </w:p>
+        </w:tc>
+        <w:tc>
+          <w:tcPr>
+            <w:tcW w:type="dxa" w:w="2160"/>
+          </w:tcPr>
+          <w:p>
+            <w:r>
+              <w:rPr>
+                <w:sz w:val="18"/>
+              </w:rPr>
+              <w:t>success</w:t>
+            </w:r>
+          </w:p>
+        </w:tc>
+        <w:tc>
+          <w:tcPr>
+            <w:tcW w:type="dxa" w:w="2160"/>
+          </w:tcPr>
+          <w:p>
+            <w:r>
+              <w:rPr>
+                <w:sz w:val="18"/>
+              </w:rPr>
+              <w:t>2026-05-11</w:t>
+            </w:r>
+          </w:p>
+        </w:tc>
+      </w:tr>
+      <w:tr>
+        <w:tc>
+          <w:tcPr>
+            <w:tcW w:type="dxa" w:w="2160"/>
+          </w:tcPr>
+          <w:p>
+            <w:r>
+              <w:rPr>
+                <w:sz w:val="18"/>
+              </w:rPr>
+              <w:t>✅ Security &amp; SAST Audit</w:t>
+            </w:r>
+          </w:p>
+        </w:tc>
+        <w:tc>
+          <w:tcPr>
+            <w:tcW w:type="dxa" w:w="2160"/>
+          </w:tcPr>
+          <w:p>
+            <w:r>
+              <w:rPr>
+                <w:sz w:val="18"/>
+              </w:rPr>
+              <w:t>main</w:t>
+            </w:r>
+          </w:p>
+        </w:tc>
+        <w:tc>
+          <w:tcPr>
+            <w:tcW w:type="dxa" w:w="2160"/>
+          </w:tcPr>
+          <w:p>
+            <w:r>
+              <w:rPr>
+                <w:sz w:val="18"/>
+              </w:rPr>
+              <w:t>success</w:t>
+            </w:r>
+          </w:p>
+        </w:tc>
+        <w:tc>
+          <w:tcPr>
+            <w:tcW w:type="dxa" w:w="2160"/>
+          </w:tcPr>
+          <w:p>
+            <w:r>
+              <w:rPr>
+                <w:sz w:val="18"/>
+              </w:rPr>
+              <w:t>2026-05-11</w:t>
+            </w:r>
+          </w:p>
+        </w:tc>
+      </w:tr>
+    </w:tbl>
     <w:p>
       <w:pPr>
         <w:pStyle w:val="Heading2"/>
@@ -34021,16 +34715,618 @@
         <w:t>Recent Commits (last 10)</w:t>
       </w:r>
     </w:p>
-    <w:p>
-      <w:r>
-        <w:rPr>
-          <w:b w:val="0"/>
-          <w:i/>
-          <w:sz w:val="20"/>
-        </w:rPr>
-        <w:t>No commits found.</w:t>
-      </w:r>
-    </w:p>
+    <w:tbl>
+      <w:tblPr>
+        <w:tblStyle w:val="LightGrid-Accent1"/>
+        <w:tblW w:type="auto" w:w="0"/>
+        <w:jc w:val="center"/>
+        <w:tblLook w:firstColumn="1" w:firstRow="1" w:lastColumn="0" w:lastRow="0" w:noHBand="0" w:noVBand="1" w:val="04A0"/>
+      </w:tblPr>
+      <w:tblGrid>
+        <w:gridCol w:w="2160"/>
+        <w:gridCol w:w="2160"/>
+        <w:gridCol w:w="2160"/>
+        <w:gridCol w:w="2160"/>
+      </w:tblGrid>
+      <w:tr>
+        <w:tc>
+          <w:tcPr>
+            <w:tcW w:type="dxa" w:w="2160"/>
+          </w:tcPr>
+          <w:p>
+            <w:r>
+              <w:rPr>
+                <w:b/>
+                <w:sz w:val="18"/>
+              </w:rPr>
+              <w:t>SHA</w:t>
+            </w:r>
+          </w:p>
+        </w:tc>
+        <w:tc>
+          <w:tcPr>
+            <w:tcW w:type="dxa" w:w="2160"/>
+          </w:tcPr>
+          <w:p>
+            <w:r>
+              <w:rPr>
+                <w:b/>
+                <w:sz w:val="18"/>
+              </w:rPr>
+              <w:t>Date</w:t>
+            </w:r>
+          </w:p>
+        </w:tc>
+        <w:tc>
+          <w:tcPr>
+            <w:tcW w:type="dxa" w:w="2160"/>
+          </w:tcPr>
+          <w:p>
+            <w:r>
+              <w:rPr>
+                <w:b/>
+                <w:sz w:val="18"/>
+              </w:rPr>
+              <w:t>Message</w:t>
+            </w:r>
+          </w:p>
+        </w:tc>
+        <w:tc>
+          <w:tcPr>
+            <w:tcW w:type="dxa" w:w="2160"/>
+          </w:tcPr>
+          <w:p>
+            <w:r>
+              <w:rPr>
+                <w:b/>
+                <w:sz w:val="18"/>
+              </w:rPr>
+              <w:t>Author</w:t>
+            </w:r>
+          </w:p>
+        </w:tc>
+      </w:tr>
+      <w:tr>
+        <w:tc>
+          <w:tcPr>
+            <w:tcW w:type="dxa" w:w="2160"/>
+          </w:tcPr>
+          <w:p>
+            <w:r>
+              <w:rPr>
+                <w:sz w:val="18"/>
+              </w:rPr>
+              <w:t>efd6631</w:t>
+            </w:r>
+          </w:p>
+        </w:tc>
+        <w:tc>
+          <w:tcPr>
+            <w:tcW w:type="dxa" w:w="2160"/>
+          </w:tcPr>
+          <w:p>
+            <w:r>
+              <w:rPr>
+                <w:sz w:val="18"/>
+              </w:rPr>
+              <w:t>2026-05-11</w:t>
+            </w:r>
+          </w:p>
+        </w:tc>
+        <w:tc>
+          <w:tcPr>
+            <w:tcW w:type="dxa" w:w="2160"/>
+          </w:tcPr>
+          <w:p>
+            <w:r>
+              <w:rPr>
+                <w:sz w:val="18"/>
+              </w:rPr>
+              <w:t>ci: optimize docs workflow triggers and add GitHub Models provider</w:t>
+            </w:r>
+          </w:p>
+        </w:tc>
+        <w:tc>
+          <w:tcPr>
+            <w:tcW w:type="dxa" w:w="2160"/>
+          </w:tcPr>
+          <w:p>
+            <w:r>
+              <w:rPr>
+                <w:sz w:val="18"/>
+              </w:rPr>
+              <w:t>Bappadala Rohith Kumar Naidu</w:t>
+            </w:r>
+          </w:p>
+        </w:tc>
+      </w:tr>
+      <w:tr>
+        <w:tc>
+          <w:tcPr>
+            <w:tcW w:type="dxa" w:w="2160"/>
+          </w:tcPr>
+          <w:p>
+            <w:r>
+              <w:rPr>
+                <w:sz w:val="18"/>
+              </w:rPr>
+              <w:t>8e57416</w:t>
+            </w:r>
+          </w:p>
+        </w:tc>
+        <w:tc>
+          <w:tcPr>
+            <w:tcW w:type="dxa" w:w="2160"/>
+          </w:tcPr>
+          <w:p>
+            <w:r>
+              <w:rPr>
+                <w:sz w:val="18"/>
+              </w:rPr>
+              <w:t>2026-05-11</w:t>
+            </w:r>
+          </w:p>
+        </w:tc>
+        <w:tc>
+          <w:tcPr>
+            <w:tcW w:type="dxa" w:w="2160"/>
+          </w:tcPr>
+          <w:p>
+            <w:r>
+              <w:rPr>
+                <w:sz w:val="18"/>
+              </w:rPr>
+              <w:t>ci: fix vercel deployment double path resolution</w:t>
+            </w:r>
+          </w:p>
+        </w:tc>
+        <w:tc>
+          <w:tcPr>
+            <w:tcW w:type="dxa" w:w="2160"/>
+          </w:tcPr>
+          <w:p>
+            <w:r>
+              <w:rPr>
+                <w:sz w:val="18"/>
+              </w:rPr>
+              <w:t>Bappadala Rohith Kumar Naidu</w:t>
+            </w:r>
+          </w:p>
+        </w:tc>
+      </w:tr>
+      <w:tr>
+        <w:tc>
+          <w:tcPr>
+            <w:tcW w:type="dxa" w:w="2160"/>
+          </w:tcPr>
+          <w:p>
+            <w:r>
+              <w:rPr>
+                <w:sz w:val="18"/>
+              </w:rPr>
+              <w:t>8d9d628</w:t>
+            </w:r>
+          </w:p>
+        </w:tc>
+        <w:tc>
+          <w:tcPr>
+            <w:tcW w:type="dxa" w:w="2160"/>
+          </w:tcPr>
+          <w:p>
+            <w:r>
+              <w:rPr>
+                <w:sz w:val="18"/>
+              </w:rPr>
+              <w:t>2026-05-11</w:t>
+            </w:r>
+          </w:p>
+        </w:tc>
+        <w:tc>
+          <w:tcPr>
+            <w:tcW w:type="dxa" w:w="2160"/>
+          </w:tcPr>
+          <w:p>
+            <w:r>
+              <w:rPr>
+                <w:sz w:val="18"/>
+              </w:rPr>
+              <w:t>refactor(frontend): remove emojis for enterprise standard and fix map types</w:t>
+            </w:r>
+          </w:p>
+        </w:tc>
+        <w:tc>
+          <w:tcPr>
+            <w:tcW w:type="dxa" w:w="2160"/>
+          </w:tcPr>
+          <w:p>
+            <w:r>
+              <w:rPr>
+                <w:sz w:val="18"/>
+              </w:rPr>
+              <w:t>Bappadala Rohith Kumar Naidu</w:t>
+            </w:r>
+          </w:p>
+        </w:tc>
+      </w:tr>
+      <w:tr>
+        <w:tc>
+          <w:tcPr>
+            <w:tcW w:type="dxa" w:w="2160"/>
+          </w:tcPr>
+          <w:p>
+            <w:r>
+              <w:rPr>
+                <w:sz w:val="18"/>
+              </w:rPr>
+              <w:t>431c7a7</w:t>
+            </w:r>
+          </w:p>
+        </w:tc>
+        <w:tc>
+          <w:tcPr>
+            <w:tcW w:type="dxa" w:w="2160"/>
+          </w:tcPr>
+          <w:p>
+            <w:r>
+              <w:rPr>
+                <w:sz w:val="18"/>
+              </w:rPr>
+              <w:t>2026-05-10</w:t>
+            </w:r>
+          </w:p>
+        </w:tc>
+        <w:tc>
+          <w:tcPr>
+            <w:tcW w:type="dxa" w:w="2160"/>
+          </w:tcPr>
+          <w:p>
+            <w:r>
+              <w:rPr>
+                <w:sz w:val="18"/>
+              </w:rPr>
+              <w:t>chore: ignore error log files in gitignore</w:t>
+            </w:r>
+          </w:p>
+        </w:tc>
+        <w:tc>
+          <w:tcPr>
+            <w:tcW w:type="dxa" w:w="2160"/>
+          </w:tcPr>
+          <w:p>
+            <w:r>
+              <w:rPr>
+                <w:sz w:val="18"/>
+              </w:rPr>
+              <w:t>Bappadala Rohith Kumar Naidu</w:t>
+            </w:r>
+          </w:p>
+        </w:tc>
+      </w:tr>
+      <w:tr>
+        <w:tc>
+          <w:tcPr>
+            <w:tcW w:type="dxa" w:w="2160"/>
+          </w:tcPr>
+          <w:p>
+            <w:r>
+              <w:rPr>
+                <w:sz w:val="18"/>
+              </w:rPr>
+              <w:t>431bb1f</w:t>
+            </w:r>
+          </w:p>
+        </w:tc>
+        <w:tc>
+          <w:tcPr>
+            <w:tcW w:type="dxa" w:w="2160"/>
+          </w:tcPr>
+          <w:p>
+            <w:r>
+              <w:rPr>
+                <w:sz w:val="18"/>
+              </w:rPr>
+              <w:t>2026-05-10</w:t>
+            </w:r>
+          </w:p>
+        </w:tc>
+        <w:tc>
+          <w:tcPr>
+            <w:tcW w:type="dxa" w:w="2160"/>
+          </w:tcPr>
+          <w:p>
+            <w:r>
+              <w:rPr>
+                <w:sz w:val="18"/>
+              </w:rPr>
+              <w:t>chore: add Playwright output to gitignore</w:t>
+            </w:r>
+          </w:p>
+        </w:tc>
+        <w:tc>
+          <w:tcPr>
+            <w:tcW w:type="dxa" w:w="2160"/>
+          </w:tcPr>
+          <w:p>
+            <w:r>
+              <w:rPr>
+                <w:sz w:val="18"/>
+              </w:rPr>
+              <w:t>Bappadala Rohith Kumar Naidu</w:t>
+            </w:r>
+          </w:p>
+        </w:tc>
+      </w:tr>
+      <w:tr>
+        <w:tc>
+          <w:tcPr>
+            <w:tcW w:type="dxa" w:w="2160"/>
+          </w:tcPr>
+          <w:p>
+            <w:r>
+              <w:rPr>
+                <w:sz w:val="18"/>
+              </w:rPr>
+              <w:t>e1a164d</w:t>
+            </w:r>
+          </w:p>
+        </w:tc>
+        <w:tc>
+          <w:tcPr>
+            <w:tcW w:type="dxa" w:w="2160"/>
+          </w:tcPr>
+          <w:p>
+            <w:r>
+              <w:rPr>
+                <w:sz w:val="18"/>
+              </w:rPr>
+              <w:t>2026-05-10</w:t>
+            </w:r>
+          </w:p>
+        </w:tc>
+        <w:tc>
+          <w:tcPr>
+            <w:tcW w:type="dxa" w:w="2160"/>
+          </w:tcPr>
+          <w:p>
+            <w:r>
+              <w:rPr>
+                <w:sz w:val="18"/>
+              </w:rPr>
+              <w:t>fix(frontend): allow localhost connections in CSP for E2E tests</w:t>
+            </w:r>
+          </w:p>
+        </w:tc>
+        <w:tc>
+          <w:tcPr>
+            <w:tcW w:type="dxa" w:w="2160"/>
+          </w:tcPr>
+          <w:p>
+            <w:r>
+              <w:rPr>
+                <w:sz w:val="18"/>
+              </w:rPr>
+              <w:t>Bappadala Rohith Kumar Naidu</w:t>
+            </w:r>
+          </w:p>
+        </w:tc>
+      </w:tr>
+      <w:tr>
+        <w:tc>
+          <w:tcPr>
+            <w:tcW w:type="dxa" w:w="2160"/>
+          </w:tcPr>
+          <w:p>
+            <w:r>
+              <w:rPr>
+                <w:sz w:val="18"/>
+              </w:rPr>
+              <w:t>173fbd6</w:t>
+            </w:r>
+          </w:p>
+        </w:tc>
+        <w:tc>
+          <w:tcPr>
+            <w:tcW w:type="dxa" w:w="2160"/>
+          </w:tcPr>
+          <w:p>
+            <w:r>
+              <w:rPr>
+                <w:sz w:val="18"/>
+              </w:rPr>
+              <w:t>2026-05-10</w:t>
+            </w:r>
+          </w:p>
+        </w:tc>
+        <w:tc>
+          <w:tcPr>
+            <w:tcW w:type="dxa" w:w="2160"/>
+          </w:tcPr>
+          <w:p>
+            <w:r>
+              <w:rPr>
+                <w:sz w:val="18"/>
+              </w:rPr>
+              <w:t>ci: automate Vercel deployment and configure Playwright webServer</w:t>
+            </w:r>
+          </w:p>
+        </w:tc>
+        <w:tc>
+          <w:tcPr>
+            <w:tcW w:type="dxa" w:w="2160"/>
+          </w:tcPr>
+          <w:p>
+            <w:r>
+              <w:rPr>
+                <w:sz w:val="18"/>
+              </w:rPr>
+              <w:t>Bappadala Rohith Kumar Naidu</w:t>
+            </w:r>
+          </w:p>
+        </w:tc>
+      </w:tr>
+      <w:tr>
+        <w:tc>
+          <w:tcPr>
+            <w:tcW w:type="dxa" w:w="2160"/>
+          </w:tcPr>
+          <w:p>
+            <w:r>
+              <w:rPr>
+                <w:sz w:val="18"/>
+              </w:rPr>
+              <w:t>18e90c2</w:t>
+            </w:r>
+          </w:p>
+        </w:tc>
+        <w:tc>
+          <w:tcPr>
+            <w:tcW w:type="dxa" w:w="2160"/>
+          </w:tcPr>
+          <w:p>
+            <w:r>
+              <w:rPr>
+                <w:sz w:val="18"/>
+              </w:rPr>
+              <w:t>2026-05-10</w:t>
+            </w:r>
+          </w:p>
+        </w:tc>
+        <w:tc>
+          <w:tcPr>
+            <w:tcW w:type="dxa" w:w="2160"/>
+          </w:tcPr>
+          <w:p>
+            <w:r>
+              <w:rPr>
+                <w:sz w:val="18"/>
+              </w:rPr>
+              <w:t xml:space="preserve">test: fix flaky SOS e2e test by waiting for deterministic state and adding CORS </w:t>
+            </w:r>
+          </w:p>
+        </w:tc>
+        <w:tc>
+          <w:tcPr>
+            <w:tcW w:type="dxa" w:w="2160"/>
+          </w:tcPr>
+          <w:p>
+            <w:r>
+              <w:rPr>
+                <w:sz w:val="18"/>
+              </w:rPr>
+              <w:t>Bappadala Rohith Kumar Naidu</w:t>
+            </w:r>
+          </w:p>
+        </w:tc>
+      </w:tr>
+      <w:tr>
+        <w:tc>
+          <w:tcPr>
+            <w:tcW w:type="dxa" w:w="2160"/>
+          </w:tcPr>
+          <w:p>
+            <w:r>
+              <w:rPr>
+                <w:sz w:val="18"/>
+              </w:rPr>
+              <w:t>cee6ff5</w:t>
+            </w:r>
+          </w:p>
+        </w:tc>
+        <w:tc>
+          <w:tcPr>
+            <w:tcW w:type="dxa" w:w="2160"/>
+          </w:tcPr>
+          <w:p>
+            <w:r>
+              <w:rPr>
+                <w:sz w:val="18"/>
+              </w:rPr>
+              <w:t>2026-05-09</w:t>
+            </w:r>
+          </w:p>
+        </w:tc>
+        <w:tc>
+          <w:tcPr>
+            <w:tcW w:type="dxa" w:w="2160"/>
+          </w:tcPr>
+          <w:p>
+            <w:r>
+              <w:rPr>
+                <w:sz w:val="18"/>
+              </w:rPr>
+              <w:t xml:space="preserve">feat: stabilize map UI and implement perfect Google Maps style unpinned sidebar </w:t>
+            </w:r>
+          </w:p>
+        </w:tc>
+        <w:tc>
+          <w:tcPr>
+            <w:tcW w:type="dxa" w:w="2160"/>
+          </w:tcPr>
+          <w:p>
+            <w:r>
+              <w:rPr>
+                <w:sz w:val="18"/>
+              </w:rPr>
+              <w:t>Bappadala Rohith Kumar Naidu</w:t>
+            </w:r>
+          </w:p>
+        </w:tc>
+      </w:tr>
+      <w:tr>
+        <w:tc>
+          <w:tcPr>
+            <w:tcW w:type="dxa" w:w="2160"/>
+          </w:tcPr>
+          <w:p>
+            <w:r>
+              <w:rPr>
+                <w:sz w:val="18"/>
+              </w:rPr>
+              <w:t>04e172f</w:t>
+            </w:r>
+          </w:p>
+        </w:tc>
+        <w:tc>
+          <w:tcPr>
+            <w:tcW w:type="dxa" w:w="2160"/>
+          </w:tcPr>
+          <w:p>
+            <w:r>
+              <w:rPr>
+                <w:sz w:val="18"/>
+              </w:rPr>
+              <w:t>2026-05-09</w:t>
+            </w:r>
+          </w:p>
+        </w:tc>
+        <w:tc>
+          <w:tcPr>
+            <w:tcW w:type="dxa" w:w="2160"/>
+          </w:tcPr>
+          <w:p>
+            <w:r>
+              <w:rPr>
+                <w:sz w:val="18"/>
+              </w:rPr>
+              <w:t>chore: remove spots and noise gradient, fix TS types</w:t>
+            </w:r>
+          </w:p>
+        </w:tc>
+        <w:tc>
+          <w:tcPr>
+            <w:tcW w:type="dxa" w:w="2160"/>
+          </w:tcPr>
+          <w:p>
+            <w:r>
+              <w:rPr>
+                <w:sz w:val="18"/>
+              </w:rPr>
+              <w:t>Bappadala Rohith Kumar Naidu</w:t>
+            </w:r>
+          </w:p>
+        </w:tc>
+      </w:tr>
+    </w:tbl>
     <w:p>
       <w:pPr>
         <w:pStyle w:val="Heading2"/>
@@ -35011,7 +36307,7 @@
         <w:br/>
         <w:t>Generated by scripts/update_master_doc.py</w:t>
         <w:br/>
-        <w:t>Timestamp: 2026-05-08 23:09 IST</w:t>
+        <w:t>Timestamp: 2026-05-11 21:28 IST</w:t>
         <w:br/>
         <w:t>Repository: github.com/SafeVixAI/SafeVixAI</w:t>
       </w:r>

</xml_diff>

<commit_message>
Deployed 612952d with MkDocs version: 1.6.1
</commit_message>
<xml_diff>
--- a/SafeVixAI_MASTER.docx
+++ b/SafeVixAI_MASTER.docx
@@ -33723,7 +33723,7 @@
           <w:i w:val="0"/>
           <w:sz w:val="22"/>
         </w:rPr>
-        <w:t>🕐 Last auto-updated: 2026-05-11 21:28 IST</w:t>
+        <w:t>🕐 Last auto-updated: 2026-05-11 23:24 IST</w:t>
       </w:r>
     </w:p>
     <w:p>
@@ -34060,7 +34060,7 @@
               <w:rPr>
                 <w:sz w:val="18"/>
               </w:rPr>
-              <w:t>130ms | HTTP 404 | v?</w:t>
+              <w:t>129ms | HTTP 404 | v?</w:t>
             </w:r>
           </w:p>
         </w:tc>
@@ -34101,7 +34101,7 @@
               <w:rPr>
                 <w:sz w:val="18"/>
               </w:rPr>
-              <w:t>140ms | HTTP 404 | v?</w:t>
+              <w:t>108ms | HTTP 404 | v?</w:t>
             </w:r>
           </w:p>
         </w:tc>
@@ -34142,7 +34142,7 @@
               <w:rPr>
                 <w:sz w:val="18"/>
               </w:rPr>
-              <w:t>173ms | HTTP 200 | v?</w:t>
+              <w:t>63ms | HTTP 200 | v?</w:t>
             </w:r>
           </w:p>
         </w:tc>
@@ -34250,6 +34250,114 @@
               <w:rPr>
                 <w:sz w:val="18"/>
               </w:rPr>
+              <w:t>⏳ Security &amp; SAST Audit</w:t>
+            </w:r>
+          </w:p>
+        </w:tc>
+        <w:tc>
+          <w:tcPr>
+            <w:tcW w:type="dxa" w:w="2160"/>
+          </w:tcPr>
+          <w:p>
+            <w:r>
+              <w:rPr>
+                <w:sz w:val="18"/>
+              </w:rPr>
+              <w:t>main</w:t>
+            </w:r>
+          </w:p>
+        </w:tc>
+        <w:tc>
+          <w:tcPr>
+            <w:tcW w:type="dxa" w:w="2160"/>
+          </w:tcPr>
+          <w:p>
+            <w:r>
+              <w:rPr>
+                <w:sz w:val="18"/>
+              </w:rPr>
+              <w:t>in_progress</w:t>
+            </w:r>
+          </w:p>
+        </w:tc>
+        <w:tc>
+          <w:tcPr>
+            <w:tcW w:type="dxa" w:w="2160"/>
+          </w:tcPr>
+          <w:p>
+            <w:r>
+              <w:rPr>
+                <w:sz w:val="18"/>
+              </w:rPr>
+              <w:t>2026-05-11</w:t>
+            </w:r>
+          </w:p>
+        </w:tc>
+      </w:tr>
+      <w:tr>
+        <w:tc>
+          <w:tcPr>
+            <w:tcW w:type="dxa" w:w="2160"/>
+          </w:tcPr>
+          <w:p>
+            <w:r>
+              <w:rPr>
+                <w:sz w:val="18"/>
+              </w:rPr>
+              <w:t>⏳ Wiki Documentation Sync</w:t>
+            </w:r>
+          </w:p>
+        </w:tc>
+        <w:tc>
+          <w:tcPr>
+            <w:tcW w:type="dxa" w:w="2160"/>
+          </w:tcPr>
+          <w:p>
+            <w:r>
+              <w:rPr>
+                <w:sz w:val="18"/>
+              </w:rPr>
+              <w:t>main</w:t>
+            </w:r>
+          </w:p>
+        </w:tc>
+        <w:tc>
+          <w:tcPr>
+            <w:tcW w:type="dxa" w:w="2160"/>
+          </w:tcPr>
+          <w:p>
+            <w:r>
+              <w:rPr>
+                <w:sz w:val="18"/>
+              </w:rPr>
+              <w:t>in_progress</w:t>
+            </w:r>
+          </w:p>
+        </w:tc>
+        <w:tc>
+          <w:tcPr>
+            <w:tcW w:type="dxa" w:w="2160"/>
+          </w:tcPr>
+          <w:p>
+            <w:r>
+              <w:rPr>
+                <w:sz w:val="18"/>
+              </w:rPr>
+              <w:t>2026-05-11</w:t>
+            </w:r>
+          </w:p>
+        </w:tc>
+      </w:tr>
+      <w:tr>
+        <w:tc>
+          <w:tcPr>
+            <w:tcW w:type="dxa" w:w="2160"/>
+          </w:tcPr>
+          <w:p>
+            <w:r>
+              <w:rPr>
+                <w:sz w:val="18"/>
+              </w:rPr>
               <w:t>⏳ Deploy Enterprise Docs</w:t>
             </w:r>
           </w:p>
@@ -34305,114 +34413,6 @@
                 <w:sz w:val="18"/>
               </w:rPr>
               <w:t>⏳ Update Master Document</w:t>
-            </w:r>
-          </w:p>
-        </w:tc>
-        <w:tc>
-          <w:tcPr>
-            <w:tcW w:type="dxa" w:w="2160"/>
-          </w:tcPr>
-          <w:p>
-            <w:r>
-              <w:rPr>
-                <w:sz w:val="18"/>
-              </w:rPr>
-              <w:t>main</w:t>
-            </w:r>
-          </w:p>
-        </w:tc>
-        <w:tc>
-          <w:tcPr>
-            <w:tcW w:type="dxa" w:w="2160"/>
-          </w:tcPr>
-          <w:p>
-            <w:r>
-              <w:rPr>
-                <w:sz w:val="18"/>
-              </w:rPr>
-              <w:t>in_progress</w:t>
-            </w:r>
-          </w:p>
-        </w:tc>
-        <w:tc>
-          <w:tcPr>
-            <w:tcW w:type="dxa" w:w="2160"/>
-          </w:tcPr>
-          <w:p>
-            <w:r>
-              <w:rPr>
-                <w:sz w:val="18"/>
-              </w:rPr>
-              <w:t>2026-05-11</w:t>
-            </w:r>
-          </w:p>
-        </w:tc>
-      </w:tr>
-      <w:tr>
-        <w:tc>
-          <w:tcPr>
-            <w:tcW w:type="dxa" w:w="2160"/>
-          </w:tcPr>
-          <w:p>
-            <w:r>
-              <w:rPr>
-                <w:sz w:val="18"/>
-              </w:rPr>
-              <w:t>⏳ Security &amp; SAST Audit</w:t>
-            </w:r>
-          </w:p>
-        </w:tc>
-        <w:tc>
-          <w:tcPr>
-            <w:tcW w:type="dxa" w:w="2160"/>
-          </w:tcPr>
-          <w:p>
-            <w:r>
-              <w:rPr>
-                <w:sz w:val="18"/>
-              </w:rPr>
-              <w:t>main</w:t>
-            </w:r>
-          </w:p>
-        </w:tc>
-        <w:tc>
-          <w:tcPr>
-            <w:tcW w:type="dxa" w:w="2160"/>
-          </w:tcPr>
-          <w:p>
-            <w:r>
-              <w:rPr>
-                <w:sz w:val="18"/>
-              </w:rPr>
-              <w:t>in_progress</w:t>
-            </w:r>
-          </w:p>
-        </w:tc>
-        <w:tc>
-          <w:tcPr>
-            <w:tcW w:type="dxa" w:w="2160"/>
-          </w:tcPr>
-          <w:p>
-            <w:r>
-              <w:rPr>
-                <w:sz w:val="18"/>
-              </w:rPr>
-              <w:t>2026-05-11</w:t>
-            </w:r>
-          </w:p>
-        </w:tc>
-      </w:tr>
-      <w:tr>
-        <w:tc>
-          <w:tcPr>
-            <w:tcW w:type="dxa" w:w="2160"/>
-          </w:tcPr>
-          <w:p>
-            <w:r>
-              <w:rPr>
-                <w:sz w:val="18"/>
-              </w:rPr>
-              <w:t>⏳ Wiki Documentation Sync</w:t>
             </w:r>
           </w:p>
         </w:tc>
@@ -34574,7 +34574,7 @@
               <w:rPr>
                 <w:sz w:val="18"/>
               </w:rPr>
-              <w:t>✅ Frontend Unit Tests</w:t>
+              <w:t>✅ PR #7</w:t>
             </w:r>
           </w:p>
         </w:tc>
@@ -34587,7 +34587,7 @@
               <w:rPr>
                 <w:sz w:val="18"/>
               </w:rPr>
-              <w:t>main</w:t>
+              <w:t>refs/pull/7/head</w:t>
             </w:r>
           </w:p>
         </w:tc>
@@ -34628,7 +34628,7 @@
               <w:rPr>
                 <w:sz w:val="18"/>
               </w:rPr>
-              <w:t>✅ Security &amp; SAST Audit</w:t>
+              <w:t>✅ Code Quality: PR #7</w:t>
             </w:r>
           </w:p>
         </w:tc>
@@ -34641,7 +34641,7 @@
               <w:rPr>
                 <w:sz w:val="18"/>
               </w:rPr>
-              <w:t>main</w:t>
+              <w:t>refs/pull/7/head</w:t>
             </w:r>
           </w:p>
         </w:tc>
@@ -34782,6 +34782,276 @@
                 <w:sz w:val="18"/>
               </w:rPr>
               <w:t>Author</w:t>
+            </w:r>
+          </w:p>
+        </w:tc>
+      </w:tr>
+      <w:tr>
+        <w:tc>
+          <w:tcPr>
+            <w:tcW w:type="dxa" w:w="2160"/>
+          </w:tcPr>
+          <w:p>
+            <w:r>
+              <w:rPr>
+                <w:sz w:val="18"/>
+              </w:rPr>
+              <w:t>3621b34</w:t>
+            </w:r>
+          </w:p>
+        </w:tc>
+        <w:tc>
+          <w:tcPr>
+            <w:tcW w:type="dxa" w:w="2160"/>
+          </w:tcPr>
+          <w:p>
+            <w:r>
+              <w:rPr>
+                <w:sz w:val="18"/>
+              </w:rPr>
+              <w:t>2026-05-11</w:t>
+            </w:r>
+          </w:p>
+        </w:tc>
+        <w:tc>
+          <w:tcPr>
+            <w:tcW w:type="dxa" w:w="2160"/>
+          </w:tcPr>
+          <w:p>
+            <w:r>
+              <w:rPr>
+                <w:sz w:val="18"/>
+              </w:rPr>
+              <w:t>docs: remove emojis for professional hackathon format</w:t>
+            </w:r>
+          </w:p>
+        </w:tc>
+        <w:tc>
+          <w:tcPr>
+            <w:tcW w:type="dxa" w:w="2160"/>
+          </w:tcPr>
+          <w:p>
+            <w:r>
+              <w:rPr>
+                <w:sz w:val="18"/>
+              </w:rPr>
+              <w:t>Bappadala Rohith Kumar Naidu</w:t>
+            </w:r>
+          </w:p>
+        </w:tc>
+      </w:tr>
+      <w:tr>
+        <w:tc>
+          <w:tcPr>
+            <w:tcW w:type="dxa" w:w="2160"/>
+          </w:tcPr>
+          <w:p>
+            <w:r>
+              <w:rPr>
+                <w:sz w:val="18"/>
+              </w:rPr>
+              <w:t>bee3ec2</w:t>
+            </w:r>
+          </w:p>
+        </w:tc>
+        <w:tc>
+          <w:tcPr>
+            <w:tcW w:type="dxa" w:w="2160"/>
+          </w:tcPr>
+          <w:p>
+            <w:r>
+              <w:rPr>
+                <w:sz w:val="18"/>
+              </w:rPr>
+              <w:t>2026-05-11</w:t>
+            </w:r>
+          </w:p>
+        </w:tc>
+        <w:tc>
+          <w:tcPr>
+            <w:tcW w:type="dxa" w:w="2160"/>
+          </w:tcPr>
+          <w:p>
+            <w:r>
+              <w:rPr>
+                <w:sz w:val="18"/>
+              </w:rPr>
+              <w:t>ci: fix add-paths syntax in sync-wiki workflow</w:t>
+            </w:r>
+          </w:p>
+        </w:tc>
+        <w:tc>
+          <w:tcPr>
+            <w:tcW w:type="dxa" w:w="2160"/>
+          </w:tcPr>
+          <w:p>
+            <w:r>
+              <w:rPr>
+                <w:sz w:val="18"/>
+              </w:rPr>
+              <w:t>Bappadala Rohith Kumar Naidu</w:t>
+            </w:r>
+          </w:p>
+        </w:tc>
+      </w:tr>
+      <w:tr>
+        <w:tc>
+          <w:tcPr>
+            <w:tcW w:type="dxa" w:w="2160"/>
+          </w:tcPr>
+          <w:p>
+            <w:r>
+              <w:rPr>
+                <w:sz w:val="18"/>
+              </w:rPr>
+              <w:t>901fce7</w:t>
+            </w:r>
+          </w:p>
+        </w:tc>
+        <w:tc>
+          <w:tcPr>
+            <w:tcW w:type="dxa" w:w="2160"/>
+          </w:tcPr>
+          <w:p>
+            <w:r>
+              <w:rPr>
+                <w:sz w:val="18"/>
+              </w:rPr>
+              <w:t>2026-05-11</w:t>
+            </w:r>
+          </w:p>
+        </w:tc>
+        <w:tc>
+          <w:tcPr>
+            <w:tcW w:type="dxa" w:w="2160"/>
+          </w:tcPr>
+          <w:p>
+            <w:r>
+              <w:rPr>
+                <w:sz w:val="18"/>
+              </w:rPr>
+              <w:t>feat(docs): add missing frontend component wiki docs and update chatbot router</w:t>
+            </w:r>
+          </w:p>
+        </w:tc>
+        <w:tc>
+          <w:tcPr>
+            <w:tcW w:type="dxa" w:w="2160"/>
+          </w:tcPr>
+          <w:p>
+            <w:r>
+              <w:rPr>
+                <w:sz w:val="18"/>
+              </w:rPr>
+              <w:t>Bappadala Rohith Kumar Naidu</w:t>
+            </w:r>
+          </w:p>
+        </w:tc>
+      </w:tr>
+      <w:tr>
+        <w:tc>
+          <w:tcPr>
+            <w:tcW w:type="dxa" w:w="2160"/>
+          </w:tcPr>
+          <w:p>
+            <w:r>
+              <w:rPr>
+                <w:sz w:val="18"/>
+              </w:rPr>
+              <w:t>22c23b5</w:t>
+            </w:r>
+          </w:p>
+        </w:tc>
+        <w:tc>
+          <w:tcPr>
+            <w:tcW w:type="dxa" w:w="2160"/>
+          </w:tcPr>
+          <w:p>
+            <w:r>
+              <w:rPr>
+                <w:sz w:val="18"/>
+              </w:rPr>
+              <w:t>2026-05-11</w:t>
+            </w:r>
+          </w:p>
+        </w:tc>
+        <w:tc>
+          <w:tcPr>
+            <w:tcW w:type="dxa" w:w="2160"/>
+          </w:tcPr>
+          <w:p>
+            <w:r>
+              <w:rPr>
+                <w:sz w:val="18"/>
+              </w:rPr>
+              <w:t>Merge pull request #6 from SafeVixAI/docs-auto-update</w:t>
+            </w:r>
+          </w:p>
+        </w:tc>
+        <w:tc>
+          <w:tcPr>
+            <w:tcW w:type="dxa" w:w="2160"/>
+          </w:tcPr>
+          <w:p>
+            <w:r>
+              <w:rPr>
+                <w:sz w:val="18"/>
+              </w:rPr>
+              <w:t>Bappadala Rohith Kumar Naidu</w:t>
+            </w:r>
+          </w:p>
+        </w:tc>
+      </w:tr>
+      <w:tr>
+        <w:tc>
+          <w:tcPr>
+            <w:tcW w:type="dxa" w:w="2160"/>
+          </w:tcPr>
+          <w:p>
+            <w:r>
+              <w:rPr>
+                <w:sz w:val="18"/>
+              </w:rPr>
+              <w:t>2c7700a</w:t>
+            </w:r>
+          </w:p>
+        </w:tc>
+        <w:tc>
+          <w:tcPr>
+            <w:tcW w:type="dxa" w:w="2160"/>
+          </w:tcPr>
+          <w:p>
+            <w:r>
+              <w:rPr>
+                <w:sz w:val="18"/>
+              </w:rPr>
+              <w:t>2026-05-11</w:t>
+            </w:r>
+          </w:p>
+        </w:tc>
+        <w:tc>
+          <w:tcPr>
+            <w:tcW w:type="dxa" w:w="2160"/>
+          </w:tcPr>
+          <w:p>
+            <w:r>
+              <w:rPr>
+                <w:sz w:val="18"/>
+              </w:rPr>
+              <w:t>docs: auto-update master doc</w:t>
+            </w:r>
+          </w:p>
+        </w:tc>
+        <w:tc>
+          <w:tcPr>
+            <w:tcW w:type="dxa" w:w="2160"/>
+          </w:tcPr>
+          <w:p>
+            <w:r>
+              <w:rPr>
+                <w:sz w:val="18"/>
+              </w:rPr>
+              <w:t>rohitkumarnaidu</w:t>
             </w:r>
           </w:p>
         </w:tc>
@@ -35039,276 +35309,6 @@
                 <w:sz w:val="18"/>
               </w:rPr>
               <w:t>chore: add Playwright output to gitignore</w:t>
-            </w:r>
-          </w:p>
-        </w:tc>
-        <w:tc>
-          <w:tcPr>
-            <w:tcW w:type="dxa" w:w="2160"/>
-          </w:tcPr>
-          <w:p>
-            <w:r>
-              <w:rPr>
-                <w:sz w:val="18"/>
-              </w:rPr>
-              <w:t>Bappadala Rohith Kumar Naidu</w:t>
-            </w:r>
-          </w:p>
-        </w:tc>
-      </w:tr>
-      <w:tr>
-        <w:tc>
-          <w:tcPr>
-            <w:tcW w:type="dxa" w:w="2160"/>
-          </w:tcPr>
-          <w:p>
-            <w:r>
-              <w:rPr>
-                <w:sz w:val="18"/>
-              </w:rPr>
-              <w:t>e1a164d</w:t>
-            </w:r>
-          </w:p>
-        </w:tc>
-        <w:tc>
-          <w:tcPr>
-            <w:tcW w:type="dxa" w:w="2160"/>
-          </w:tcPr>
-          <w:p>
-            <w:r>
-              <w:rPr>
-                <w:sz w:val="18"/>
-              </w:rPr>
-              <w:t>2026-05-10</w:t>
-            </w:r>
-          </w:p>
-        </w:tc>
-        <w:tc>
-          <w:tcPr>
-            <w:tcW w:type="dxa" w:w="2160"/>
-          </w:tcPr>
-          <w:p>
-            <w:r>
-              <w:rPr>
-                <w:sz w:val="18"/>
-              </w:rPr>
-              <w:t>fix(frontend): allow localhost connections in CSP for E2E tests</w:t>
-            </w:r>
-          </w:p>
-        </w:tc>
-        <w:tc>
-          <w:tcPr>
-            <w:tcW w:type="dxa" w:w="2160"/>
-          </w:tcPr>
-          <w:p>
-            <w:r>
-              <w:rPr>
-                <w:sz w:val="18"/>
-              </w:rPr>
-              <w:t>Bappadala Rohith Kumar Naidu</w:t>
-            </w:r>
-          </w:p>
-        </w:tc>
-      </w:tr>
-      <w:tr>
-        <w:tc>
-          <w:tcPr>
-            <w:tcW w:type="dxa" w:w="2160"/>
-          </w:tcPr>
-          <w:p>
-            <w:r>
-              <w:rPr>
-                <w:sz w:val="18"/>
-              </w:rPr>
-              <w:t>173fbd6</w:t>
-            </w:r>
-          </w:p>
-        </w:tc>
-        <w:tc>
-          <w:tcPr>
-            <w:tcW w:type="dxa" w:w="2160"/>
-          </w:tcPr>
-          <w:p>
-            <w:r>
-              <w:rPr>
-                <w:sz w:val="18"/>
-              </w:rPr>
-              <w:t>2026-05-10</w:t>
-            </w:r>
-          </w:p>
-        </w:tc>
-        <w:tc>
-          <w:tcPr>
-            <w:tcW w:type="dxa" w:w="2160"/>
-          </w:tcPr>
-          <w:p>
-            <w:r>
-              <w:rPr>
-                <w:sz w:val="18"/>
-              </w:rPr>
-              <w:t>ci: automate Vercel deployment and configure Playwright webServer</w:t>
-            </w:r>
-          </w:p>
-        </w:tc>
-        <w:tc>
-          <w:tcPr>
-            <w:tcW w:type="dxa" w:w="2160"/>
-          </w:tcPr>
-          <w:p>
-            <w:r>
-              <w:rPr>
-                <w:sz w:val="18"/>
-              </w:rPr>
-              <w:t>Bappadala Rohith Kumar Naidu</w:t>
-            </w:r>
-          </w:p>
-        </w:tc>
-      </w:tr>
-      <w:tr>
-        <w:tc>
-          <w:tcPr>
-            <w:tcW w:type="dxa" w:w="2160"/>
-          </w:tcPr>
-          <w:p>
-            <w:r>
-              <w:rPr>
-                <w:sz w:val="18"/>
-              </w:rPr>
-              <w:t>18e90c2</w:t>
-            </w:r>
-          </w:p>
-        </w:tc>
-        <w:tc>
-          <w:tcPr>
-            <w:tcW w:type="dxa" w:w="2160"/>
-          </w:tcPr>
-          <w:p>
-            <w:r>
-              <w:rPr>
-                <w:sz w:val="18"/>
-              </w:rPr>
-              <w:t>2026-05-10</w:t>
-            </w:r>
-          </w:p>
-        </w:tc>
-        <w:tc>
-          <w:tcPr>
-            <w:tcW w:type="dxa" w:w="2160"/>
-          </w:tcPr>
-          <w:p>
-            <w:r>
-              <w:rPr>
-                <w:sz w:val="18"/>
-              </w:rPr>
-              <w:t xml:space="preserve">test: fix flaky SOS e2e test by waiting for deterministic state and adding CORS </w:t>
-            </w:r>
-          </w:p>
-        </w:tc>
-        <w:tc>
-          <w:tcPr>
-            <w:tcW w:type="dxa" w:w="2160"/>
-          </w:tcPr>
-          <w:p>
-            <w:r>
-              <w:rPr>
-                <w:sz w:val="18"/>
-              </w:rPr>
-              <w:t>Bappadala Rohith Kumar Naidu</w:t>
-            </w:r>
-          </w:p>
-        </w:tc>
-      </w:tr>
-      <w:tr>
-        <w:tc>
-          <w:tcPr>
-            <w:tcW w:type="dxa" w:w="2160"/>
-          </w:tcPr>
-          <w:p>
-            <w:r>
-              <w:rPr>
-                <w:sz w:val="18"/>
-              </w:rPr>
-              <w:t>cee6ff5</w:t>
-            </w:r>
-          </w:p>
-        </w:tc>
-        <w:tc>
-          <w:tcPr>
-            <w:tcW w:type="dxa" w:w="2160"/>
-          </w:tcPr>
-          <w:p>
-            <w:r>
-              <w:rPr>
-                <w:sz w:val="18"/>
-              </w:rPr>
-              <w:t>2026-05-09</w:t>
-            </w:r>
-          </w:p>
-        </w:tc>
-        <w:tc>
-          <w:tcPr>
-            <w:tcW w:type="dxa" w:w="2160"/>
-          </w:tcPr>
-          <w:p>
-            <w:r>
-              <w:rPr>
-                <w:sz w:val="18"/>
-              </w:rPr>
-              <w:t xml:space="preserve">feat: stabilize map UI and implement perfect Google Maps style unpinned sidebar </w:t>
-            </w:r>
-          </w:p>
-        </w:tc>
-        <w:tc>
-          <w:tcPr>
-            <w:tcW w:type="dxa" w:w="2160"/>
-          </w:tcPr>
-          <w:p>
-            <w:r>
-              <w:rPr>
-                <w:sz w:val="18"/>
-              </w:rPr>
-              <w:t>Bappadala Rohith Kumar Naidu</w:t>
-            </w:r>
-          </w:p>
-        </w:tc>
-      </w:tr>
-      <w:tr>
-        <w:tc>
-          <w:tcPr>
-            <w:tcW w:type="dxa" w:w="2160"/>
-          </w:tcPr>
-          <w:p>
-            <w:r>
-              <w:rPr>
-                <w:sz w:val="18"/>
-              </w:rPr>
-              <w:t>04e172f</w:t>
-            </w:r>
-          </w:p>
-        </w:tc>
-        <w:tc>
-          <w:tcPr>
-            <w:tcW w:type="dxa" w:w="2160"/>
-          </w:tcPr>
-          <w:p>
-            <w:r>
-              <w:rPr>
-                <w:sz w:val="18"/>
-              </w:rPr>
-              <w:t>2026-05-09</w:t>
-            </w:r>
-          </w:p>
-        </w:tc>
-        <w:tc>
-          <w:tcPr>
-            <w:tcW w:type="dxa" w:w="2160"/>
-          </w:tcPr>
-          <w:p>
-            <w:r>
-              <w:rPr>
-                <w:sz w:val="18"/>
-              </w:rPr>
-              <w:t>chore: remove spots and noise gradient, fix TS types</w:t>
             </w:r>
           </w:p>
         </w:tc>
@@ -36173,7 +36173,7 @@
               <w:rPr>
                 <w:sz w:val="18"/>
               </w:rPr>
-              <w:t>231</w:t>
+              <w:t>239</w:t>
             </w:r>
           </w:p>
         </w:tc>
@@ -36307,7 +36307,7 @@
         <w:br/>
         <w:t>Generated by scripts/update_master_doc.py</w:t>
         <w:br/>
-        <w:t>Timestamp: 2026-05-11 21:28 IST</w:t>
+        <w:t>Timestamp: 2026-05-11 23:24 IST</w:t>
         <w:br/>
         <w:t>Repository: github.com/SafeVixAI/SafeVixAI</w:t>
       </w:r>

</xml_diff>

<commit_message>
Deployed 0e9fd6e with MkDocs version: 1.6.1
</commit_message>
<xml_diff>
--- a/SafeVixAI_MASTER.docx
+++ b/SafeVixAI_MASTER.docx
@@ -33723,7 +33723,7 @@
           <w:i w:val="0"/>
           <w:sz w:val="22"/>
         </w:rPr>
-        <w:t>🕐 Last auto-updated: 2026-05-11 23:24 IST</w:t>
+        <w:t>🕐 Last auto-updated: 2026-05-11 23:51 IST</w:t>
       </w:r>
     </w:p>
     <w:p>
@@ -34060,7 +34060,7 @@
               <w:rPr>
                 <w:sz w:val="18"/>
               </w:rPr>
-              <w:t>129ms | HTTP 404 | v?</w:t>
+              <w:t>286ms | HTTP 404 | v?</w:t>
             </w:r>
           </w:p>
         </w:tc>
@@ -34101,7 +34101,7 @@
               <w:rPr>
                 <w:sz w:val="18"/>
               </w:rPr>
-              <w:t>108ms | HTTP 404 | v?</w:t>
+              <w:t>253ms | HTTP 404 | v?</w:t>
             </w:r>
           </w:p>
         </w:tc>
@@ -34142,7 +34142,7 @@
               <w:rPr>
                 <w:sz w:val="18"/>
               </w:rPr>
-              <w:t>63ms | HTTP 200 | v?</w:t>
+              <w:t>87ms | HTTP 200 | v?</w:t>
             </w:r>
           </w:p>
         </w:tc>
@@ -34250,7 +34250,7 @@
               <w:rPr>
                 <w:sz w:val="18"/>
               </w:rPr>
-              <w:t>⏳ Security &amp; SAST Audit</w:t>
+              <w:t>⏳ Wiki Documentation Sync</w:t>
             </w:r>
           </w:p>
         </w:tc>
@@ -34304,7 +34304,7 @@
               <w:rPr>
                 <w:sz w:val="18"/>
               </w:rPr>
-              <w:t>⏳ Wiki Documentation Sync</w:t>
+              <w:t>⏳ Security &amp; SAST Audit</w:t>
             </w:r>
           </w:p>
         </w:tc>
@@ -34574,7 +34574,7 @@
               <w:rPr>
                 <w:sz w:val="18"/>
               </w:rPr>
-              <w:t>✅ PR #7</w:t>
+              <w:t>✅ Code Quality: PR #8</w:t>
             </w:r>
           </w:p>
         </w:tc>
@@ -34587,7 +34587,7 @@
               <w:rPr>
                 <w:sz w:val="18"/>
               </w:rPr>
-              <w:t>refs/pull/7/head</w:t>
+              <w:t>refs/pull/8/head</w:t>
             </w:r>
           </w:p>
         </w:tc>
@@ -34628,7 +34628,7 @@
               <w:rPr>
                 <w:sz w:val="18"/>
               </w:rPr>
-              <w:t>✅ Code Quality: PR #7</w:t>
+              <w:t>✅ PR #8</w:t>
             </w:r>
           </w:p>
         </w:tc>
@@ -34641,7 +34641,7 @@
               <w:rPr>
                 <w:sz w:val="18"/>
               </w:rPr>
-              <w:t>refs/pull/7/head</w:t>
+              <w:t>refs/pull/8/head</w:t>
             </w:r>
           </w:p>
         </w:tc>
@@ -34782,6 +34782,168 @@
                 <w:sz w:val="18"/>
               </w:rPr>
               <w:t>Author</w:t>
+            </w:r>
+          </w:p>
+        </w:tc>
+      </w:tr>
+      <w:tr>
+        <w:tc>
+          <w:tcPr>
+            <w:tcW w:type="dxa" w:w="2160"/>
+          </w:tcPr>
+          <w:p>
+            <w:r>
+              <w:rPr>
+                <w:sz w:val="18"/>
+              </w:rPr>
+              <w:t>47331cb</w:t>
+            </w:r>
+          </w:p>
+        </w:tc>
+        <w:tc>
+          <w:tcPr>
+            <w:tcW w:type="dxa" w:w="2160"/>
+          </w:tcPr>
+          <w:p>
+            <w:r>
+              <w:rPr>
+                <w:sz w:val="18"/>
+              </w:rPr>
+              <w:t>2026-05-11</w:t>
+            </w:r>
+          </w:p>
+        </w:tc>
+        <w:tc>
+          <w:tcPr>
+            <w:tcW w:type="dxa" w:w="2160"/>
+          </w:tcPr>
+          <w:p>
+            <w:r>
+              <w:rPr>
+                <w:sz w:val="18"/>
+              </w:rPr>
+              <w:t>chore: add agent and graphify outputs to gitignore</w:t>
+            </w:r>
+          </w:p>
+        </w:tc>
+        <w:tc>
+          <w:tcPr>
+            <w:tcW w:type="dxa" w:w="2160"/>
+          </w:tcPr>
+          <w:p>
+            <w:r>
+              <w:rPr>
+                <w:sz w:val="18"/>
+              </w:rPr>
+              <w:t>Bappadala Rohith Kumar Naidu</w:t>
+            </w:r>
+          </w:p>
+        </w:tc>
+      </w:tr>
+      <w:tr>
+        <w:tc>
+          <w:tcPr>
+            <w:tcW w:type="dxa" w:w="2160"/>
+          </w:tcPr>
+          <w:p>
+            <w:r>
+              <w:rPr>
+                <w:sz w:val="18"/>
+              </w:rPr>
+              <w:t>612952d</w:t>
+            </w:r>
+          </w:p>
+        </w:tc>
+        <w:tc>
+          <w:tcPr>
+            <w:tcW w:type="dxa" w:w="2160"/>
+          </w:tcPr>
+          <w:p>
+            <w:r>
+              <w:rPr>
+                <w:sz w:val="18"/>
+              </w:rPr>
+              <w:t>2026-05-11</w:t>
+            </w:r>
+          </w:p>
+        </w:tc>
+        <w:tc>
+          <w:tcPr>
+            <w:tcW w:type="dxa" w:w="2160"/>
+          </w:tcPr>
+          <w:p>
+            <w:r>
+              <w:rPr>
+                <w:sz w:val="18"/>
+              </w:rPr>
+              <w:t>Merge pull request #7 from SafeVixAI/docs-auto-update</w:t>
+            </w:r>
+          </w:p>
+        </w:tc>
+        <w:tc>
+          <w:tcPr>
+            <w:tcW w:type="dxa" w:w="2160"/>
+          </w:tcPr>
+          <w:p>
+            <w:r>
+              <w:rPr>
+                <w:sz w:val="18"/>
+              </w:rPr>
+              <w:t>Bappadala Rohith Kumar Naidu</w:t>
+            </w:r>
+          </w:p>
+        </w:tc>
+      </w:tr>
+      <w:tr>
+        <w:tc>
+          <w:tcPr>
+            <w:tcW w:type="dxa" w:w="2160"/>
+          </w:tcPr>
+          <w:p>
+            <w:r>
+              <w:rPr>
+                <w:sz w:val="18"/>
+              </w:rPr>
+              <w:t>9a2813b</w:t>
+            </w:r>
+          </w:p>
+        </w:tc>
+        <w:tc>
+          <w:tcPr>
+            <w:tcW w:type="dxa" w:w="2160"/>
+          </w:tcPr>
+          <w:p>
+            <w:r>
+              <w:rPr>
+                <w:sz w:val="18"/>
+              </w:rPr>
+              <w:t>2026-05-11</w:t>
+            </w:r>
+          </w:p>
+        </w:tc>
+        <w:tc>
+          <w:tcPr>
+            <w:tcW w:type="dxa" w:w="2160"/>
+          </w:tcPr>
+          <w:p>
+            <w:r>
+              <w:rPr>
+                <w:sz w:val="18"/>
+              </w:rPr>
+              <w:t>docs: auto-update master doc</w:t>
+            </w:r>
+          </w:p>
+        </w:tc>
+        <w:tc>
+          <w:tcPr>
+            <w:tcW w:type="dxa" w:w="2160"/>
+          </w:tcPr>
+          <w:p>
+            <w:r>
+              <w:rPr>
+                <w:sz w:val="18"/>
+              </w:rPr>
+              <w:t>rohitkumarnaidu</w:t>
             </w:r>
           </w:p>
         </w:tc>
@@ -35147,168 +35309,6 @@
                 <w:sz w:val="18"/>
               </w:rPr>
               <w:t>ci: fix vercel deployment double path resolution</w:t>
-            </w:r>
-          </w:p>
-        </w:tc>
-        <w:tc>
-          <w:tcPr>
-            <w:tcW w:type="dxa" w:w="2160"/>
-          </w:tcPr>
-          <w:p>
-            <w:r>
-              <w:rPr>
-                <w:sz w:val="18"/>
-              </w:rPr>
-              <w:t>Bappadala Rohith Kumar Naidu</w:t>
-            </w:r>
-          </w:p>
-        </w:tc>
-      </w:tr>
-      <w:tr>
-        <w:tc>
-          <w:tcPr>
-            <w:tcW w:type="dxa" w:w="2160"/>
-          </w:tcPr>
-          <w:p>
-            <w:r>
-              <w:rPr>
-                <w:sz w:val="18"/>
-              </w:rPr>
-              <w:t>8d9d628</w:t>
-            </w:r>
-          </w:p>
-        </w:tc>
-        <w:tc>
-          <w:tcPr>
-            <w:tcW w:type="dxa" w:w="2160"/>
-          </w:tcPr>
-          <w:p>
-            <w:r>
-              <w:rPr>
-                <w:sz w:val="18"/>
-              </w:rPr>
-              <w:t>2026-05-11</w:t>
-            </w:r>
-          </w:p>
-        </w:tc>
-        <w:tc>
-          <w:tcPr>
-            <w:tcW w:type="dxa" w:w="2160"/>
-          </w:tcPr>
-          <w:p>
-            <w:r>
-              <w:rPr>
-                <w:sz w:val="18"/>
-              </w:rPr>
-              <w:t>refactor(frontend): remove emojis for enterprise standard and fix map types</w:t>
-            </w:r>
-          </w:p>
-        </w:tc>
-        <w:tc>
-          <w:tcPr>
-            <w:tcW w:type="dxa" w:w="2160"/>
-          </w:tcPr>
-          <w:p>
-            <w:r>
-              <w:rPr>
-                <w:sz w:val="18"/>
-              </w:rPr>
-              <w:t>Bappadala Rohith Kumar Naidu</w:t>
-            </w:r>
-          </w:p>
-        </w:tc>
-      </w:tr>
-      <w:tr>
-        <w:tc>
-          <w:tcPr>
-            <w:tcW w:type="dxa" w:w="2160"/>
-          </w:tcPr>
-          <w:p>
-            <w:r>
-              <w:rPr>
-                <w:sz w:val="18"/>
-              </w:rPr>
-              <w:t>431c7a7</w:t>
-            </w:r>
-          </w:p>
-        </w:tc>
-        <w:tc>
-          <w:tcPr>
-            <w:tcW w:type="dxa" w:w="2160"/>
-          </w:tcPr>
-          <w:p>
-            <w:r>
-              <w:rPr>
-                <w:sz w:val="18"/>
-              </w:rPr>
-              <w:t>2026-05-10</w:t>
-            </w:r>
-          </w:p>
-        </w:tc>
-        <w:tc>
-          <w:tcPr>
-            <w:tcW w:type="dxa" w:w="2160"/>
-          </w:tcPr>
-          <w:p>
-            <w:r>
-              <w:rPr>
-                <w:sz w:val="18"/>
-              </w:rPr>
-              <w:t>chore: ignore error log files in gitignore</w:t>
-            </w:r>
-          </w:p>
-        </w:tc>
-        <w:tc>
-          <w:tcPr>
-            <w:tcW w:type="dxa" w:w="2160"/>
-          </w:tcPr>
-          <w:p>
-            <w:r>
-              <w:rPr>
-                <w:sz w:val="18"/>
-              </w:rPr>
-              <w:t>Bappadala Rohith Kumar Naidu</w:t>
-            </w:r>
-          </w:p>
-        </w:tc>
-      </w:tr>
-      <w:tr>
-        <w:tc>
-          <w:tcPr>
-            <w:tcW w:type="dxa" w:w="2160"/>
-          </w:tcPr>
-          <w:p>
-            <w:r>
-              <w:rPr>
-                <w:sz w:val="18"/>
-              </w:rPr>
-              <w:t>431bb1f</w:t>
-            </w:r>
-          </w:p>
-        </w:tc>
-        <w:tc>
-          <w:tcPr>
-            <w:tcW w:type="dxa" w:w="2160"/>
-          </w:tcPr>
-          <w:p>
-            <w:r>
-              <w:rPr>
-                <w:sz w:val="18"/>
-              </w:rPr>
-              <w:t>2026-05-10</w:t>
-            </w:r>
-          </w:p>
-        </w:tc>
-        <w:tc>
-          <w:tcPr>
-            <w:tcW w:type="dxa" w:w="2160"/>
-          </w:tcPr>
-          <w:p>
-            <w:r>
-              <w:rPr>
-                <w:sz w:val="18"/>
-              </w:rPr>
-              <w:t>chore: add Playwright output to gitignore</w:t>
             </w:r>
           </w:p>
         </w:tc>
@@ -36307,7 +36307,7 @@
         <w:br/>
         <w:t>Generated by scripts/update_master_doc.py</w:t>
         <w:br/>
-        <w:t>Timestamp: 2026-05-11 23:24 IST</w:t>
+        <w:t>Timestamp: 2026-05-11 23:51 IST</w:t>
         <w:br/>
         <w:t>Repository: github.com/SafeVixAI/SafeVixAI</w:t>
       </w:r>

</xml_diff>

<commit_message>
Deployed cb8a6a3 with MkDocs version: 1.6.1
</commit_message>
<xml_diff>
--- a/SafeVixAI_MASTER.docx
+++ b/SafeVixAI_MASTER.docx
@@ -33723,7 +33723,7 @@
           <w:i w:val="0"/>
           <w:sz w:val="22"/>
         </w:rPr>
-        <w:t>🕐 Last auto-updated: 2026-05-11 23:51 IST</w:t>
+        <w:t>🕐 Last auto-updated: 2026-05-12 22:47 IST</w:t>
       </w:r>
     </w:p>
     <w:p>
@@ -33867,7 +33867,7 @@
               <w:rPr>
                 <w:sz w:val="18"/>
               </w:rPr>
-              <w:t>46 MB</w:t>
+              <w:t>45 MB</w:t>
             </w:r>
           </w:p>
         </w:tc>
@@ -33923,7 +33923,7 @@
               <w:rPr>
                 <w:sz w:val="18"/>
               </w:rPr>
-              <w:t>2026-05-11</w:t>
+              <w:t>2026-05-12</w:t>
             </w:r>
           </w:p>
         </w:tc>
@@ -33951,7 +33951,7 @@
               <w:rPr>
                 <w:sz w:val="18"/>
               </w:rPr>
-              <w:t>1</w:t>
+              <w:t>2</w:t>
             </w:r>
           </w:p>
         </w:tc>
@@ -34060,7 +34060,7 @@
               <w:rPr>
                 <w:sz w:val="18"/>
               </w:rPr>
-              <w:t>286ms | HTTP 404 | v?</w:t>
+              <w:t>291ms | HTTP 404 | v?</w:t>
             </w:r>
           </w:p>
         </w:tc>
@@ -34101,7 +34101,7 @@
               <w:rPr>
                 <w:sz w:val="18"/>
               </w:rPr>
-              <w:t>253ms | HTTP 404 | v?</w:t>
+              <w:t>198ms | HTTP 404 | v?</w:t>
             </w:r>
           </w:p>
         </w:tc>
@@ -34142,7 +34142,7 @@
               <w:rPr>
                 <w:sz w:val="18"/>
               </w:rPr>
-              <w:t>87ms | HTTP 200 | v?</w:t>
+              <w:t>283ms | HTTP 200 | v?</w:t>
             </w:r>
           </w:p>
         </w:tc>
@@ -34250,7 +34250,7 @@
               <w:rPr>
                 <w:sz w:val="18"/>
               </w:rPr>
-              <w:t>⏳ Wiki Documentation Sync</w:t>
+              <w:t>⏳ Render Deploy Readiness</w:t>
             </w:r>
           </w:p>
         </w:tc>
@@ -34289,7 +34289,7 @@
               <w:rPr>
                 <w:sz w:val="18"/>
               </w:rPr>
-              <w:t>2026-05-11</w:t>
+              <w:t>2026-05-12</w:t>
             </w:r>
           </w:p>
         </w:tc>
@@ -34343,7 +34343,169 @@
               <w:rPr>
                 <w:sz w:val="18"/>
               </w:rPr>
-              <w:t>2026-05-11</w:t>
+              <w:t>2026-05-12</w:t>
+            </w:r>
+          </w:p>
+        </w:tc>
+      </w:tr>
+      <w:tr>
+        <w:tc>
+          <w:tcPr>
+            <w:tcW w:type="dxa" w:w="2160"/>
+          </w:tcPr>
+          <w:p>
+            <w:r>
+              <w:rPr>
+                <w:sz w:val="18"/>
+              </w:rPr>
+              <w:t>⏳ Backend Core CI</w:t>
+            </w:r>
+          </w:p>
+        </w:tc>
+        <w:tc>
+          <w:tcPr>
+            <w:tcW w:type="dxa" w:w="2160"/>
+          </w:tcPr>
+          <w:p>
+            <w:r>
+              <w:rPr>
+                <w:sz w:val="18"/>
+              </w:rPr>
+              <w:t>main</w:t>
+            </w:r>
+          </w:p>
+        </w:tc>
+        <w:tc>
+          <w:tcPr>
+            <w:tcW w:type="dxa" w:w="2160"/>
+          </w:tcPr>
+          <w:p>
+            <w:r>
+              <w:rPr>
+                <w:sz w:val="18"/>
+              </w:rPr>
+              <w:t>in_progress</w:t>
+            </w:r>
+          </w:p>
+        </w:tc>
+        <w:tc>
+          <w:tcPr>
+            <w:tcW w:type="dxa" w:w="2160"/>
+          </w:tcPr>
+          <w:p>
+            <w:r>
+              <w:rPr>
+                <w:sz w:val="18"/>
+              </w:rPr>
+              <w:t>2026-05-12</w:t>
+            </w:r>
+          </w:p>
+        </w:tc>
+      </w:tr>
+      <w:tr>
+        <w:tc>
+          <w:tcPr>
+            <w:tcW w:type="dxa" w:w="2160"/>
+          </w:tcPr>
+          <w:p>
+            <w:r>
+              <w:rPr>
+                <w:sz w:val="18"/>
+              </w:rPr>
+              <w:t>⏳ Update Master Document</w:t>
+            </w:r>
+          </w:p>
+        </w:tc>
+        <w:tc>
+          <w:tcPr>
+            <w:tcW w:type="dxa" w:w="2160"/>
+          </w:tcPr>
+          <w:p>
+            <w:r>
+              <w:rPr>
+                <w:sz w:val="18"/>
+              </w:rPr>
+              <w:t>main</w:t>
+            </w:r>
+          </w:p>
+        </w:tc>
+        <w:tc>
+          <w:tcPr>
+            <w:tcW w:type="dxa" w:w="2160"/>
+          </w:tcPr>
+          <w:p>
+            <w:r>
+              <w:rPr>
+                <w:sz w:val="18"/>
+              </w:rPr>
+              <w:t>in_progress</w:t>
+            </w:r>
+          </w:p>
+        </w:tc>
+        <w:tc>
+          <w:tcPr>
+            <w:tcW w:type="dxa" w:w="2160"/>
+          </w:tcPr>
+          <w:p>
+            <w:r>
+              <w:rPr>
+                <w:sz w:val="18"/>
+              </w:rPr>
+              <w:t>2026-05-12</w:t>
+            </w:r>
+          </w:p>
+        </w:tc>
+      </w:tr>
+      <w:tr>
+        <w:tc>
+          <w:tcPr>
+            <w:tcW w:type="dxa" w:w="2160"/>
+          </w:tcPr>
+          <w:p>
+            <w:r>
+              <w:rPr>
+                <w:sz w:val="18"/>
+              </w:rPr>
+              <w:t>⏳ Wiki Documentation Sync</w:t>
+            </w:r>
+          </w:p>
+        </w:tc>
+        <w:tc>
+          <w:tcPr>
+            <w:tcW w:type="dxa" w:w="2160"/>
+          </w:tcPr>
+          <w:p>
+            <w:r>
+              <w:rPr>
+                <w:sz w:val="18"/>
+              </w:rPr>
+              <w:t>main</w:t>
+            </w:r>
+          </w:p>
+        </w:tc>
+        <w:tc>
+          <w:tcPr>
+            <w:tcW w:type="dxa" w:w="2160"/>
+          </w:tcPr>
+          <w:p>
+            <w:r>
+              <w:rPr>
+                <w:sz w:val="18"/>
+              </w:rPr>
+              <w:t>in_progress</w:t>
+            </w:r>
+          </w:p>
+        </w:tc>
+        <w:tc>
+          <w:tcPr>
+            <w:tcW w:type="dxa" w:w="2160"/>
+          </w:tcPr>
+          <w:p>
+            <w:r>
+              <w:rPr>
+                <w:sz w:val="18"/>
+              </w:rPr>
+              <w:t>2026-05-12</w:t>
             </w:r>
           </w:p>
         </w:tc>
@@ -34397,61 +34559,7 @@
               <w:rPr>
                 <w:sz w:val="18"/>
               </w:rPr>
-              <w:t>2026-05-11</w:t>
-            </w:r>
-          </w:p>
-        </w:tc>
-      </w:tr>
-      <w:tr>
-        <w:tc>
-          <w:tcPr>
-            <w:tcW w:type="dxa" w:w="2160"/>
-          </w:tcPr>
-          <w:p>
-            <w:r>
-              <w:rPr>
-                <w:sz w:val="18"/>
-              </w:rPr>
-              <w:t>⏳ Update Master Document</w:t>
-            </w:r>
-          </w:p>
-        </w:tc>
-        <w:tc>
-          <w:tcPr>
-            <w:tcW w:type="dxa" w:w="2160"/>
-          </w:tcPr>
-          <w:p>
-            <w:r>
-              <w:rPr>
-                <w:sz w:val="18"/>
-              </w:rPr>
-              <w:t>main</w:t>
-            </w:r>
-          </w:p>
-        </w:tc>
-        <w:tc>
-          <w:tcPr>
-            <w:tcW w:type="dxa" w:w="2160"/>
-          </w:tcPr>
-          <w:p>
-            <w:r>
-              <w:rPr>
-                <w:sz w:val="18"/>
-              </w:rPr>
-              <w:t>in_progress</w:t>
-            </w:r>
-          </w:p>
-        </w:tc>
-        <w:tc>
-          <w:tcPr>
-            <w:tcW w:type="dxa" w:w="2160"/>
-          </w:tcPr>
-          <w:p>
-            <w:r>
-              <w:rPr>
-                <w:sz w:val="18"/>
-              </w:rPr>
-              <w:t>2026-05-11</w:t>
+              <w:t>2026-05-12</w:t>
             </w:r>
           </w:p>
         </w:tc>
@@ -34505,7 +34613,7 @@
               <w:rPr>
                 <w:sz w:val="18"/>
               </w:rPr>
-              <w:t>2026-05-11</w:t>
+              <w:t>2026-05-12</w:t>
             </w:r>
           </w:p>
         </w:tc>
@@ -34559,115 +34667,7 @@
               <w:rPr>
                 <w:sz w:val="18"/>
               </w:rPr>
-              <w:t>2026-05-11</w:t>
-            </w:r>
-          </w:p>
-        </w:tc>
-      </w:tr>
-      <w:tr>
-        <w:tc>
-          <w:tcPr>
-            <w:tcW w:type="dxa" w:w="2160"/>
-          </w:tcPr>
-          <w:p>
-            <w:r>
-              <w:rPr>
-                <w:sz w:val="18"/>
-              </w:rPr>
-              <w:t>✅ Code Quality: PR #8</w:t>
-            </w:r>
-          </w:p>
-        </w:tc>
-        <w:tc>
-          <w:tcPr>
-            <w:tcW w:type="dxa" w:w="2160"/>
-          </w:tcPr>
-          <w:p>
-            <w:r>
-              <w:rPr>
-                <w:sz w:val="18"/>
-              </w:rPr>
-              <w:t>refs/pull/8/head</w:t>
-            </w:r>
-          </w:p>
-        </w:tc>
-        <w:tc>
-          <w:tcPr>
-            <w:tcW w:type="dxa" w:w="2160"/>
-          </w:tcPr>
-          <w:p>
-            <w:r>
-              <w:rPr>
-                <w:sz w:val="18"/>
-              </w:rPr>
-              <w:t>success</w:t>
-            </w:r>
-          </w:p>
-        </w:tc>
-        <w:tc>
-          <w:tcPr>
-            <w:tcW w:type="dxa" w:w="2160"/>
-          </w:tcPr>
-          <w:p>
-            <w:r>
-              <w:rPr>
-                <w:sz w:val="18"/>
-              </w:rPr>
-              <w:t>2026-05-11</w:t>
-            </w:r>
-          </w:p>
-        </w:tc>
-      </w:tr>
-      <w:tr>
-        <w:tc>
-          <w:tcPr>
-            <w:tcW w:type="dxa" w:w="2160"/>
-          </w:tcPr>
-          <w:p>
-            <w:r>
-              <w:rPr>
-                <w:sz w:val="18"/>
-              </w:rPr>
-              <w:t>✅ PR #8</w:t>
-            </w:r>
-          </w:p>
-        </w:tc>
-        <w:tc>
-          <w:tcPr>
-            <w:tcW w:type="dxa" w:w="2160"/>
-          </w:tcPr>
-          <w:p>
-            <w:r>
-              <w:rPr>
-                <w:sz w:val="18"/>
-              </w:rPr>
-              <w:t>refs/pull/8/head</w:t>
-            </w:r>
-          </w:p>
-        </w:tc>
-        <w:tc>
-          <w:tcPr>
-            <w:tcW w:type="dxa" w:w="2160"/>
-          </w:tcPr>
-          <w:p>
-            <w:r>
-              <w:rPr>
-                <w:sz w:val="18"/>
-              </w:rPr>
-              <w:t>success</w:t>
-            </w:r>
-          </w:p>
-        </w:tc>
-        <w:tc>
-          <w:tcPr>
-            <w:tcW w:type="dxa" w:w="2160"/>
-          </w:tcPr>
-          <w:p>
-            <w:r>
-              <w:rPr>
-                <w:sz w:val="18"/>
-              </w:rPr>
-              <w:t>2026-05-11</w:t>
+              <w:t>2026-05-12</w:t>
             </w:r>
           </w:p>
         </w:tc>
@@ -34782,6 +34782,222 @@
                 <w:sz w:val="18"/>
               </w:rPr>
               <w:t>Author</w:t>
+            </w:r>
+          </w:p>
+        </w:tc>
+      </w:tr>
+      <w:tr>
+        <w:tc>
+          <w:tcPr>
+            <w:tcW w:type="dxa" w:w="2160"/>
+          </w:tcPr>
+          <w:p>
+            <w:r>
+              <w:rPr>
+                <w:sz w:val="18"/>
+              </w:rPr>
+              <w:t>6689bc3</w:t>
+            </w:r>
+          </w:p>
+        </w:tc>
+        <w:tc>
+          <w:tcPr>
+            <w:tcW w:type="dxa" w:w="2160"/>
+          </w:tcPr>
+          <w:p>
+            <w:r>
+              <w:rPr>
+                <w:sz w:val="18"/>
+              </w:rPr>
+              <w:t>2026-05-12</w:t>
+            </w:r>
+          </w:p>
+        </w:tc>
+        <w:tc>
+          <w:tcPr>
+            <w:tcW w:type="dxa" w:w="2160"/>
+          </w:tcPr>
+          <w:p>
+            <w:r>
+              <w:rPr>
+                <w:sz w:val="18"/>
+              </w:rPr>
+              <w:t>feat(verify/mcp): finalize enterprise verification hardening with V2 features an</w:t>
+            </w:r>
+          </w:p>
+        </w:tc>
+        <w:tc>
+          <w:tcPr>
+            <w:tcW w:type="dxa" w:w="2160"/>
+          </w:tcPr>
+          <w:p>
+            <w:r>
+              <w:rPr>
+                <w:sz w:val="18"/>
+              </w:rPr>
+              <w:t>Bappadala Rohith Kumar Naidu</w:t>
+            </w:r>
+          </w:p>
+        </w:tc>
+      </w:tr>
+      <w:tr>
+        <w:tc>
+          <w:tcPr>
+            <w:tcW w:type="dxa" w:w="2160"/>
+          </w:tcPr>
+          <w:p>
+            <w:r>
+              <w:rPr>
+                <w:sz w:val="18"/>
+              </w:rPr>
+              <w:t>5b79afc</w:t>
+            </w:r>
+          </w:p>
+        </w:tc>
+        <w:tc>
+          <w:tcPr>
+            <w:tcW w:type="dxa" w:w="2160"/>
+          </w:tcPr>
+          <w:p>
+            <w:r>
+              <w:rPr>
+                <w:sz w:val="18"/>
+              </w:rPr>
+              <w:t>2026-05-12</w:t>
+            </w:r>
+          </w:p>
+        </w:tc>
+        <w:tc>
+          <w:tcPr>
+            <w:tcW w:type="dxa" w:w="2160"/>
+          </w:tcPr>
+          <w:p>
+            <w:r>
+              <w:rPr>
+                <w:sz w:val="18"/>
+              </w:rPr>
+              <w:t>feat(ui/ux): stabilize enterprise app shell, status tracking, and map test suite</w:t>
+            </w:r>
+          </w:p>
+        </w:tc>
+        <w:tc>
+          <w:tcPr>
+            <w:tcW w:type="dxa" w:w="2160"/>
+          </w:tcPr>
+          <w:p>
+            <w:r>
+              <w:rPr>
+                <w:sz w:val="18"/>
+              </w:rPr>
+              <w:t>Bappadala Rohith Kumar Naidu</w:t>
+            </w:r>
+          </w:p>
+        </w:tc>
+      </w:tr>
+      <w:tr>
+        <w:tc>
+          <w:tcPr>
+            <w:tcW w:type="dxa" w:w="2160"/>
+          </w:tcPr>
+          <w:p>
+            <w:r>
+              <w:rPr>
+                <w:sz w:val="18"/>
+              </w:rPr>
+              <w:t>0e9fd6e</w:t>
+            </w:r>
+          </w:p>
+        </w:tc>
+        <w:tc>
+          <w:tcPr>
+            <w:tcW w:type="dxa" w:w="2160"/>
+          </w:tcPr>
+          <w:p>
+            <w:r>
+              <w:rPr>
+                <w:sz w:val="18"/>
+              </w:rPr>
+              <w:t>2026-05-12</w:t>
+            </w:r>
+          </w:p>
+        </w:tc>
+        <w:tc>
+          <w:tcPr>
+            <w:tcW w:type="dxa" w:w="2160"/>
+          </w:tcPr>
+          <w:p>
+            <w:r>
+              <w:rPr>
+                <w:sz w:val="18"/>
+              </w:rPr>
+              <w:t>Merge pull request #8 from SafeVixAI/docs-auto-update</w:t>
+            </w:r>
+          </w:p>
+        </w:tc>
+        <w:tc>
+          <w:tcPr>
+            <w:tcW w:type="dxa" w:w="2160"/>
+          </w:tcPr>
+          <w:p>
+            <w:r>
+              <w:rPr>
+                <w:sz w:val="18"/>
+              </w:rPr>
+              <w:t>Bappadala Rohith Kumar Naidu</w:t>
+            </w:r>
+          </w:p>
+        </w:tc>
+      </w:tr>
+      <w:tr>
+        <w:tc>
+          <w:tcPr>
+            <w:tcW w:type="dxa" w:w="2160"/>
+          </w:tcPr>
+          <w:p>
+            <w:r>
+              <w:rPr>
+                <w:sz w:val="18"/>
+              </w:rPr>
+              <w:t>feb91db</w:t>
+            </w:r>
+          </w:p>
+        </w:tc>
+        <w:tc>
+          <w:tcPr>
+            <w:tcW w:type="dxa" w:w="2160"/>
+          </w:tcPr>
+          <w:p>
+            <w:r>
+              <w:rPr>
+                <w:sz w:val="18"/>
+              </w:rPr>
+              <w:t>2026-05-11</w:t>
+            </w:r>
+          </w:p>
+        </w:tc>
+        <w:tc>
+          <w:tcPr>
+            <w:tcW w:type="dxa" w:w="2160"/>
+          </w:tcPr>
+          <w:p>
+            <w:r>
+              <w:rPr>
+                <w:sz w:val="18"/>
+              </w:rPr>
+              <w:t>docs: auto-update master doc</w:t>
+            </w:r>
+          </w:p>
+        </w:tc>
+        <w:tc>
+          <w:tcPr>
+            <w:tcW w:type="dxa" w:w="2160"/>
+          </w:tcPr>
+          <w:p>
+            <w:r>
+              <w:rPr>
+                <w:sz w:val="18"/>
+              </w:rPr>
+              <w:t>rohitkumarnaidu</w:t>
             </w:r>
           </w:p>
         </w:tc>
@@ -35093,222 +35309,6 @@
                 <w:sz w:val="18"/>
               </w:rPr>
               <w:t>feat(docs): add missing frontend component wiki docs and update chatbot router</w:t>
-            </w:r>
-          </w:p>
-        </w:tc>
-        <w:tc>
-          <w:tcPr>
-            <w:tcW w:type="dxa" w:w="2160"/>
-          </w:tcPr>
-          <w:p>
-            <w:r>
-              <w:rPr>
-                <w:sz w:val="18"/>
-              </w:rPr>
-              <w:t>Bappadala Rohith Kumar Naidu</w:t>
-            </w:r>
-          </w:p>
-        </w:tc>
-      </w:tr>
-      <w:tr>
-        <w:tc>
-          <w:tcPr>
-            <w:tcW w:type="dxa" w:w="2160"/>
-          </w:tcPr>
-          <w:p>
-            <w:r>
-              <w:rPr>
-                <w:sz w:val="18"/>
-              </w:rPr>
-              <w:t>22c23b5</w:t>
-            </w:r>
-          </w:p>
-        </w:tc>
-        <w:tc>
-          <w:tcPr>
-            <w:tcW w:type="dxa" w:w="2160"/>
-          </w:tcPr>
-          <w:p>
-            <w:r>
-              <w:rPr>
-                <w:sz w:val="18"/>
-              </w:rPr>
-              <w:t>2026-05-11</w:t>
-            </w:r>
-          </w:p>
-        </w:tc>
-        <w:tc>
-          <w:tcPr>
-            <w:tcW w:type="dxa" w:w="2160"/>
-          </w:tcPr>
-          <w:p>
-            <w:r>
-              <w:rPr>
-                <w:sz w:val="18"/>
-              </w:rPr>
-              <w:t>Merge pull request #6 from SafeVixAI/docs-auto-update</w:t>
-            </w:r>
-          </w:p>
-        </w:tc>
-        <w:tc>
-          <w:tcPr>
-            <w:tcW w:type="dxa" w:w="2160"/>
-          </w:tcPr>
-          <w:p>
-            <w:r>
-              <w:rPr>
-                <w:sz w:val="18"/>
-              </w:rPr>
-              <w:t>Bappadala Rohith Kumar Naidu</w:t>
-            </w:r>
-          </w:p>
-        </w:tc>
-      </w:tr>
-      <w:tr>
-        <w:tc>
-          <w:tcPr>
-            <w:tcW w:type="dxa" w:w="2160"/>
-          </w:tcPr>
-          <w:p>
-            <w:r>
-              <w:rPr>
-                <w:sz w:val="18"/>
-              </w:rPr>
-              <w:t>2c7700a</w:t>
-            </w:r>
-          </w:p>
-        </w:tc>
-        <w:tc>
-          <w:tcPr>
-            <w:tcW w:type="dxa" w:w="2160"/>
-          </w:tcPr>
-          <w:p>
-            <w:r>
-              <w:rPr>
-                <w:sz w:val="18"/>
-              </w:rPr>
-              <w:t>2026-05-11</w:t>
-            </w:r>
-          </w:p>
-        </w:tc>
-        <w:tc>
-          <w:tcPr>
-            <w:tcW w:type="dxa" w:w="2160"/>
-          </w:tcPr>
-          <w:p>
-            <w:r>
-              <w:rPr>
-                <w:sz w:val="18"/>
-              </w:rPr>
-              <w:t>docs: auto-update master doc</w:t>
-            </w:r>
-          </w:p>
-        </w:tc>
-        <w:tc>
-          <w:tcPr>
-            <w:tcW w:type="dxa" w:w="2160"/>
-          </w:tcPr>
-          <w:p>
-            <w:r>
-              <w:rPr>
-                <w:sz w:val="18"/>
-              </w:rPr>
-              <w:t>rohitkumarnaidu</w:t>
-            </w:r>
-          </w:p>
-        </w:tc>
-      </w:tr>
-      <w:tr>
-        <w:tc>
-          <w:tcPr>
-            <w:tcW w:type="dxa" w:w="2160"/>
-          </w:tcPr>
-          <w:p>
-            <w:r>
-              <w:rPr>
-                <w:sz w:val="18"/>
-              </w:rPr>
-              <w:t>efd6631</w:t>
-            </w:r>
-          </w:p>
-        </w:tc>
-        <w:tc>
-          <w:tcPr>
-            <w:tcW w:type="dxa" w:w="2160"/>
-          </w:tcPr>
-          <w:p>
-            <w:r>
-              <w:rPr>
-                <w:sz w:val="18"/>
-              </w:rPr>
-              <w:t>2026-05-11</w:t>
-            </w:r>
-          </w:p>
-        </w:tc>
-        <w:tc>
-          <w:tcPr>
-            <w:tcW w:type="dxa" w:w="2160"/>
-          </w:tcPr>
-          <w:p>
-            <w:r>
-              <w:rPr>
-                <w:sz w:val="18"/>
-              </w:rPr>
-              <w:t>ci: optimize docs workflow triggers and add GitHub Models provider</w:t>
-            </w:r>
-          </w:p>
-        </w:tc>
-        <w:tc>
-          <w:tcPr>
-            <w:tcW w:type="dxa" w:w="2160"/>
-          </w:tcPr>
-          <w:p>
-            <w:r>
-              <w:rPr>
-                <w:sz w:val="18"/>
-              </w:rPr>
-              <w:t>Bappadala Rohith Kumar Naidu</w:t>
-            </w:r>
-          </w:p>
-        </w:tc>
-      </w:tr>
-      <w:tr>
-        <w:tc>
-          <w:tcPr>
-            <w:tcW w:type="dxa" w:w="2160"/>
-          </w:tcPr>
-          <w:p>
-            <w:r>
-              <w:rPr>
-                <w:sz w:val="18"/>
-              </w:rPr>
-              <w:t>8e57416</w:t>
-            </w:r>
-          </w:p>
-        </w:tc>
-        <w:tc>
-          <w:tcPr>
-            <w:tcW w:type="dxa" w:w="2160"/>
-          </w:tcPr>
-          <w:p>
-            <w:r>
-              <w:rPr>
-                <w:sz w:val="18"/>
-              </w:rPr>
-              <w:t>2026-05-11</w:t>
-            </w:r>
-          </w:p>
-        </w:tc>
-        <w:tc>
-          <w:tcPr>
-            <w:tcW w:type="dxa" w:w="2160"/>
-          </w:tcPr>
-          <w:p>
-            <w:r>
-              <w:rPr>
-                <w:sz w:val="18"/>
-              </w:rPr>
-              <w:t>ci: fix vercel deployment double path resolution</w:t>
             </w:r>
           </w:p>
         </w:tc>
@@ -36307,7 +36307,7 @@
         <w:br/>
         <w:t>Generated by scripts/update_master_doc.py</w:t>
         <w:br/>
-        <w:t>Timestamp: 2026-05-11 23:51 IST</w:t>
+        <w:t>Timestamp: 2026-05-12 22:47 IST</w:t>
         <w:br/>
         <w:t>Repository: github.com/SafeVixAI/SafeVixAI</w:t>
       </w:r>

</xml_diff>

<commit_message>
Deployed a1b646b with MkDocs version: 1.6.1
</commit_message>
<xml_diff>
--- a/SafeVixAI_MASTER.docx
+++ b/SafeVixAI_MASTER.docx
@@ -33723,7 +33723,7 @@
           <w:i w:val="0"/>
           <w:sz w:val="22"/>
         </w:rPr>
-        <w:t>🕐 Last auto-updated: 2026-05-12 22:47 IST</w:t>
+        <w:t>🕐 Last auto-updated: 2026-05-12 23:05 IST</w:t>
       </w:r>
     </w:p>
     <w:p>
@@ -33951,7 +33951,7 @@
               <w:rPr>
                 <w:sz w:val="18"/>
               </w:rPr>
-              <w:t>2</w:t>
+              <w:t>1</w:t>
             </w:r>
           </w:p>
         </w:tc>
@@ -34060,7 +34060,7 @@
               <w:rPr>
                 <w:sz w:val="18"/>
               </w:rPr>
-              <w:t>291ms | HTTP 404 | v?</w:t>
+              <w:t>1048ms | HTTP 404 | v?</w:t>
             </w:r>
           </w:p>
         </w:tc>
@@ -34101,7 +34101,7 @@
               <w:rPr>
                 <w:sz w:val="18"/>
               </w:rPr>
-              <w:t>198ms | HTTP 404 | v?</w:t>
+              <w:t>687ms | HTTP 404 | v?</w:t>
             </w:r>
           </w:p>
         </w:tc>
@@ -34142,7 +34142,7 @@
               <w:rPr>
                 <w:sz w:val="18"/>
               </w:rPr>
-              <w:t>283ms | HTTP 200 | v?</w:t>
+              <w:t>762ms | HTTP 200 | v?</w:t>
             </w:r>
           </w:p>
         </w:tc>
@@ -34250,7 +34250,7 @@
               <w:rPr>
                 <w:sz w:val="18"/>
               </w:rPr>
-              <w:t>⏳ Render Deploy Readiness</w:t>
+              <w:t>✅ pages build and deployment</w:t>
             </w:r>
           </w:p>
         </w:tc>
@@ -34263,7 +34263,7 @@
               <w:rPr>
                 <w:sz w:val="18"/>
               </w:rPr>
-              <w:t>main</w:t>
+              <w:t>gh-pages</w:t>
             </w:r>
           </w:p>
         </w:tc>
@@ -34276,7 +34276,7 @@
               <w:rPr>
                 <w:sz w:val="18"/>
               </w:rPr>
-              <w:t>in_progress</w:t>
+              <w:t>success</w:t>
             </w:r>
           </w:p>
         </w:tc>
@@ -34304,7 +34304,7 @@
               <w:rPr>
                 <w:sz w:val="18"/>
               </w:rPr>
-              <w:t>⏳ Security &amp; SAST Audit</w:t>
+              <w:t>✅ Code Quality: PR #11</w:t>
             </w:r>
           </w:p>
         </w:tc>
@@ -34317,7 +34317,7 @@
               <w:rPr>
                 <w:sz w:val="18"/>
               </w:rPr>
-              <w:t>main</w:t>
+              <w:t>refs/pull/11/head</w:t>
             </w:r>
           </w:p>
         </w:tc>
@@ -34330,7 +34330,7 @@
               <w:rPr>
                 <w:sz w:val="18"/>
               </w:rPr>
-              <w:t>in_progress</w:t>
+              <w:t>success</w:t>
             </w:r>
           </w:p>
         </w:tc>
@@ -34358,7 +34358,7 @@
               <w:rPr>
                 <w:sz w:val="18"/>
               </w:rPr>
-              <w:t>⏳ Backend Core CI</w:t>
+              <w:t>✅ PR #11</w:t>
             </w:r>
           </w:p>
         </w:tc>
@@ -34371,7 +34371,7 @@
               <w:rPr>
                 <w:sz w:val="18"/>
               </w:rPr>
-              <w:t>main</w:t>
+              <w:t>refs/pull/11/head</w:t>
             </w:r>
           </w:p>
         </w:tc>
@@ -34384,7 +34384,7 @@
               <w:rPr>
                 <w:sz w:val="18"/>
               </w:rPr>
-              <w:t>in_progress</w:t>
+              <w:t>success</w:t>
             </w:r>
           </w:p>
         </w:tc>
@@ -34412,7 +34412,7 @@
               <w:rPr>
                 <w:sz w:val="18"/>
               </w:rPr>
-              <w:t>⏳ Update Master Document</w:t>
+              <w:t>✅ Deploy Enterprise Docs</w:t>
             </w:r>
           </w:p>
         </w:tc>
@@ -34438,7 +34438,7 @@
               <w:rPr>
                 <w:sz w:val="18"/>
               </w:rPr>
-              <w:t>in_progress</w:t>
+              <w:t>success</w:t>
             </w:r>
           </w:p>
         </w:tc>
@@ -34466,7 +34466,7 @@
               <w:rPr>
                 <w:sz w:val="18"/>
               </w:rPr>
-              <w:t>⏳ Wiki Documentation Sync</w:t>
+              <w:t>✅ Wiki Documentation Sync</w:t>
             </w:r>
           </w:p>
         </w:tc>
@@ -34492,7 +34492,7 @@
               <w:rPr>
                 <w:sz w:val="18"/>
               </w:rPr>
-              <w:t>in_progress</w:t>
+              <w:t>success</w:t>
             </w:r>
           </w:p>
         </w:tc>
@@ -34520,7 +34520,7 @@
               <w:rPr>
                 <w:sz w:val="18"/>
               </w:rPr>
-              <w:t>⏳ Deploy Enterprise Docs</w:t>
+              <w:t>✅ Security &amp; SAST Audit</w:t>
             </w:r>
           </w:p>
         </w:tc>
@@ -34546,7 +34546,7 @@
               <w:rPr>
                 <w:sz w:val="18"/>
               </w:rPr>
-              <w:t>in_progress</w:t>
+              <w:t>success</w:t>
             </w:r>
           </w:p>
         </w:tc>
@@ -34574,7 +34574,7 @@
               <w:rPr>
                 <w:sz w:val="18"/>
               </w:rPr>
-              <w:t>⏳ Code Quality: Push on main</w:t>
+              <w:t>✅ Update Master Document</w:t>
             </w:r>
           </w:p>
         </w:tc>
@@ -34600,7 +34600,7 @@
               <w:rPr>
                 <w:sz w:val="18"/>
               </w:rPr>
-              <w:t>in_progress</w:t>
+              <w:t>success</w:t>
             </w:r>
           </w:p>
         </w:tc>
@@ -34628,7 +34628,7 @@
               <w:rPr>
                 <w:sz w:val="18"/>
               </w:rPr>
-              <w:t>⏳ Push on main</w:t>
+              <w:t>✅ Push on main</w:t>
             </w:r>
           </w:p>
         </w:tc>
@@ -34654,7 +34654,7 @@
               <w:rPr>
                 <w:sz w:val="18"/>
               </w:rPr>
-              <w:t>in_progress</w:t>
+              <w:t>success</w:t>
             </w:r>
           </w:p>
         </w:tc>
@@ -34782,6 +34782,222 @@
                 <w:sz w:val="18"/>
               </w:rPr>
               <w:t>Author</w:t>
+            </w:r>
+          </w:p>
+        </w:tc>
+      </w:tr>
+      <w:tr>
+        <w:tc>
+          <w:tcPr>
+            <w:tcW w:type="dxa" w:w="2160"/>
+          </w:tcPr>
+          <w:p>
+            <w:r>
+              <w:rPr>
+                <w:sz w:val="18"/>
+              </w:rPr>
+              <w:t>a9bfcae</w:t>
+            </w:r>
+          </w:p>
+        </w:tc>
+        <w:tc>
+          <w:tcPr>
+            <w:tcW w:type="dxa" w:w="2160"/>
+          </w:tcPr>
+          <w:p>
+            <w:r>
+              <w:rPr>
+                <w:sz w:val="18"/>
+              </w:rPr>
+              <w:t>2026-05-12</w:t>
+            </w:r>
+          </w:p>
+        </w:tc>
+        <w:tc>
+          <w:tcPr>
+            <w:tcW w:type="dxa" w:w="2160"/>
+          </w:tcPr>
+          <w:p>
+            <w:r>
+              <w:rPr>
+                <w:sz w:val="18"/>
+              </w:rPr>
+              <w:t>Merge pull request #10 from SafeVixAI/docs-wiki-auto-update</w:t>
+            </w:r>
+          </w:p>
+        </w:tc>
+        <w:tc>
+          <w:tcPr>
+            <w:tcW w:type="dxa" w:w="2160"/>
+          </w:tcPr>
+          <w:p>
+            <w:r>
+              <w:rPr>
+                <w:sz w:val="18"/>
+              </w:rPr>
+              <w:t>Bappadala Rohith Kumar Naidu</w:t>
+            </w:r>
+          </w:p>
+        </w:tc>
+      </w:tr>
+      <w:tr>
+        <w:tc>
+          <w:tcPr>
+            <w:tcW w:type="dxa" w:w="2160"/>
+          </w:tcPr>
+          <w:p>
+            <w:r>
+              <w:rPr>
+                <w:sz w:val="18"/>
+              </w:rPr>
+              <w:t>7da1591</w:t>
+            </w:r>
+          </w:p>
+        </w:tc>
+        <w:tc>
+          <w:tcPr>
+            <w:tcW w:type="dxa" w:w="2160"/>
+          </w:tcPr>
+          <w:p>
+            <w:r>
+              <w:rPr>
+                <w:sz w:val="18"/>
+              </w:rPr>
+              <w:t>2026-05-12</w:t>
+            </w:r>
+          </w:p>
+        </w:tc>
+        <w:tc>
+          <w:tcPr>
+            <w:tcW w:type="dxa" w:w="2160"/>
+          </w:tcPr>
+          <w:p>
+            <w:r>
+              <w:rPr>
+                <w:sz w:val="18"/>
+              </w:rPr>
+              <w:t>docs(wiki): auto-sync wiki documentation [automated]</w:t>
+            </w:r>
+          </w:p>
+        </w:tc>
+        <w:tc>
+          <w:tcPr>
+            <w:tcW w:type="dxa" w:w="2160"/>
+          </w:tcPr>
+          <w:p>
+            <w:r>
+              <w:rPr>
+                <w:sz w:val="18"/>
+              </w:rPr>
+              <w:t>rohitkumarnaidu</w:t>
+            </w:r>
+          </w:p>
+        </w:tc>
+      </w:tr>
+      <w:tr>
+        <w:tc>
+          <w:tcPr>
+            <w:tcW w:type="dxa" w:w="2160"/>
+          </w:tcPr>
+          <w:p>
+            <w:r>
+              <w:rPr>
+                <w:sz w:val="18"/>
+              </w:rPr>
+              <w:t>cb8a6a3</w:t>
+            </w:r>
+          </w:p>
+        </w:tc>
+        <w:tc>
+          <w:tcPr>
+            <w:tcW w:type="dxa" w:w="2160"/>
+          </w:tcPr>
+          <w:p>
+            <w:r>
+              <w:rPr>
+                <w:sz w:val="18"/>
+              </w:rPr>
+              <w:t>2026-05-12</w:t>
+            </w:r>
+          </w:p>
+        </w:tc>
+        <w:tc>
+          <w:tcPr>
+            <w:tcW w:type="dxa" w:w="2160"/>
+          </w:tcPr>
+          <w:p>
+            <w:r>
+              <w:rPr>
+                <w:sz w:val="18"/>
+              </w:rPr>
+              <w:t>Merge pull request #9 from SafeVixAI/docs-auto-update</w:t>
+            </w:r>
+          </w:p>
+        </w:tc>
+        <w:tc>
+          <w:tcPr>
+            <w:tcW w:type="dxa" w:w="2160"/>
+          </w:tcPr>
+          <w:p>
+            <w:r>
+              <w:rPr>
+                <w:sz w:val="18"/>
+              </w:rPr>
+              <w:t>Bappadala Rohith Kumar Naidu</w:t>
+            </w:r>
+          </w:p>
+        </w:tc>
+      </w:tr>
+      <w:tr>
+        <w:tc>
+          <w:tcPr>
+            <w:tcW w:type="dxa" w:w="2160"/>
+          </w:tcPr>
+          <w:p>
+            <w:r>
+              <w:rPr>
+                <w:sz w:val="18"/>
+              </w:rPr>
+              <w:t>d2474fb</w:t>
+            </w:r>
+          </w:p>
+        </w:tc>
+        <w:tc>
+          <w:tcPr>
+            <w:tcW w:type="dxa" w:w="2160"/>
+          </w:tcPr>
+          <w:p>
+            <w:r>
+              <w:rPr>
+                <w:sz w:val="18"/>
+              </w:rPr>
+              <w:t>2026-05-12</w:t>
+            </w:r>
+          </w:p>
+        </w:tc>
+        <w:tc>
+          <w:tcPr>
+            <w:tcW w:type="dxa" w:w="2160"/>
+          </w:tcPr>
+          <w:p>
+            <w:r>
+              <w:rPr>
+                <w:sz w:val="18"/>
+              </w:rPr>
+              <w:t>docs: auto-update master doc</w:t>
+            </w:r>
+          </w:p>
+        </w:tc>
+        <w:tc>
+          <w:tcPr>
+            <w:tcW w:type="dxa" w:w="2160"/>
+          </w:tcPr>
+          <w:p>
+            <w:r>
+              <w:rPr>
+                <w:sz w:val="18"/>
+              </w:rPr>
+              <w:t>rohitkumarnaidu</w:t>
             </w:r>
           </w:p>
         </w:tc>
@@ -35093,222 +35309,6 @@
                 <w:sz w:val="18"/>
               </w:rPr>
               <w:t>Merge pull request #7 from SafeVixAI/docs-auto-update</w:t>
-            </w:r>
-          </w:p>
-        </w:tc>
-        <w:tc>
-          <w:tcPr>
-            <w:tcW w:type="dxa" w:w="2160"/>
-          </w:tcPr>
-          <w:p>
-            <w:r>
-              <w:rPr>
-                <w:sz w:val="18"/>
-              </w:rPr>
-              <w:t>Bappadala Rohith Kumar Naidu</w:t>
-            </w:r>
-          </w:p>
-        </w:tc>
-      </w:tr>
-      <w:tr>
-        <w:tc>
-          <w:tcPr>
-            <w:tcW w:type="dxa" w:w="2160"/>
-          </w:tcPr>
-          <w:p>
-            <w:r>
-              <w:rPr>
-                <w:sz w:val="18"/>
-              </w:rPr>
-              <w:t>9a2813b</w:t>
-            </w:r>
-          </w:p>
-        </w:tc>
-        <w:tc>
-          <w:tcPr>
-            <w:tcW w:type="dxa" w:w="2160"/>
-          </w:tcPr>
-          <w:p>
-            <w:r>
-              <w:rPr>
-                <w:sz w:val="18"/>
-              </w:rPr>
-              <w:t>2026-05-11</w:t>
-            </w:r>
-          </w:p>
-        </w:tc>
-        <w:tc>
-          <w:tcPr>
-            <w:tcW w:type="dxa" w:w="2160"/>
-          </w:tcPr>
-          <w:p>
-            <w:r>
-              <w:rPr>
-                <w:sz w:val="18"/>
-              </w:rPr>
-              <w:t>docs: auto-update master doc</w:t>
-            </w:r>
-          </w:p>
-        </w:tc>
-        <w:tc>
-          <w:tcPr>
-            <w:tcW w:type="dxa" w:w="2160"/>
-          </w:tcPr>
-          <w:p>
-            <w:r>
-              <w:rPr>
-                <w:sz w:val="18"/>
-              </w:rPr>
-              <w:t>rohitkumarnaidu</w:t>
-            </w:r>
-          </w:p>
-        </w:tc>
-      </w:tr>
-      <w:tr>
-        <w:tc>
-          <w:tcPr>
-            <w:tcW w:type="dxa" w:w="2160"/>
-          </w:tcPr>
-          <w:p>
-            <w:r>
-              <w:rPr>
-                <w:sz w:val="18"/>
-              </w:rPr>
-              <w:t>3621b34</w:t>
-            </w:r>
-          </w:p>
-        </w:tc>
-        <w:tc>
-          <w:tcPr>
-            <w:tcW w:type="dxa" w:w="2160"/>
-          </w:tcPr>
-          <w:p>
-            <w:r>
-              <w:rPr>
-                <w:sz w:val="18"/>
-              </w:rPr>
-              <w:t>2026-05-11</w:t>
-            </w:r>
-          </w:p>
-        </w:tc>
-        <w:tc>
-          <w:tcPr>
-            <w:tcW w:type="dxa" w:w="2160"/>
-          </w:tcPr>
-          <w:p>
-            <w:r>
-              <w:rPr>
-                <w:sz w:val="18"/>
-              </w:rPr>
-              <w:t>docs: remove emojis for professional hackathon format</w:t>
-            </w:r>
-          </w:p>
-        </w:tc>
-        <w:tc>
-          <w:tcPr>
-            <w:tcW w:type="dxa" w:w="2160"/>
-          </w:tcPr>
-          <w:p>
-            <w:r>
-              <w:rPr>
-                <w:sz w:val="18"/>
-              </w:rPr>
-              <w:t>Bappadala Rohith Kumar Naidu</w:t>
-            </w:r>
-          </w:p>
-        </w:tc>
-      </w:tr>
-      <w:tr>
-        <w:tc>
-          <w:tcPr>
-            <w:tcW w:type="dxa" w:w="2160"/>
-          </w:tcPr>
-          <w:p>
-            <w:r>
-              <w:rPr>
-                <w:sz w:val="18"/>
-              </w:rPr>
-              <w:t>bee3ec2</w:t>
-            </w:r>
-          </w:p>
-        </w:tc>
-        <w:tc>
-          <w:tcPr>
-            <w:tcW w:type="dxa" w:w="2160"/>
-          </w:tcPr>
-          <w:p>
-            <w:r>
-              <w:rPr>
-                <w:sz w:val="18"/>
-              </w:rPr>
-              <w:t>2026-05-11</w:t>
-            </w:r>
-          </w:p>
-        </w:tc>
-        <w:tc>
-          <w:tcPr>
-            <w:tcW w:type="dxa" w:w="2160"/>
-          </w:tcPr>
-          <w:p>
-            <w:r>
-              <w:rPr>
-                <w:sz w:val="18"/>
-              </w:rPr>
-              <w:t>ci: fix add-paths syntax in sync-wiki workflow</w:t>
-            </w:r>
-          </w:p>
-        </w:tc>
-        <w:tc>
-          <w:tcPr>
-            <w:tcW w:type="dxa" w:w="2160"/>
-          </w:tcPr>
-          <w:p>
-            <w:r>
-              <w:rPr>
-                <w:sz w:val="18"/>
-              </w:rPr>
-              <w:t>Bappadala Rohith Kumar Naidu</w:t>
-            </w:r>
-          </w:p>
-        </w:tc>
-      </w:tr>
-      <w:tr>
-        <w:tc>
-          <w:tcPr>
-            <w:tcW w:type="dxa" w:w="2160"/>
-          </w:tcPr>
-          <w:p>
-            <w:r>
-              <w:rPr>
-                <w:sz w:val="18"/>
-              </w:rPr>
-              <w:t>901fce7</w:t>
-            </w:r>
-          </w:p>
-        </w:tc>
-        <w:tc>
-          <w:tcPr>
-            <w:tcW w:type="dxa" w:w="2160"/>
-          </w:tcPr>
-          <w:p>
-            <w:r>
-              <w:rPr>
-                <w:sz w:val="18"/>
-              </w:rPr>
-              <w:t>2026-05-11</w:t>
-            </w:r>
-          </w:p>
-        </w:tc>
-        <w:tc>
-          <w:tcPr>
-            <w:tcW w:type="dxa" w:w="2160"/>
-          </w:tcPr>
-          <w:p>
-            <w:r>
-              <w:rPr>
-                <w:sz w:val="18"/>
-              </w:rPr>
-              <w:t>feat(docs): add missing frontend component wiki docs and update chatbot router</w:t>
             </w:r>
           </w:p>
         </w:tc>
@@ -36173,7 +36173,7 @@
               <w:rPr>
                 <w:sz w:val="18"/>
               </w:rPr>
-              <w:t>239</w:t>
+              <w:t>243</w:t>
             </w:r>
           </w:p>
         </w:tc>
@@ -36307,7 +36307,7 @@
         <w:br/>
         <w:t>Generated by scripts/update_master_doc.py</w:t>
         <w:br/>
-        <w:t>Timestamp: 2026-05-12 22:47 IST</w:t>
+        <w:t>Timestamp: 2026-05-12 23:05 IST</w:t>
         <w:br/>
         <w:t>Repository: github.com/SafeVixAI/SafeVixAI</w:t>
       </w:r>

</xml_diff>

<commit_message>
Deployed 23a4118 with MkDocs version: 1.6.1
</commit_message>
<xml_diff>
--- a/SafeVixAI_MASTER.docx
+++ b/SafeVixAI_MASTER.docx
@@ -33723,7 +33723,7 @@
           <w:i w:val="0"/>
           <w:sz w:val="22"/>
         </w:rPr>
-        <w:t>🕐 Last auto-updated: 2026-05-12 23:05 IST</w:t>
+        <w:t>🕐 Last auto-updated: 2026-05-12 23:07 IST</w:t>
       </w:r>
     </w:p>
     <w:p>
@@ -34060,7 +34060,7 @@
               <w:rPr>
                 <w:sz w:val="18"/>
               </w:rPr>
-              <w:t>1048ms | HTTP 404 | v?</w:t>
+              <w:t>189ms | HTTP 404 | v?</w:t>
             </w:r>
           </w:p>
         </w:tc>
@@ -34101,7 +34101,7 @@
               <w:rPr>
                 <w:sz w:val="18"/>
               </w:rPr>
-              <w:t>687ms | HTTP 404 | v?</w:t>
+              <w:t>171ms | HTTP 404 | v?</w:t>
             </w:r>
           </w:p>
         </w:tc>
@@ -34142,7 +34142,7 @@
               <w:rPr>
                 <w:sz w:val="18"/>
               </w:rPr>
-              <w:t>762ms | HTTP 200 | v?</w:t>
+              <w:t>138ms | HTTP 200 | v?</w:t>
             </w:r>
           </w:p>
         </w:tc>
@@ -34236,6 +34236,330 @@
                 <w:sz w:val="18"/>
               </w:rPr>
               <w:t>Date</w:t>
+            </w:r>
+          </w:p>
+        </w:tc>
+      </w:tr>
+      <w:tr>
+        <w:tc>
+          <w:tcPr>
+            <w:tcW w:type="dxa" w:w="2160"/>
+          </w:tcPr>
+          <w:p>
+            <w:r>
+              <w:rPr>
+                <w:sz w:val="18"/>
+              </w:rPr>
+              <w:t>⏳ Wiki Documentation Sync</w:t>
+            </w:r>
+          </w:p>
+        </w:tc>
+        <w:tc>
+          <w:tcPr>
+            <w:tcW w:type="dxa" w:w="2160"/>
+          </w:tcPr>
+          <w:p>
+            <w:r>
+              <w:rPr>
+                <w:sz w:val="18"/>
+              </w:rPr>
+              <w:t>main</w:t>
+            </w:r>
+          </w:p>
+        </w:tc>
+        <w:tc>
+          <w:tcPr>
+            <w:tcW w:type="dxa" w:w="2160"/>
+          </w:tcPr>
+          <w:p>
+            <w:r>
+              <w:rPr>
+                <w:sz w:val="18"/>
+              </w:rPr>
+              <w:t>in_progress</w:t>
+            </w:r>
+          </w:p>
+        </w:tc>
+        <w:tc>
+          <w:tcPr>
+            <w:tcW w:type="dxa" w:w="2160"/>
+          </w:tcPr>
+          <w:p>
+            <w:r>
+              <w:rPr>
+                <w:sz w:val="18"/>
+              </w:rPr>
+              <w:t>2026-05-12</w:t>
+            </w:r>
+          </w:p>
+        </w:tc>
+      </w:tr>
+      <w:tr>
+        <w:tc>
+          <w:tcPr>
+            <w:tcW w:type="dxa" w:w="2160"/>
+          </w:tcPr>
+          <w:p>
+            <w:r>
+              <w:rPr>
+                <w:sz w:val="18"/>
+              </w:rPr>
+              <w:t>⏳ Deploy Enterprise Docs</w:t>
+            </w:r>
+          </w:p>
+        </w:tc>
+        <w:tc>
+          <w:tcPr>
+            <w:tcW w:type="dxa" w:w="2160"/>
+          </w:tcPr>
+          <w:p>
+            <w:r>
+              <w:rPr>
+                <w:sz w:val="18"/>
+              </w:rPr>
+              <w:t>main</w:t>
+            </w:r>
+          </w:p>
+        </w:tc>
+        <w:tc>
+          <w:tcPr>
+            <w:tcW w:type="dxa" w:w="2160"/>
+          </w:tcPr>
+          <w:p>
+            <w:r>
+              <w:rPr>
+                <w:sz w:val="18"/>
+              </w:rPr>
+              <w:t>in_progress</w:t>
+            </w:r>
+          </w:p>
+        </w:tc>
+        <w:tc>
+          <w:tcPr>
+            <w:tcW w:type="dxa" w:w="2160"/>
+          </w:tcPr>
+          <w:p>
+            <w:r>
+              <w:rPr>
+                <w:sz w:val="18"/>
+              </w:rPr>
+              <w:t>2026-05-12</w:t>
+            </w:r>
+          </w:p>
+        </w:tc>
+      </w:tr>
+      <w:tr>
+        <w:tc>
+          <w:tcPr>
+            <w:tcW w:type="dxa" w:w="2160"/>
+          </w:tcPr>
+          <w:p>
+            <w:r>
+              <w:rPr>
+                <w:sz w:val="18"/>
+              </w:rPr>
+              <w:t>⏳ Security &amp; SAST Audit</w:t>
+            </w:r>
+          </w:p>
+        </w:tc>
+        <w:tc>
+          <w:tcPr>
+            <w:tcW w:type="dxa" w:w="2160"/>
+          </w:tcPr>
+          <w:p>
+            <w:r>
+              <w:rPr>
+                <w:sz w:val="18"/>
+              </w:rPr>
+              <w:t>main</w:t>
+            </w:r>
+          </w:p>
+        </w:tc>
+        <w:tc>
+          <w:tcPr>
+            <w:tcW w:type="dxa" w:w="2160"/>
+          </w:tcPr>
+          <w:p>
+            <w:r>
+              <w:rPr>
+                <w:sz w:val="18"/>
+              </w:rPr>
+              <w:t>in_progress</w:t>
+            </w:r>
+          </w:p>
+        </w:tc>
+        <w:tc>
+          <w:tcPr>
+            <w:tcW w:type="dxa" w:w="2160"/>
+          </w:tcPr>
+          <w:p>
+            <w:r>
+              <w:rPr>
+                <w:sz w:val="18"/>
+              </w:rPr>
+              <w:t>2026-05-12</w:t>
+            </w:r>
+          </w:p>
+        </w:tc>
+      </w:tr>
+      <w:tr>
+        <w:tc>
+          <w:tcPr>
+            <w:tcW w:type="dxa" w:w="2160"/>
+          </w:tcPr>
+          <w:p>
+            <w:r>
+              <w:rPr>
+                <w:sz w:val="18"/>
+              </w:rPr>
+              <w:t>⏳ Update Master Document</w:t>
+            </w:r>
+          </w:p>
+        </w:tc>
+        <w:tc>
+          <w:tcPr>
+            <w:tcW w:type="dxa" w:w="2160"/>
+          </w:tcPr>
+          <w:p>
+            <w:r>
+              <w:rPr>
+                <w:sz w:val="18"/>
+              </w:rPr>
+              <w:t>main</w:t>
+            </w:r>
+          </w:p>
+        </w:tc>
+        <w:tc>
+          <w:tcPr>
+            <w:tcW w:type="dxa" w:w="2160"/>
+          </w:tcPr>
+          <w:p>
+            <w:r>
+              <w:rPr>
+                <w:sz w:val="18"/>
+              </w:rPr>
+              <w:t>in_progress</w:t>
+            </w:r>
+          </w:p>
+        </w:tc>
+        <w:tc>
+          <w:tcPr>
+            <w:tcW w:type="dxa" w:w="2160"/>
+          </w:tcPr>
+          <w:p>
+            <w:r>
+              <w:rPr>
+                <w:sz w:val="18"/>
+              </w:rPr>
+              <w:t>2026-05-12</w:t>
+            </w:r>
+          </w:p>
+        </w:tc>
+      </w:tr>
+      <w:tr>
+        <w:tc>
+          <w:tcPr>
+            <w:tcW w:type="dxa" w:w="2160"/>
+          </w:tcPr>
+          <w:p>
+            <w:r>
+              <w:rPr>
+                <w:sz w:val="18"/>
+              </w:rPr>
+              <w:t>⏳ Push on main</w:t>
+            </w:r>
+          </w:p>
+        </w:tc>
+        <w:tc>
+          <w:tcPr>
+            <w:tcW w:type="dxa" w:w="2160"/>
+          </w:tcPr>
+          <w:p>
+            <w:r>
+              <w:rPr>
+                <w:sz w:val="18"/>
+              </w:rPr>
+              <w:t>main</w:t>
+            </w:r>
+          </w:p>
+        </w:tc>
+        <w:tc>
+          <w:tcPr>
+            <w:tcW w:type="dxa" w:w="2160"/>
+          </w:tcPr>
+          <w:p>
+            <w:r>
+              <w:rPr>
+                <w:sz w:val="18"/>
+              </w:rPr>
+              <w:t>in_progress</w:t>
+            </w:r>
+          </w:p>
+        </w:tc>
+        <w:tc>
+          <w:tcPr>
+            <w:tcW w:type="dxa" w:w="2160"/>
+          </w:tcPr>
+          <w:p>
+            <w:r>
+              <w:rPr>
+                <w:sz w:val="18"/>
+              </w:rPr>
+              <w:t>2026-05-12</w:t>
+            </w:r>
+          </w:p>
+        </w:tc>
+      </w:tr>
+      <w:tr>
+        <w:tc>
+          <w:tcPr>
+            <w:tcW w:type="dxa" w:w="2160"/>
+          </w:tcPr>
+          <w:p>
+            <w:r>
+              <w:rPr>
+                <w:sz w:val="18"/>
+              </w:rPr>
+              <w:t>⏳ Code Quality: Push on main</w:t>
+            </w:r>
+          </w:p>
+        </w:tc>
+        <w:tc>
+          <w:tcPr>
+            <w:tcW w:type="dxa" w:w="2160"/>
+          </w:tcPr>
+          <w:p>
+            <w:r>
+              <w:rPr>
+                <w:sz w:val="18"/>
+              </w:rPr>
+              <w:t>main</w:t>
+            </w:r>
+          </w:p>
+        </w:tc>
+        <w:tc>
+          <w:tcPr>
+            <w:tcW w:type="dxa" w:w="2160"/>
+          </w:tcPr>
+          <w:p>
+            <w:r>
+              <w:rPr>
+                <w:sz w:val="18"/>
+              </w:rPr>
+              <w:t>in_progress</w:t>
+            </w:r>
+          </w:p>
+        </w:tc>
+        <w:tc>
+          <w:tcPr>
+            <w:tcW w:type="dxa" w:w="2160"/>
+          </w:tcPr>
+          <w:p>
+            <w:r>
+              <w:rPr>
+                <w:sz w:val="18"/>
+              </w:rPr>
+              <w:t>2026-05-12</w:t>
             </w:r>
           </w:p>
         </w:tc>
@@ -34348,330 +34672,6 @@
           </w:p>
         </w:tc>
       </w:tr>
-      <w:tr>
-        <w:tc>
-          <w:tcPr>
-            <w:tcW w:type="dxa" w:w="2160"/>
-          </w:tcPr>
-          <w:p>
-            <w:r>
-              <w:rPr>
-                <w:sz w:val="18"/>
-              </w:rPr>
-              <w:t>✅ PR #11</w:t>
-            </w:r>
-          </w:p>
-        </w:tc>
-        <w:tc>
-          <w:tcPr>
-            <w:tcW w:type="dxa" w:w="2160"/>
-          </w:tcPr>
-          <w:p>
-            <w:r>
-              <w:rPr>
-                <w:sz w:val="18"/>
-              </w:rPr>
-              <w:t>refs/pull/11/head</w:t>
-            </w:r>
-          </w:p>
-        </w:tc>
-        <w:tc>
-          <w:tcPr>
-            <w:tcW w:type="dxa" w:w="2160"/>
-          </w:tcPr>
-          <w:p>
-            <w:r>
-              <w:rPr>
-                <w:sz w:val="18"/>
-              </w:rPr>
-              <w:t>success</w:t>
-            </w:r>
-          </w:p>
-        </w:tc>
-        <w:tc>
-          <w:tcPr>
-            <w:tcW w:type="dxa" w:w="2160"/>
-          </w:tcPr>
-          <w:p>
-            <w:r>
-              <w:rPr>
-                <w:sz w:val="18"/>
-              </w:rPr>
-              <w:t>2026-05-12</w:t>
-            </w:r>
-          </w:p>
-        </w:tc>
-      </w:tr>
-      <w:tr>
-        <w:tc>
-          <w:tcPr>
-            <w:tcW w:type="dxa" w:w="2160"/>
-          </w:tcPr>
-          <w:p>
-            <w:r>
-              <w:rPr>
-                <w:sz w:val="18"/>
-              </w:rPr>
-              <w:t>✅ Deploy Enterprise Docs</w:t>
-            </w:r>
-          </w:p>
-        </w:tc>
-        <w:tc>
-          <w:tcPr>
-            <w:tcW w:type="dxa" w:w="2160"/>
-          </w:tcPr>
-          <w:p>
-            <w:r>
-              <w:rPr>
-                <w:sz w:val="18"/>
-              </w:rPr>
-              <w:t>main</w:t>
-            </w:r>
-          </w:p>
-        </w:tc>
-        <w:tc>
-          <w:tcPr>
-            <w:tcW w:type="dxa" w:w="2160"/>
-          </w:tcPr>
-          <w:p>
-            <w:r>
-              <w:rPr>
-                <w:sz w:val="18"/>
-              </w:rPr>
-              <w:t>success</w:t>
-            </w:r>
-          </w:p>
-        </w:tc>
-        <w:tc>
-          <w:tcPr>
-            <w:tcW w:type="dxa" w:w="2160"/>
-          </w:tcPr>
-          <w:p>
-            <w:r>
-              <w:rPr>
-                <w:sz w:val="18"/>
-              </w:rPr>
-              <w:t>2026-05-12</w:t>
-            </w:r>
-          </w:p>
-        </w:tc>
-      </w:tr>
-      <w:tr>
-        <w:tc>
-          <w:tcPr>
-            <w:tcW w:type="dxa" w:w="2160"/>
-          </w:tcPr>
-          <w:p>
-            <w:r>
-              <w:rPr>
-                <w:sz w:val="18"/>
-              </w:rPr>
-              <w:t>✅ Wiki Documentation Sync</w:t>
-            </w:r>
-          </w:p>
-        </w:tc>
-        <w:tc>
-          <w:tcPr>
-            <w:tcW w:type="dxa" w:w="2160"/>
-          </w:tcPr>
-          <w:p>
-            <w:r>
-              <w:rPr>
-                <w:sz w:val="18"/>
-              </w:rPr>
-              <w:t>main</w:t>
-            </w:r>
-          </w:p>
-        </w:tc>
-        <w:tc>
-          <w:tcPr>
-            <w:tcW w:type="dxa" w:w="2160"/>
-          </w:tcPr>
-          <w:p>
-            <w:r>
-              <w:rPr>
-                <w:sz w:val="18"/>
-              </w:rPr>
-              <w:t>success</w:t>
-            </w:r>
-          </w:p>
-        </w:tc>
-        <w:tc>
-          <w:tcPr>
-            <w:tcW w:type="dxa" w:w="2160"/>
-          </w:tcPr>
-          <w:p>
-            <w:r>
-              <w:rPr>
-                <w:sz w:val="18"/>
-              </w:rPr>
-              <w:t>2026-05-12</w:t>
-            </w:r>
-          </w:p>
-        </w:tc>
-      </w:tr>
-      <w:tr>
-        <w:tc>
-          <w:tcPr>
-            <w:tcW w:type="dxa" w:w="2160"/>
-          </w:tcPr>
-          <w:p>
-            <w:r>
-              <w:rPr>
-                <w:sz w:val="18"/>
-              </w:rPr>
-              <w:t>✅ Security &amp; SAST Audit</w:t>
-            </w:r>
-          </w:p>
-        </w:tc>
-        <w:tc>
-          <w:tcPr>
-            <w:tcW w:type="dxa" w:w="2160"/>
-          </w:tcPr>
-          <w:p>
-            <w:r>
-              <w:rPr>
-                <w:sz w:val="18"/>
-              </w:rPr>
-              <w:t>main</w:t>
-            </w:r>
-          </w:p>
-        </w:tc>
-        <w:tc>
-          <w:tcPr>
-            <w:tcW w:type="dxa" w:w="2160"/>
-          </w:tcPr>
-          <w:p>
-            <w:r>
-              <w:rPr>
-                <w:sz w:val="18"/>
-              </w:rPr>
-              <w:t>success</w:t>
-            </w:r>
-          </w:p>
-        </w:tc>
-        <w:tc>
-          <w:tcPr>
-            <w:tcW w:type="dxa" w:w="2160"/>
-          </w:tcPr>
-          <w:p>
-            <w:r>
-              <w:rPr>
-                <w:sz w:val="18"/>
-              </w:rPr>
-              <w:t>2026-05-12</w:t>
-            </w:r>
-          </w:p>
-        </w:tc>
-      </w:tr>
-      <w:tr>
-        <w:tc>
-          <w:tcPr>
-            <w:tcW w:type="dxa" w:w="2160"/>
-          </w:tcPr>
-          <w:p>
-            <w:r>
-              <w:rPr>
-                <w:sz w:val="18"/>
-              </w:rPr>
-              <w:t>✅ Update Master Document</w:t>
-            </w:r>
-          </w:p>
-        </w:tc>
-        <w:tc>
-          <w:tcPr>
-            <w:tcW w:type="dxa" w:w="2160"/>
-          </w:tcPr>
-          <w:p>
-            <w:r>
-              <w:rPr>
-                <w:sz w:val="18"/>
-              </w:rPr>
-              <w:t>main</w:t>
-            </w:r>
-          </w:p>
-        </w:tc>
-        <w:tc>
-          <w:tcPr>
-            <w:tcW w:type="dxa" w:w="2160"/>
-          </w:tcPr>
-          <w:p>
-            <w:r>
-              <w:rPr>
-                <w:sz w:val="18"/>
-              </w:rPr>
-              <w:t>success</w:t>
-            </w:r>
-          </w:p>
-        </w:tc>
-        <w:tc>
-          <w:tcPr>
-            <w:tcW w:type="dxa" w:w="2160"/>
-          </w:tcPr>
-          <w:p>
-            <w:r>
-              <w:rPr>
-                <w:sz w:val="18"/>
-              </w:rPr>
-              <w:t>2026-05-12</w:t>
-            </w:r>
-          </w:p>
-        </w:tc>
-      </w:tr>
-      <w:tr>
-        <w:tc>
-          <w:tcPr>
-            <w:tcW w:type="dxa" w:w="2160"/>
-          </w:tcPr>
-          <w:p>
-            <w:r>
-              <w:rPr>
-                <w:sz w:val="18"/>
-              </w:rPr>
-              <w:t>✅ Push on main</w:t>
-            </w:r>
-          </w:p>
-        </w:tc>
-        <w:tc>
-          <w:tcPr>
-            <w:tcW w:type="dxa" w:w="2160"/>
-          </w:tcPr>
-          <w:p>
-            <w:r>
-              <w:rPr>
-                <w:sz w:val="18"/>
-              </w:rPr>
-              <w:t>main</w:t>
-            </w:r>
-          </w:p>
-        </w:tc>
-        <w:tc>
-          <w:tcPr>
-            <w:tcW w:type="dxa" w:w="2160"/>
-          </w:tcPr>
-          <w:p>
-            <w:r>
-              <w:rPr>
-                <w:sz w:val="18"/>
-              </w:rPr>
-              <w:t>success</w:t>
-            </w:r>
-          </w:p>
-        </w:tc>
-        <w:tc>
-          <w:tcPr>
-            <w:tcW w:type="dxa" w:w="2160"/>
-          </w:tcPr>
-          <w:p>
-            <w:r>
-              <w:rPr>
-                <w:sz w:val="18"/>
-              </w:rPr>
-              <w:t>2026-05-12</w:t>
-            </w:r>
-          </w:p>
-        </w:tc>
-      </w:tr>
     </w:tbl>
     <w:p>
       <w:pPr>
@@ -34782,6 +34782,60 @@
                 <w:sz w:val="18"/>
               </w:rPr>
               <w:t>Author</w:t>
+            </w:r>
+          </w:p>
+        </w:tc>
+      </w:tr>
+      <w:tr>
+        <w:tc>
+          <w:tcPr>
+            <w:tcW w:type="dxa" w:w="2160"/>
+          </w:tcPr>
+          <w:p>
+            <w:r>
+              <w:rPr>
+                <w:sz w:val="18"/>
+              </w:rPr>
+              <w:t>a1b646b</w:t>
+            </w:r>
+          </w:p>
+        </w:tc>
+        <w:tc>
+          <w:tcPr>
+            <w:tcW w:type="dxa" w:w="2160"/>
+          </w:tcPr>
+          <w:p>
+            <w:r>
+              <w:rPr>
+                <w:sz w:val="18"/>
+              </w:rPr>
+              <w:t>2026-05-12</w:t>
+            </w:r>
+          </w:p>
+        </w:tc>
+        <w:tc>
+          <w:tcPr>
+            <w:tcW w:type="dxa" w:w="2160"/>
+          </w:tcPr>
+          <w:p>
+            <w:r>
+              <w:rPr>
+                <w:sz w:val="18"/>
+              </w:rPr>
+              <w:t>feat: unify email alerting for wiki documentation generation and deployment ping</w:t>
+            </w:r>
+          </w:p>
+        </w:tc>
+        <w:tc>
+          <w:tcPr>
+            <w:tcW w:type="dxa" w:w="2160"/>
+          </w:tcPr>
+          <w:p>
+            <w:r>
+              <w:rPr>
+                <w:sz w:val="18"/>
+              </w:rPr>
+              <w:t>Bappadala Rohith Kumar Naidu</w:t>
             </w:r>
           </w:p>
         </w:tc>
@@ -35272,60 +35326,6 @@
           </w:p>
         </w:tc>
       </w:tr>
-      <w:tr>
-        <w:tc>
-          <w:tcPr>
-            <w:tcW w:type="dxa" w:w="2160"/>
-          </w:tcPr>
-          <w:p>
-            <w:r>
-              <w:rPr>
-                <w:sz w:val="18"/>
-              </w:rPr>
-              <w:t>612952d</w:t>
-            </w:r>
-          </w:p>
-        </w:tc>
-        <w:tc>
-          <w:tcPr>
-            <w:tcW w:type="dxa" w:w="2160"/>
-          </w:tcPr>
-          <w:p>
-            <w:r>
-              <w:rPr>
-                <w:sz w:val="18"/>
-              </w:rPr>
-              <w:t>2026-05-11</w:t>
-            </w:r>
-          </w:p>
-        </w:tc>
-        <w:tc>
-          <w:tcPr>
-            <w:tcW w:type="dxa" w:w="2160"/>
-          </w:tcPr>
-          <w:p>
-            <w:r>
-              <w:rPr>
-                <w:sz w:val="18"/>
-              </w:rPr>
-              <w:t>Merge pull request #7 from SafeVixAI/docs-auto-update</w:t>
-            </w:r>
-          </w:p>
-        </w:tc>
-        <w:tc>
-          <w:tcPr>
-            <w:tcW w:type="dxa" w:w="2160"/>
-          </w:tcPr>
-          <w:p>
-            <w:r>
-              <w:rPr>
-                <w:sz w:val="18"/>
-              </w:rPr>
-              <w:t>Bappadala Rohith Kumar Naidu</w:t>
-            </w:r>
-          </w:p>
-        </w:tc>
-      </w:tr>
     </w:tbl>
     <w:p>
       <w:pPr>
@@ -36307,7 +36307,7 @@
         <w:br/>
         <w:t>Generated by scripts/update_master_doc.py</w:t>
         <w:br/>
-        <w:t>Timestamp: 2026-05-12 23:05 IST</w:t>
+        <w:t>Timestamp: 2026-05-12 23:07 IST</w:t>
         <w:br/>
         <w:t>Repository: github.com/SafeVixAI/SafeVixAI</w:t>
       </w:r>

</xml_diff>

<commit_message>
Deployed 5b1b041 with MkDocs version: 1.6.1
</commit_message>
<xml_diff>
--- a/SafeVixAI_MASTER.docx
+++ b/SafeVixAI_MASTER.docx
@@ -33723,7 +33723,7 @@
           <w:i w:val="0"/>
           <w:sz w:val="22"/>
         </w:rPr>
-        <w:t>🕐 Last auto-updated: 2026-05-12 23:07 IST</w:t>
+        <w:t>🕐 Last auto-updated: 2026-05-22 12:25 IST</w:t>
       </w:r>
     </w:p>
     <w:p>
@@ -33867,7 +33867,7 @@
               <w:rPr>
                 <w:sz w:val="18"/>
               </w:rPr>
-              <w:t>45 MB</w:t>
+              <w:t>49 MB</w:t>
             </w:r>
           </w:p>
         </w:tc>
@@ -33923,7 +33923,7 @@
               <w:rPr>
                 <w:sz w:val="18"/>
               </w:rPr>
-              <w:t>2026-05-12</w:t>
+              <w:t>2026-05-22</w:t>
             </w:r>
           </w:p>
         </w:tc>
@@ -34060,7 +34060,7 @@
               <w:rPr>
                 <w:sz w:val="18"/>
               </w:rPr>
-              <w:t>189ms | HTTP 404 | v?</w:t>
+              <w:t>293ms | HTTP 404 | v?</w:t>
             </w:r>
           </w:p>
         </w:tc>
@@ -34101,7 +34101,7 @@
               <w:rPr>
                 <w:sz w:val="18"/>
               </w:rPr>
-              <w:t>171ms | HTTP 404 | v?</w:t>
+              <w:t>214ms | HTTP 404 | v?</w:t>
             </w:r>
           </w:p>
         </w:tc>
@@ -34142,7 +34142,7 @@
               <w:rPr>
                 <w:sz w:val="18"/>
               </w:rPr>
-              <w:t>138ms | HTTP 200 | v?</w:t>
+              <w:t>100ms | HTTP 200 | v?</w:t>
             </w:r>
           </w:p>
         </w:tc>
@@ -34250,6 +34250,60 @@
               <w:rPr>
                 <w:sz w:val="18"/>
               </w:rPr>
+              <w:t>⏳ Update Master Document</w:t>
+            </w:r>
+          </w:p>
+        </w:tc>
+        <w:tc>
+          <w:tcPr>
+            <w:tcW w:type="dxa" w:w="2160"/>
+          </w:tcPr>
+          <w:p>
+            <w:r>
+              <w:rPr>
+                <w:sz w:val="18"/>
+              </w:rPr>
+              <w:t>main</w:t>
+            </w:r>
+          </w:p>
+        </w:tc>
+        <w:tc>
+          <w:tcPr>
+            <w:tcW w:type="dxa" w:w="2160"/>
+          </w:tcPr>
+          <w:p>
+            <w:r>
+              <w:rPr>
+                <w:sz w:val="18"/>
+              </w:rPr>
+              <w:t>in_progress</w:t>
+            </w:r>
+          </w:p>
+        </w:tc>
+        <w:tc>
+          <w:tcPr>
+            <w:tcW w:type="dxa" w:w="2160"/>
+          </w:tcPr>
+          <w:p>
+            <w:r>
+              <w:rPr>
+                <w:sz w:val="18"/>
+              </w:rPr>
+              <w:t>2026-05-22</w:t>
+            </w:r>
+          </w:p>
+        </w:tc>
+      </w:tr>
+      <w:tr>
+        <w:tc>
+          <w:tcPr>
+            <w:tcW w:type="dxa" w:w="2160"/>
+          </w:tcPr>
+          <w:p>
+            <w:r>
+              <w:rPr>
+                <w:sz w:val="18"/>
+              </w:rPr>
               <w:t>⏳ Wiki Documentation Sync</w:t>
             </w:r>
           </w:p>
@@ -34289,7 +34343,7 @@
               <w:rPr>
                 <w:sz w:val="18"/>
               </w:rPr>
-              <w:t>2026-05-12</w:t>
+              <w:t>2026-05-22</w:t>
             </w:r>
           </w:p>
         </w:tc>
@@ -34343,7 +34397,7 @@
               <w:rPr>
                 <w:sz w:val="18"/>
               </w:rPr>
-              <w:t>2026-05-12</w:t>
+              <w:t>2026-05-22</w:t>
             </w:r>
           </w:p>
         </w:tc>
@@ -34358,7 +34412,7 @@
               <w:rPr>
                 <w:sz w:val="18"/>
               </w:rPr>
-              <w:t>⏳ Security &amp; SAST Audit</w:t>
+              <w:t>🔴 .github/workflows/smoke-tests.yml</w:t>
             </w:r>
           </w:p>
         </w:tc>
@@ -34384,7 +34438,7 @@
               <w:rPr>
                 <w:sz w:val="18"/>
               </w:rPr>
-              <w:t>in_progress</w:t>
+              <w:t>failure</w:t>
             </w:r>
           </w:p>
         </w:tc>
@@ -34397,61 +34451,7 @@
               <w:rPr>
                 <w:sz w:val="18"/>
               </w:rPr>
-              <w:t>2026-05-12</w:t>
-            </w:r>
-          </w:p>
-        </w:tc>
-      </w:tr>
-      <w:tr>
-        <w:tc>
-          <w:tcPr>
-            <w:tcW w:type="dxa" w:w="2160"/>
-          </w:tcPr>
-          <w:p>
-            <w:r>
-              <w:rPr>
-                <w:sz w:val="18"/>
-              </w:rPr>
-              <w:t>⏳ Update Master Document</w:t>
-            </w:r>
-          </w:p>
-        </w:tc>
-        <w:tc>
-          <w:tcPr>
-            <w:tcW w:type="dxa" w:w="2160"/>
-          </w:tcPr>
-          <w:p>
-            <w:r>
-              <w:rPr>
-                <w:sz w:val="18"/>
-              </w:rPr>
-              <w:t>main</w:t>
-            </w:r>
-          </w:p>
-        </w:tc>
-        <w:tc>
-          <w:tcPr>
-            <w:tcW w:type="dxa" w:w="2160"/>
-          </w:tcPr>
-          <w:p>
-            <w:r>
-              <w:rPr>
-                <w:sz w:val="18"/>
-              </w:rPr>
-              <w:t>in_progress</w:t>
-            </w:r>
-          </w:p>
-        </w:tc>
-        <w:tc>
-          <w:tcPr>
-            <w:tcW w:type="dxa" w:w="2160"/>
-          </w:tcPr>
-          <w:p>
-            <w:r>
-              <w:rPr>
-                <w:sz w:val="18"/>
-              </w:rPr>
-              <w:t>2026-05-12</w:t>
+              <w:t>2026-05-22</w:t>
             </w:r>
           </w:p>
         </w:tc>
@@ -34505,7 +34505,7 @@
               <w:rPr>
                 <w:sz w:val="18"/>
               </w:rPr>
-              <w:t>2026-05-12</w:t>
+              <w:t>2026-05-22</w:t>
             </w:r>
           </w:p>
         </w:tc>
@@ -34559,7 +34559,7 @@
               <w:rPr>
                 <w:sz w:val="18"/>
               </w:rPr>
-              <w:t>2026-05-12</w:t>
+              <w:t>2026-05-22</w:t>
             </w:r>
           </w:p>
         </w:tc>
@@ -34574,7 +34574,7 @@
               <w:rPr>
                 <w:sz w:val="18"/>
               </w:rPr>
-              <w:t>✅ pages build and deployment</w:t>
+              <w:t>🔴 Frontend CI</w:t>
             </w:r>
           </w:p>
         </w:tc>
@@ -34587,7 +34587,61 @@
               <w:rPr>
                 <w:sz w:val="18"/>
               </w:rPr>
-              <w:t>gh-pages</w:t>
+              <w:t>dependabot/npm_and_yarn/frontend/frontend-dependencies-858b392ac1</w:t>
+            </w:r>
+          </w:p>
+        </w:tc>
+        <w:tc>
+          <w:tcPr>
+            <w:tcW w:type="dxa" w:w="2160"/>
+          </w:tcPr>
+          <w:p>
+            <w:r>
+              <w:rPr>
+                <w:sz w:val="18"/>
+              </w:rPr>
+              <w:t>failure</w:t>
+            </w:r>
+          </w:p>
+        </w:tc>
+        <w:tc>
+          <w:tcPr>
+            <w:tcW w:type="dxa" w:w="2160"/>
+          </w:tcPr>
+          <w:p>
+            <w:r>
+              <w:rPr>
+                <w:sz w:val="18"/>
+              </w:rPr>
+              <w:t>2026-05-22</w:t>
+            </w:r>
+          </w:p>
+        </w:tc>
+      </w:tr>
+      <w:tr>
+        <w:tc>
+          <w:tcPr>
+            <w:tcW w:type="dxa" w:w="2160"/>
+          </w:tcPr>
+          <w:p>
+            <w:r>
+              <w:rPr>
+                <w:sz w:val="18"/>
+              </w:rPr>
+              <w:t>✅ Render Deploy Readiness</w:t>
+            </w:r>
+          </w:p>
+        </w:tc>
+        <w:tc>
+          <w:tcPr>
+            <w:tcW w:type="dxa" w:w="2160"/>
+          </w:tcPr>
+          <w:p>
+            <w:r>
+              <w:rPr>
+                <w:sz w:val="18"/>
+              </w:rPr>
+              <w:t>dependabot/npm_and_yarn/frontend/frontend-dependencies-858b392ac1</w:t>
             </w:r>
           </w:p>
         </w:tc>
@@ -34613,61 +34667,7 @@
               <w:rPr>
                 <w:sz w:val="18"/>
               </w:rPr>
-              <w:t>2026-05-12</w:t>
-            </w:r>
-          </w:p>
-        </w:tc>
-      </w:tr>
-      <w:tr>
-        <w:tc>
-          <w:tcPr>
-            <w:tcW w:type="dxa" w:w="2160"/>
-          </w:tcPr>
-          <w:p>
-            <w:r>
-              <w:rPr>
-                <w:sz w:val="18"/>
-              </w:rPr>
-              <w:t>✅ Code Quality: PR #11</w:t>
-            </w:r>
-          </w:p>
-        </w:tc>
-        <w:tc>
-          <w:tcPr>
-            <w:tcW w:type="dxa" w:w="2160"/>
-          </w:tcPr>
-          <w:p>
-            <w:r>
-              <w:rPr>
-                <w:sz w:val="18"/>
-              </w:rPr>
-              <w:t>refs/pull/11/head</w:t>
-            </w:r>
-          </w:p>
-        </w:tc>
-        <w:tc>
-          <w:tcPr>
-            <w:tcW w:type="dxa" w:w="2160"/>
-          </w:tcPr>
-          <w:p>
-            <w:r>
-              <w:rPr>
-                <w:sz w:val="18"/>
-              </w:rPr>
-              <w:t>success</w:t>
-            </w:r>
-          </w:p>
-        </w:tc>
-        <w:tc>
-          <w:tcPr>
-            <w:tcW w:type="dxa" w:w="2160"/>
-          </w:tcPr>
-          <w:p>
-            <w:r>
-              <w:rPr>
-                <w:sz w:val="18"/>
-              </w:rPr>
-              <w:t>2026-05-12</w:t>
+              <w:t>2026-05-22</w:t>
             </w:r>
           </w:p>
         </w:tc>
@@ -34796,7 +34796,7 @@
               <w:rPr>
                 <w:sz w:val="18"/>
               </w:rPr>
-              <w:t>a1b646b</w:t>
+              <w:t>07d9e50</w:t>
             </w:r>
           </w:p>
         </w:tc>
@@ -34809,7 +34809,7 @@
               <w:rPr>
                 <w:sz w:val="18"/>
               </w:rPr>
-              <w:t>2026-05-12</w:t>
+              <w:t>2026-05-22</w:t>
             </w:r>
           </w:p>
         </w:tc>
@@ -34822,7 +34822,7 @@
               <w:rPr>
                 <w:sz w:val="18"/>
               </w:rPr>
-              <w:t>feat: unify email alerting for wiki documentation generation and deployment ping</w:t>
+              <w:t>Merge pull request #13 from SafeVixAI/docs-wiki-auto-update</w:t>
             </w:r>
           </w:p>
         </w:tc>
@@ -34850,7 +34850,7 @@
               <w:rPr>
                 <w:sz w:val="18"/>
               </w:rPr>
-              <w:t>a9bfcae</w:t>
+              <w:t>6f61bed</w:t>
             </w:r>
           </w:p>
         </w:tc>
@@ -34863,61 +34863,7 @@
               <w:rPr>
                 <w:sz w:val="18"/>
               </w:rPr>
-              <w:t>2026-05-12</w:t>
-            </w:r>
-          </w:p>
-        </w:tc>
-        <w:tc>
-          <w:tcPr>
-            <w:tcW w:type="dxa" w:w="2160"/>
-          </w:tcPr>
-          <w:p>
-            <w:r>
-              <w:rPr>
-                <w:sz w:val="18"/>
-              </w:rPr>
-              <w:t>Merge pull request #10 from SafeVixAI/docs-wiki-auto-update</w:t>
-            </w:r>
-          </w:p>
-        </w:tc>
-        <w:tc>
-          <w:tcPr>
-            <w:tcW w:type="dxa" w:w="2160"/>
-          </w:tcPr>
-          <w:p>
-            <w:r>
-              <w:rPr>
-                <w:sz w:val="18"/>
-              </w:rPr>
-              <w:t>Bappadala Rohith Kumar Naidu</w:t>
-            </w:r>
-          </w:p>
-        </w:tc>
-      </w:tr>
-      <w:tr>
-        <w:tc>
-          <w:tcPr>
-            <w:tcW w:type="dxa" w:w="2160"/>
-          </w:tcPr>
-          <w:p>
-            <w:r>
-              <w:rPr>
-                <w:sz w:val="18"/>
-              </w:rPr>
-              <w:t>7da1591</w:t>
-            </w:r>
-          </w:p>
-        </w:tc>
-        <w:tc>
-          <w:tcPr>
-            <w:tcW w:type="dxa" w:w="2160"/>
-          </w:tcPr>
-          <w:p>
-            <w:r>
-              <w:rPr>
-                <w:sz w:val="18"/>
-              </w:rPr>
-              <w:t>2026-05-12</w:t>
+              <w:t>2026-05-22</w:t>
             </w:r>
           </w:p>
         </w:tc>
@@ -34958,7 +34904,7 @@
               <w:rPr>
                 <w:sz w:val="18"/>
               </w:rPr>
-              <w:t>cb8a6a3</w:t>
+              <w:t>e47df81</w:t>
             </w:r>
           </w:p>
         </w:tc>
@@ -34971,7 +34917,7 @@
               <w:rPr>
                 <w:sz w:val="18"/>
               </w:rPr>
-              <w:t>2026-05-12</w:t>
+              <w:t>2026-05-22</w:t>
             </w:r>
           </w:p>
         </w:tc>
@@ -34984,7 +34930,7 @@
               <w:rPr>
                 <w:sz w:val="18"/>
               </w:rPr>
-              <w:t>Merge pull request #9 from SafeVixAI/docs-auto-update</w:t>
+              <w:t>feat(phase3): circuit breakers, enhanced health checks, streaming chat proxy</w:t>
             </w:r>
           </w:p>
         </w:tc>
@@ -35012,7 +34958,7 @@
               <w:rPr>
                 <w:sz w:val="18"/>
               </w:rPr>
-              <w:t>d2474fb</w:t>
+              <w:t>9ff7863</w:t>
             </w:r>
           </w:p>
         </w:tc>
@@ -35025,7 +34971,7 @@
               <w:rPr>
                 <w:sz w:val="18"/>
               </w:rPr>
-              <w:t>2026-05-12</w:t>
+              <w:t>2026-05-22</w:t>
             </w:r>
           </w:p>
         </w:tc>
@@ -35038,61 +34984,7 @@
               <w:rPr>
                 <w:sz w:val="18"/>
               </w:rPr>
-              <w:t>docs: auto-update master doc</w:t>
-            </w:r>
-          </w:p>
-        </w:tc>
-        <w:tc>
-          <w:tcPr>
-            <w:tcW w:type="dxa" w:w="2160"/>
-          </w:tcPr>
-          <w:p>
-            <w:r>
-              <w:rPr>
-                <w:sz w:val="18"/>
-              </w:rPr>
-              <w:t>rohitkumarnaidu</w:t>
-            </w:r>
-          </w:p>
-        </w:tc>
-      </w:tr>
-      <w:tr>
-        <w:tc>
-          <w:tcPr>
-            <w:tcW w:type="dxa" w:w="2160"/>
-          </w:tcPr>
-          <w:p>
-            <w:r>
-              <w:rPr>
-                <w:sz w:val="18"/>
-              </w:rPr>
-              <w:t>6689bc3</w:t>
-            </w:r>
-          </w:p>
-        </w:tc>
-        <w:tc>
-          <w:tcPr>
-            <w:tcW w:type="dxa" w:w="2160"/>
-          </w:tcPr>
-          <w:p>
-            <w:r>
-              <w:rPr>
-                <w:sz w:val="18"/>
-              </w:rPr>
-              <w:t>2026-05-12</w:t>
-            </w:r>
-          </w:p>
-        </w:tc>
-        <w:tc>
-          <w:tcPr>
-            <w:tcW w:type="dxa" w:w="2160"/>
-          </w:tcPr>
-          <w:p>
-            <w:r>
-              <w:rPr>
-                <w:sz w:val="18"/>
-              </w:rPr>
-              <w:t>feat(verify/mcp): finalize enterprise verification hardening with V2 features an</w:t>
+              <w:t>ci: fix docker build lowercase repo path, Render redeploy secret check, restrict</w:t>
             </w:r>
           </w:p>
         </w:tc>
@@ -35120,7 +35012,7 @@
               <w:rPr>
                 <w:sz w:val="18"/>
               </w:rPr>
-              <w:t>5b79afc</w:t>
+              <w:t>b46ae16</w:t>
             </w:r>
           </w:p>
         </w:tc>
@@ -35133,7 +35025,7 @@
               <w:rPr>
                 <w:sz w:val="18"/>
               </w:rPr>
-              <w:t>2026-05-12</w:t>
+              <w:t>2026-05-21</w:t>
             </w:r>
           </w:p>
         </w:tc>
@@ -35146,7 +35038,7 @@
               <w:rPr>
                 <w:sz w:val="18"/>
               </w:rPr>
-              <w:t>feat(ui/ux): stabilize enterprise app shell, status tracking, and map test suite</w:t>
+              <w:t>Merge pull request #35 from SafeVixAI/phase0-enterprise-security</w:t>
             </w:r>
           </w:p>
         </w:tc>
@@ -35174,7 +35066,7 @@
               <w:rPr>
                 <w:sz w:val="18"/>
               </w:rPr>
-              <w:t>0e9fd6e</w:t>
+              <w:t>3b0f090</w:t>
             </w:r>
           </w:p>
         </w:tc>
@@ -35187,7 +35079,7 @@
               <w:rPr>
                 <w:sz w:val="18"/>
               </w:rPr>
-              <w:t>2026-05-12</w:t>
+              <w:t>2026-05-21</w:t>
             </w:r>
           </w:p>
         </w:tc>
@@ -35200,7 +35092,7 @@
               <w:rPr>
                 <w:sz w:val="18"/>
               </w:rPr>
-              <w:t>Merge pull request #8 from SafeVixAI/docs-auto-update</w:t>
+              <w:t>feat(phase3): add response caching + structured logging with correlation IDs</w:t>
             </w:r>
           </w:p>
         </w:tc>
@@ -35228,7 +35120,7 @@
               <w:rPr>
                 <w:sz w:val="18"/>
               </w:rPr>
-              <w:t>feb91db</w:t>
+              <w:t>e5f3703</w:t>
             </w:r>
           </w:p>
         </w:tc>
@@ -35241,7 +35133,7 @@
               <w:rPr>
                 <w:sz w:val="18"/>
               </w:rPr>
-              <w:t>2026-05-11</w:t>
+              <w:t>2026-05-21</w:t>
             </w:r>
           </w:p>
         </w:tc>
@@ -35254,7 +35146,7 @@
               <w:rPr>
                 <w:sz w:val="18"/>
               </w:rPr>
-              <w:t>docs: auto-update master doc</w:t>
+              <w:t>docs: add Phase 3 implementation plan</w:t>
             </w:r>
           </w:p>
         </w:tc>
@@ -35267,7 +35159,7 @@
               <w:rPr>
                 <w:sz w:val="18"/>
               </w:rPr>
-              <w:t>rohitkumarnaidu</w:t>
+              <w:t>Bappadala Rohith Kumar Naidu</w:t>
             </w:r>
           </w:p>
         </w:tc>
@@ -35282,7 +35174,7 @@
               <w:rPr>
                 <w:sz w:val="18"/>
               </w:rPr>
-              <w:t>47331cb</w:t>
+              <w:t>0d3442e</w:t>
             </w:r>
           </w:p>
         </w:tc>
@@ -35295,7 +35187,7 @@
               <w:rPr>
                 <w:sz w:val="18"/>
               </w:rPr>
-              <w:t>2026-05-11</w:t>
+              <w:t>2026-05-21</w:t>
             </w:r>
           </w:p>
         </w:tc>
@@ -35308,7 +35200,115 @@
               <w:rPr>
                 <w:sz w:val="18"/>
               </w:rPr>
-              <w:t>chore: add agent and graphify outputs to gitignore</w:t>
+              <w:t>test: add user, waze, JWKS, Redis tests + fix timezone import (90+ tests)</w:t>
+            </w:r>
+          </w:p>
+        </w:tc>
+        <w:tc>
+          <w:tcPr>
+            <w:tcW w:type="dxa" w:w="2160"/>
+          </w:tcPr>
+          <w:p>
+            <w:r>
+              <w:rPr>
+                <w:sz w:val="18"/>
+              </w:rPr>
+              <w:t>Bappadala Rohith Kumar Naidu</w:t>
+            </w:r>
+          </w:p>
+        </w:tc>
+      </w:tr>
+      <w:tr>
+        <w:tc>
+          <w:tcPr>
+            <w:tcW w:type="dxa" w:w="2160"/>
+          </w:tcPr>
+          <w:p>
+            <w:r>
+              <w:rPr>
+                <w:sz w:val="18"/>
+              </w:rPr>
+              <w:t>e1ba834</w:t>
+            </w:r>
+          </w:p>
+        </w:tc>
+        <w:tc>
+          <w:tcPr>
+            <w:tcW w:type="dxa" w:w="2160"/>
+          </w:tcPr>
+          <w:p>
+            <w:r>
+              <w:rPr>
+                <w:sz w:val="18"/>
+              </w:rPr>
+              <w:t>2026-05-21</w:t>
+            </w:r>
+          </w:p>
+        </w:tc>
+        <w:tc>
+          <w:tcPr>
+            <w:tcW w:type="dxa" w:w="2160"/>
+          </w:tcPr>
+          <w:p>
+            <w:r>
+              <w:rPr>
+                <w:sz w:val="18"/>
+              </w:rPr>
+              <w:t>test: add MCP, live tracking, and emergency API tests (83% coverage)</w:t>
+            </w:r>
+          </w:p>
+        </w:tc>
+        <w:tc>
+          <w:tcPr>
+            <w:tcW w:type="dxa" w:w="2160"/>
+          </w:tcPr>
+          <w:p>
+            <w:r>
+              <w:rPr>
+                <w:sz w:val="18"/>
+              </w:rPr>
+              <w:t>Bappadala Rohith Kumar Naidu</w:t>
+            </w:r>
+          </w:p>
+        </w:tc>
+      </w:tr>
+      <w:tr>
+        <w:tc>
+          <w:tcPr>
+            <w:tcW w:type="dxa" w:w="2160"/>
+          </w:tcPr>
+          <w:p>
+            <w:r>
+              <w:rPr>
+                <w:sz w:val="18"/>
+              </w:rPr>
+              <w:t>8b76b4d</w:t>
+            </w:r>
+          </w:p>
+        </w:tc>
+        <w:tc>
+          <w:tcPr>
+            <w:tcW w:type="dxa" w:w="2160"/>
+          </w:tcPr>
+          <w:p>
+            <w:r>
+              <w:rPr>
+                <w:sz w:val="18"/>
+              </w:rPr>
+              <w:t>2026-05-21</w:t>
+            </w:r>
+          </w:p>
+        </w:tc>
+        <w:tc>
+          <w:tcPr>
+            <w:tcW w:type="dxa" w:w="2160"/>
+          </w:tcPr>
+          <w:p>
+            <w:r>
+              <w:rPr>
+                <w:sz w:val="18"/>
+              </w:rPr>
+              <w:t>fix(tests): remove unused pytz import causing CI failure</w:t>
             </w:r>
           </w:p>
         </w:tc>
@@ -36173,7 +36173,7 @@
               <w:rPr>
                 <w:sz w:val="18"/>
               </w:rPr>
-              <w:t>243</w:t>
+              <w:t>257</w:t>
             </w:r>
           </w:p>
         </w:tc>
@@ -36307,7 +36307,7 @@
         <w:br/>
         <w:t>Generated by scripts/update_master_doc.py</w:t>
         <w:br/>
-        <w:t>Timestamp: 2026-05-12 23:07 IST</w:t>
+        <w:t>Timestamp: 2026-05-22 12:25 IST</w:t>
         <w:br/>
         <w:t>Repository: github.com/SafeVixAI/SafeVixAI</w:t>
       </w:r>

</xml_diff>

<commit_message>
Deployed e5095bf with MkDocs version: 1.6.1
</commit_message>
<xml_diff>
--- a/SafeVixAI_MASTER.docx
+++ b/SafeVixAI_MASTER.docx
@@ -33723,7 +33723,7 @@
           <w:i w:val="0"/>
           <w:sz w:val="22"/>
         </w:rPr>
-        <w:t>🕐 Last auto-updated: 2026-05-22 12:25 IST</w:t>
+        <w:t>🕐 Last auto-updated: 2026-06-08 23:07 IST</w:t>
       </w:r>
     </w:p>
     <w:p>
@@ -33867,7 +33867,7 @@
               <w:rPr>
                 <w:sz w:val="18"/>
               </w:rPr>
-              <w:t>49 MB</w:t>
+              <w:t>69 MB</w:t>
             </w:r>
           </w:p>
         </w:tc>
@@ -33923,7 +33923,7 @@
               <w:rPr>
                 <w:sz w:val="18"/>
               </w:rPr>
-              <w:t>2026-05-22</w:t>
+              <w:t>2026-06-08</w:t>
             </w:r>
           </w:p>
         </w:tc>
@@ -33951,7 +33951,7 @@
               <w:rPr>
                 <w:sz w:val="18"/>
               </w:rPr>
-              <w:t>1</w:t>
+              <w:t>35</w:t>
             </w:r>
           </w:p>
         </w:tc>
@@ -34060,7 +34060,7 @@
               <w:rPr>
                 <w:sz w:val="18"/>
               </w:rPr>
-              <w:t>293ms | HTTP 404 | v?</w:t>
+              <w:t>470ms | HTTP 404 | v?</w:t>
             </w:r>
           </w:p>
         </w:tc>
@@ -34101,7 +34101,7 @@
               <w:rPr>
                 <w:sz w:val="18"/>
               </w:rPr>
-              <w:t>214ms | HTTP 404 | v?</w:t>
+              <w:t>484ms | HTTP 404 | v?</w:t>
             </w:r>
           </w:p>
         </w:tc>
@@ -34142,7 +34142,7 @@
               <w:rPr>
                 <w:sz w:val="18"/>
               </w:rPr>
-              <w:t>100ms | HTTP 200 | v?</w:t>
+              <w:t>441ms | HTTP 200 | v?</w:t>
             </w:r>
           </w:p>
         </w:tc>
@@ -34250,7 +34250,385 @@
               <w:rPr>
                 <w:sz w:val="18"/>
               </w:rPr>
-              <w:t>⏳ Update Master Document</w:t>
+              <w:t>⏳ Branch Protection Checks</w:t>
+            </w:r>
+          </w:p>
+        </w:tc>
+        <w:tc>
+          <w:tcPr>
+            <w:tcW w:type="dxa" w:w="2160"/>
+          </w:tcPr>
+          <w:p>
+            <w:r>
+              <w:rPr>
+                <w:sz w:val="18"/>
+              </w:rPr>
+              <w:t>copilot/replace-hardcoded-color-value</w:t>
+            </w:r>
+          </w:p>
+        </w:tc>
+        <w:tc>
+          <w:tcPr>
+            <w:tcW w:type="dxa" w:w="2160"/>
+          </w:tcPr>
+          <w:p>
+            <w:r>
+              <w:rPr>
+                <w:sz w:val="18"/>
+              </w:rPr>
+              <w:t>action_required</w:t>
+            </w:r>
+          </w:p>
+        </w:tc>
+        <w:tc>
+          <w:tcPr>
+            <w:tcW w:type="dxa" w:w="2160"/>
+          </w:tcPr>
+          <w:p>
+            <w:r>
+              <w:rPr>
+                <w:sz w:val="18"/>
+              </w:rPr>
+              <w:t>2026-06-08</w:t>
+            </w:r>
+          </w:p>
+        </w:tc>
+      </w:tr>
+      <w:tr>
+        <w:tc>
+          <w:tcPr>
+            <w:tcW w:type="dxa" w:w="2160"/>
+          </w:tcPr>
+          <w:p>
+            <w:r>
+              <w:rPr>
+                <w:sz w:val="18"/>
+              </w:rPr>
+              <w:t>⏳ Codacy Security Scan</w:t>
+            </w:r>
+          </w:p>
+        </w:tc>
+        <w:tc>
+          <w:tcPr>
+            <w:tcW w:type="dxa" w:w="2160"/>
+          </w:tcPr>
+          <w:p>
+            <w:r>
+              <w:rPr>
+                <w:sz w:val="18"/>
+              </w:rPr>
+              <w:t>copilot/replace-hardcoded-color-value</w:t>
+            </w:r>
+          </w:p>
+        </w:tc>
+        <w:tc>
+          <w:tcPr>
+            <w:tcW w:type="dxa" w:w="2160"/>
+          </w:tcPr>
+          <w:p>
+            <w:r>
+              <w:rPr>
+                <w:sz w:val="18"/>
+              </w:rPr>
+              <w:t>action_required</w:t>
+            </w:r>
+          </w:p>
+        </w:tc>
+        <w:tc>
+          <w:tcPr>
+            <w:tcW w:type="dxa" w:w="2160"/>
+          </w:tcPr>
+          <w:p>
+            <w:r>
+              <w:rPr>
+                <w:sz w:val="18"/>
+              </w:rPr>
+              <w:t>2026-06-08</w:t>
+            </w:r>
+          </w:p>
+        </w:tc>
+      </w:tr>
+      <w:tr>
+        <w:tc>
+          <w:tcPr>
+            <w:tcW w:type="dxa" w:w="2160"/>
+          </w:tcPr>
+          <w:p>
+            <w:r>
+              <w:rPr>
+                <w:sz w:val="18"/>
+              </w:rPr>
+              <w:t>⏳ Render Deploy Readiness</w:t>
+            </w:r>
+          </w:p>
+        </w:tc>
+        <w:tc>
+          <w:tcPr>
+            <w:tcW w:type="dxa" w:w="2160"/>
+          </w:tcPr>
+          <w:p>
+            <w:r>
+              <w:rPr>
+                <w:sz w:val="18"/>
+              </w:rPr>
+              <w:t>copilot/replace-hardcoded-color-value</w:t>
+            </w:r>
+          </w:p>
+        </w:tc>
+        <w:tc>
+          <w:tcPr>
+            <w:tcW w:type="dxa" w:w="2160"/>
+          </w:tcPr>
+          <w:p>
+            <w:r>
+              <w:rPr>
+                <w:sz w:val="18"/>
+              </w:rPr>
+              <w:t>action_required</w:t>
+            </w:r>
+          </w:p>
+        </w:tc>
+        <w:tc>
+          <w:tcPr>
+            <w:tcW w:type="dxa" w:w="2160"/>
+          </w:tcPr>
+          <w:p>
+            <w:r>
+              <w:rPr>
+                <w:sz w:val="18"/>
+              </w:rPr>
+              <w:t>2026-06-08</w:t>
+            </w:r>
+          </w:p>
+        </w:tc>
+      </w:tr>
+      <w:tr>
+        <w:tc>
+          <w:tcPr>
+            <w:tcW w:type="dxa" w:w="2160"/>
+          </w:tcPr>
+          <w:p>
+            <w:r>
+              <w:rPr>
+                <w:sz w:val="18"/>
+              </w:rPr>
+              <w:t>⏳ Security Scan</w:t>
+            </w:r>
+          </w:p>
+        </w:tc>
+        <w:tc>
+          <w:tcPr>
+            <w:tcW w:type="dxa" w:w="2160"/>
+          </w:tcPr>
+          <w:p>
+            <w:r>
+              <w:rPr>
+                <w:sz w:val="18"/>
+              </w:rPr>
+              <w:t>copilot/replace-hardcoded-color-value</w:t>
+            </w:r>
+          </w:p>
+        </w:tc>
+        <w:tc>
+          <w:tcPr>
+            <w:tcW w:type="dxa" w:w="2160"/>
+          </w:tcPr>
+          <w:p>
+            <w:r>
+              <w:rPr>
+                <w:sz w:val="18"/>
+              </w:rPr>
+              <w:t>action_required</w:t>
+            </w:r>
+          </w:p>
+        </w:tc>
+        <w:tc>
+          <w:tcPr>
+            <w:tcW w:type="dxa" w:w="2160"/>
+          </w:tcPr>
+          <w:p>
+            <w:r>
+              <w:rPr>
+                <w:sz w:val="18"/>
+              </w:rPr>
+              <w:t>2026-06-08</w:t>
+            </w:r>
+          </w:p>
+        </w:tc>
+      </w:tr>
+      <w:tr>
+        <w:tc>
+          <w:tcPr>
+            <w:tcW w:type="dxa" w:w="2160"/>
+          </w:tcPr>
+          <w:p>
+            <w:r>
+              <w:rPr>
+                <w:sz w:val="18"/>
+              </w:rPr>
+              <w:t>⏳ Running Copilot cloud agent</w:t>
+            </w:r>
+          </w:p>
+        </w:tc>
+        <w:tc>
+          <w:tcPr>
+            <w:tcW w:type="dxa" w:w="2160"/>
+          </w:tcPr>
+          <w:p>
+            <w:r>
+              <w:rPr>
+                <w:sz w:val="18"/>
+              </w:rPr>
+              <w:t>copilot/replace-hardcoded-color-value</w:t>
+            </w:r>
+          </w:p>
+        </w:tc>
+        <w:tc>
+          <w:tcPr>
+            <w:tcW w:type="dxa" w:w="2160"/>
+          </w:tcPr>
+          <w:p>
+            <w:r>
+              <w:rPr>
+                <w:sz w:val="18"/>
+              </w:rPr>
+              <w:t>in_progress</w:t>
+            </w:r>
+          </w:p>
+        </w:tc>
+        <w:tc>
+          <w:tcPr>
+            <w:tcW w:type="dxa" w:w="2160"/>
+          </w:tcPr>
+          <w:p>
+            <w:r>
+              <w:rPr>
+                <w:sz w:val="18"/>
+              </w:rPr>
+              <w:t>2026-06-08</w:t>
+            </w:r>
+          </w:p>
+        </w:tc>
+      </w:tr>
+      <w:tr>
+        <w:tc>
+          <w:tcPr>
+            <w:tcW w:type="dxa" w:w="2160"/>
+          </w:tcPr>
+          <w:p>
+            <w:r>
+              <w:rPr>
+                <w:sz w:val="18"/>
+              </w:rPr>
+              <w:t>✅ Code Quality: PR #167</w:t>
+            </w:r>
+          </w:p>
+        </w:tc>
+        <w:tc>
+          <w:tcPr>
+            <w:tcW w:type="dxa" w:w="2160"/>
+          </w:tcPr>
+          <w:p>
+            <w:r>
+              <w:rPr>
+                <w:sz w:val="18"/>
+              </w:rPr>
+              <w:t>refs/pull/167/head</w:t>
+            </w:r>
+          </w:p>
+        </w:tc>
+        <w:tc>
+          <w:tcPr>
+            <w:tcW w:type="dxa" w:w="2160"/>
+          </w:tcPr>
+          <w:p>
+            <w:r>
+              <w:rPr>
+                <w:sz w:val="18"/>
+              </w:rPr>
+              <w:t>success</w:t>
+            </w:r>
+          </w:p>
+        </w:tc>
+        <w:tc>
+          <w:tcPr>
+            <w:tcW w:type="dxa" w:w="2160"/>
+          </w:tcPr>
+          <w:p>
+            <w:r>
+              <w:rPr>
+                <w:sz w:val="18"/>
+              </w:rPr>
+              <w:t>2026-06-08</w:t>
+            </w:r>
+          </w:p>
+        </w:tc>
+      </w:tr>
+      <w:tr>
+        <w:tc>
+          <w:tcPr>
+            <w:tcW w:type="dxa" w:w="2160"/>
+          </w:tcPr>
+          <w:p>
+            <w:r>
+              <w:rPr>
+                <w:sz w:val="18"/>
+              </w:rPr>
+              <w:t>✅ PR #167</w:t>
+            </w:r>
+          </w:p>
+        </w:tc>
+        <w:tc>
+          <w:tcPr>
+            <w:tcW w:type="dxa" w:w="2160"/>
+          </w:tcPr>
+          <w:p>
+            <w:r>
+              <w:rPr>
+                <w:sz w:val="18"/>
+              </w:rPr>
+              <w:t>refs/pull/167/head</w:t>
+            </w:r>
+          </w:p>
+        </w:tc>
+        <w:tc>
+          <w:tcPr>
+            <w:tcW w:type="dxa" w:w="2160"/>
+          </w:tcPr>
+          <w:p>
+            <w:r>
+              <w:rPr>
+                <w:sz w:val="18"/>
+              </w:rPr>
+              <w:t>success</w:t>
+            </w:r>
+          </w:p>
+        </w:tc>
+        <w:tc>
+          <w:tcPr>
+            <w:tcW w:type="dxa" w:w="2160"/>
+          </w:tcPr>
+          <w:p>
+            <w:r>
+              <w:rPr>
+                <w:sz w:val="18"/>
+              </w:rPr>
+              <w:t>2026-06-08</w:t>
+            </w:r>
+          </w:p>
+        </w:tc>
+      </w:tr>
+      <w:tr>
+        <w:tc>
+          <w:tcPr>
+            <w:tcW w:type="dxa" w:w="2160"/>
+          </w:tcPr>
+          <w:p>
+            <w:r>
+              <w:rPr>
+                <w:sz w:val="18"/>
+              </w:rPr>
+              <w:t>⏳ Blue-Green Deployment</w:t>
             </w:r>
           </w:p>
         </w:tc>
@@ -34276,7 +34654,7 @@
               <w:rPr>
                 <w:sz w:val="18"/>
               </w:rPr>
-              <w:t>in_progress</w:t>
+              <w:t>skipped</w:t>
             </w:r>
           </w:p>
         </w:tc>
@@ -34289,385 +34667,7 @@
               <w:rPr>
                 <w:sz w:val="18"/>
               </w:rPr>
-              <w:t>2026-05-22</w:t>
-            </w:r>
-          </w:p>
-        </w:tc>
-      </w:tr>
-      <w:tr>
-        <w:tc>
-          <w:tcPr>
-            <w:tcW w:type="dxa" w:w="2160"/>
-          </w:tcPr>
-          <w:p>
-            <w:r>
-              <w:rPr>
-                <w:sz w:val="18"/>
-              </w:rPr>
-              <w:t>⏳ Wiki Documentation Sync</w:t>
-            </w:r>
-          </w:p>
-        </w:tc>
-        <w:tc>
-          <w:tcPr>
-            <w:tcW w:type="dxa" w:w="2160"/>
-          </w:tcPr>
-          <w:p>
-            <w:r>
-              <w:rPr>
-                <w:sz w:val="18"/>
-              </w:rPr>
-              <w:t>main</w:t>
-            </w:r>
-          </w:p>
-        </w:tc>
-        <w:tc>
-          <w:tcPr>
-            <w:tcW w:type="dxa" w:w="2160"/>
-          </w:tcPr>
-          <w:p>
-            <w:r>
-              <w:rPr>
-                <w:sz w:val="18"/>
-              </w:rPr>
-              <w:t>in_progress</w:t>
-            </w:r>
-          </w:p>
-        </w:tc>
-        <w:tc>
-          <w:tcPr>
-            <w:tcW w:type="dxa" w:w="2160"/>
-          </w:tcPr>
-          <w:p>
-            <w:r>
-              <w:rPr>
-                <w:sz w:val="18"/>
-              </w:rPr>
-              <w:t>2026-05-22</w:t>
-            </w:r>
-          </w:p>
-        </w:tc>
-      </w:tr>
-      <w:tr>
-        <w:tc>
-          <w:tcPr>
-            <w:tcW w:type="dxa" w:w="2160"/>
-          </w:tcPr>
-          <w:p>
-            <w:r>
-              <w:rPr>
-                <w:sz w:val="18"/>
-              </w:rPr>
-              <w:t>⏳ Deploy Enterprise Docs</w:t>
-            </w:r>
-          </w:p>
-        </w:tc>
-        <w:tc>
-          <w:tcPr>
-            <w:tcW w:type="dxa" w:w="2160"/>
-          </w:tcPr>
-          <w:p>
-            <w:r>
-              <w:rPr>
-                <w:sz w:val="18"/>
-              </w:rPr>
-              <w:t>main</w:t>
-            </w:r>
-          </w:p>
-        </w:tc>
-        <w:tc>
-          <w:tcPr>
-            <w:tcW w:type="dxa" w:w="2160"/>
-          </w:tcPr>
-          <w:p>
-            <w:r>
-              <w:rPr>
-                <w:sz w:val="18"/>
-              </w:rPr>
-              <w:t>in_progress</w:t>
-            </w:r>
-          </w:p>
-        </w:tc>
-        <w:tc>
-          <w:tcPr>
-            <w:tcW w:type="dxa" w:w="2160"/>
-          </w:tcPr>
-          <w:p>
-            <w:r>
-              <w:rPr>
-                <w:sz w:val="18"/>
-              </w:rPr>
-              <w:t>2026-05-22</w:t>
-            </w:r>
-          </w:p>
-        </w:tc>
-      </w:tr>
-      <w:tr>
-        <w:tc>
-          <w:tcPr>
-            <w:tcW w:type="dxa" w:w="2160"/>
-          </w:tcPr>
-          <w:p>
-            <w:r>
-              <w:rPr>
-                <w:sz w:val="18"/>
-              </w:rPr>
-              <w:t>🔴 .github/workflows/smoke-tests.yml</w:t>
-            </w:r>
-          </w:p>
-        </w:tc>
-        <w:tc>
-          <w:tcPr>
-            <w:tcW w:type="dxa" w:w="2160"/>
-          </w:tcPr>
-          <w:p>
-            <w:r>
-              <w:rPr>
-                <w:sz w:val="18"/>
-              </w:rPr>
-              <w:t>main</w:t>
-            </w:r>
-          </w:p>
-        </w:tc>
-        <w:tc>
-          <w:tcPr>
-            <w:tcW w:type="dxa" w:w="2160"/>
-          </w:tcPr>
-          <w:p>
-            <w:r>
-              <w:rPr>
-                <w:sz w:val="18"/>
-              </w:rPr>
-              <w:t>failure</w:t>
-            </w:r>
-          </w:p>
-        </w:tc>
-        <w:tc>
-          <w:tcPr>
-            <w:tcW w:type="dxa" w:w="2160"/>
-          </w:tcPr>
-          <w:p>
-            <w:r>
-              <w:rPr>
-                <w:sz w:val="18"/>
-              </w:rPr>
-              <w:t>2026-05-22</w:t>
-            </w:r>
-          </w:p>
-        </w:tc>
-      </w:tr>
-      <w:tr>
-        <w:tc>
-          <w:tcPr>
-            <w:tcW w:type="dxa" w:w="2160"/>
-          </w:tcPr>
-          <w:p>
-            <w:r>
-              <w:rPr>
-                <w:sz w:val="18"/>
-              </w:rPr>
-              <w:t>⏳ Push on main</w:t>
-            </w:r>
-          </w:p>
-        </w:tc>
-        <w:tc>
-          <w:tcPr>
-            <w:tcW w:type="dxa" w:w="2160"/>
-          </w:tcPr>
-          <w:p>
-            <w:r>
-              <w:rPr>
-                <w:sz w:val="18"/>
-              </w:rPr>
-              <w:t>main</w:t>
-            </w:r>
-          </w:p>
-        </w:tc>
-        <w:tc>
-          <w:tcPr>
-            <w:tcW w:type="dxa" w:w="2160"/>
-          </w:tcPr>
-          <w:p>
-            <w:r>
-              <w:rPr>
-                <w:sz w:val="18"/>
-              </w:rPr>
-              <w:t>in_progress</w:t>
-            </w:r>
-          </w:p>
-        </w:tc>
-        <w:tc>
-          <w:tcPr>
-            <w:tcW w:type="dxa" w:w="2160"/>
-          </w:tcPr>
-          <w:p>
-            <w:r>
-              <w:rPr>
-                <w:sz w:val="18"/>
-              </w:rPr>
-              <w:t>2026-05-22</w:t>
-            </w:r>
-          </w:p>
-        </w:tc>
-      </w:tr>
-      <w:tr>
-        <w:tc>
-          <w:tcPr>
-            <w:tcW w:type="dxa" w:w="2160"/>
-          </w:tcPr>
-          <w:p>
-            <w:r>
-              <w:rPr>
-                <w:sz w:val="18"/>
-              </w:rPr>
-              <w:t>⏳ Code Quality: Push on main</w:t>
-            </w:r>
-          </w:p>
-        </w:tc>
-        <w:tc>
-          <w:tcPr>
-            <w:tcW w:type="dxa" w:w="2160"/>
-          </w:tcPr>
-          <w:p>
-            <w:r>
-              <w:rPr>
-                <w:sz w:val="18"/>
-              </w:rPr>
-              <w:t>main</w:t>
-            </w:r>
-          </w:p>
-        </w:tc>
-        <w:tc>
-          <w:tcPr>
-            <w:tcW w:type="dxa" w:w="2160"/>
-          </w:tcPr>
-          <w:p>
-            <w:r>
-              <w:rPr>
-                <w:sz w:val="18"/>
-              </w:rPr>
-              <w:t>in_progress</w:t>
-            </w:r>
-          </w:p>
-        </w:tc>
-        <w:tc>
-          <w:tcPr>
-            <w:tcW w:type="dxa" w:w="2160"/>
-          </w:tcPr>
-          <w:p>
-            <w:r>
-              <w:rPr>
-                <w:sz w:val="18"/>
-              </w:rPr>
-              <w:t>2026-05-22</w:t>
-            </w:r>
-          </w:p>
-        </w:tc>
-      </w:tr>
-      <w:tr>
-        <w:tc>
-          <w:tcPr>
-            <w:tcW w:type="dxa" w:w="2160"/>
-          </w:tcPr>
-          <w:p>
-            <w:r>
-              <w:rPr>
-                <w:sz w:val="18"/>
-              </w:rPr>
-              <w:t>🔴 Frontend CI</w:t>
-            </w:r>
-          </w:p>
-        </w:tc>
-        <w:tc>
-          <w:tcPr>
-            <w:tcW w:type="dxa" w:w="2160"/>
-          </w:tcPr>
-          <w:p>
-            <w:r>
-              <w:rPr>
-                <w:sz w:val="18"/>
-              </w:rPr>
-              <w:t>dependabot/npm_and_yarn/frontend/frontend-dependencies-858b392ac1</w:t>
-            </w:r>
-          </w:p>
-        </w:tc>
-        <w:tc>
-          <w:tcPr>
-            <w:tcW w:type="dxa" w:w="2160"/>
-          </w:tcPr>
-          <w:p>
-            <w:r>
-              <w:rPr>
-                <w:sz w:val="18"/>
-              </w:rPr>
-              <w:t>failure</w:t>
-            </w:r>
-          </w:p>
-        </w:tc>
-        <w:tc>
-          <w:tcPr>
-            <w:tcW w:type="dxa" w:w="2160"/>
-          </w:tcPr>
-          <w:p>
-            <w:r>
-              <w:rPr>
-                <w:sz w:val="18"/>
-              </w:rPr>
-              <w:t>2026-05-22</w:t>
-            </w:r>
-          </w:p>
-        </w:tc>
-      </w:tr>
-      <w:tr>
-        <w:tc>
-          <w:tcPr>
-            <w:tcW w:type="dxa" w:w="2160"/>
-          </w:tcPr>
-          <w:p>
-            <w:r>
-              <w:rPr>
-                <w:sz w:val="18"/>
-              </w:rPr>
-              <w:t>✅ Render Deploy Readiness</w:t>
-            </w:r>
-          </w:p>
-        </w:tc>
-        <w:tc>
-          <w:tcPr>
-            <w:tcW w:type="dxa" w:w="2160"/>
-          </w:tcPr>
-          <w:p>
-            <w:r>
-              <w:rPr>
-                <w:sz w:val="18"/>
-              </w:rPr>
-              <w:t>dependabot/npm_and_yarn/frontend/frontend-dependencies-858b392ac1</w:t>
-            </w:r>
-          </w:p>
-        </w:tc>
-        <w:tc>
-          <w:tcPr>
-            <w:tcW w:type="dxa" w:w="2160"/>
-          </w:tcPr>
-          <w:p>
-            <w:r>
-              <w:rPr>
-                <w:sz w:val="18"/>
-              </w:rPr>
-              <w:t>success</w:t>
-            </w:r>
-          </w:p>
-        </w:tc>
-        <w:tc>
-          <w:tcPr>
-            <w:tcW w:type="dxa" w:w="2160"/>
-          </w:tcPr>
-          <w:p>
-            <w:r>
-              <w:rPr>
-                <w:sz w:val="18"/>
-              </w:rPr>
-              <w:t>2026-05-22</w:t>
+              <w:t>2026-06-08</w:t>
             </w:r>
           </w:p>
         </w:tc>
@@ -34796,7 +34796,7 @@
               <w:rPr>
                 <w:sz w:val="18"/>
               </w:rPr>
-              <w:t>07d9e50</w:t>
+              <w:t>de21aa0</w:t>
             </w:r>
           </w:p>
         </w:tc>
@@ -34809,7 +34809,7 @@
               <w:rPr>
                 <w:sz w:val="18"/>
               </w:rPr>
-              <w:t>2026-05-22</w:t>
+              <w:t>2026-06-08</w:t>
             </w:r>
           </w:p>
         </w:tc>
@@ -34822,7 +34822,7 @@
               <w:rPr>
                 <w:sz w:val="18"/>
               </w:rPr>
-              <w:t>Merge pull request #13 from SafeVixAI/docs-wiki-auto-update</w:t>
+              <w:t>100% test coverage: fix skipped tests + OpenAPI validation + production bug</w:t>
             </w:r>
           </w:p>
         </w:tc>
@@ -34850,7 +34850,7 @@
               <w:rPr>
                 <w:sz w:val="18"/>
               </w:rPr>
-              <w:t>6f61bed</w:t>
+              <w:t>45115a0</w:t>
             </w:r>
           </w:p>
         </w:tc>
@@ -34863,7 +34863,7 @@
               <w:rPr>
                 <w:sz w:val="18"/>
               </w:rPr>
-              <w:t>2026-05-22</w:t>
+              <w:t>2026-06-08</w:t>
             </w:r>
           </w:p>
         </w:tc>
@@ -34876,61 +34876,7 @@
               <w:rPr>
                 <w:sz w:val="18"/>
               </w:rPr>
-              <w:t>docs(wiki): auto-sync wiki documentation [automated]</w:t>
-            </w:r>
-          </w:p>
-        </w:tc>
-        <w:tc>
-          <w:tcPr>
-            <w:tcW w:type="dxa" w:w="2160"/>
-          </w:tcPr>
-          <w:p>
-            <w:r>
-              <w:rPr>
-                <w:sz w:val="18"/>
-              </w:rPr>
-              <w:t>rohitkumarnaidu</w:t>
-            </w:r>
-          </w:p>
-        </w:tc>
-      </w:tr>
-      <w:tr>
-        <w:tc>
-          <w:tcPr>
-            <w:tcW w:type="dxa" w:w="2160"/>
-          </w:tcPr>
-          <w:p>
-            <w:r>
-              <w:rPr>
-                <w:sz w:val="18"/>
-              </w:rPr>
-              <w:t>e47df81</w:t>
-            </w:r>
-          </w:p>
-        </w:tc>
-        <w:tc>
-          <w:tcPr>
-            <w:tcW w:type="dxa" w:w="2160"/>
-          </w:tcPr>
-          <w:p>
-            <w:r>
-              <w:rPr>
-                <w:sz w:val="18"/>
-              </w:rPr>
-              <w:t>2026-05-22</w:t>
-            </w:r>
-          </w:p>
-        </w:tc>
-        <w:tc>
-          <w:tcPr>
-            <w:tcW w:type="dxa" w:w="2160"/>
-          </w:tcPr>
-          <w:p>
-            <w:r>
-              <w:rPr>
-                <w:sz w:val="18"/>
-              </w:rPr>
-              <w:t>feat(phase3): circuit breakers, enhanced health checks, streaming chat proxy</w:t>
+              <w:t>Enterprise: landing page integration + auth E2E tests</w:t>
             </w:r>
           </w:p>
         </w:tc>
@@ -34958,7 +34904,7 @@
               <w:rPr>
                 <w:sz w:val="18"/>
               </w:rPr>
-              <w:t>9ff7863</w:t>
+              <w:t>74c45c8</w:t>
             </w:r>
           </w:p>
         </w:tc>
@@ -34971,7 +34917,7 @@
               <w:rPr>
                 <w:sz w:val="18"/>
               </w:rPr>
-              <w:t>2026-05-22</w:t>
+              <w:t>2026-06-08</w:t>
             </w:r>
           </w:p>
         </w:tc>
@@ -34984,7 +34930,7 @@
               <w:rPr>
                 <w:sz w:val="18"/>
               </w:rPr>
-              <w:t>ci: fix docker build lowercase repo path, Render redeploy secret check, restrict</w:t>
+              <w:t>Zero-warning lint compliance</w:t>
             </w:r>
           </w:p>
         </w:tc>
@@ -35012,7 +34958,7 @@
               <w:rPr>
                 <w:sz w:val="18"/>
               </w:rPr>
-              <w:t>b46ae16</w:t>
+              <w:t>1201708</w:t>
             </w:r>
           </w:p>
         </w:tc>
@@ -35025,7 +34971,7 @@
               <w:rPr>
                 <w:sz w:val="18"/>
               </w:rPr>
-              <w:t>2026-05-21</w:t>
+              <w:t>2026-06-01</w:t>
             </w:r>
           </w:p>
         </w:tc>
@@ -35038,7 +34984,7 @@
               <w:rPr>
                 <w:sz w:val="18"/>
               </w:rPr>
-              <w:t>Merge pull request #35 from SafeVixAI/phase0-enterprise-security</w:t>
+              <w:t>Fix GSAP SSR crash &amp; E2E test flakiness</w:t>
             </w:r>
           </w:p>
         </w:tc>
@@ -35066,7 +35012,7 @@
               <w:rPr>
                 <w:sz w:val="18"/>
               </w:rPr>
-              <w:t>3b0f090</w:t>
+              <w:t>208d0f0</w:t>
             </w:r>
           </w:p>
         </w:tc>
@@ -35079,7 +35025,7 @@
               <w:rPr>
                 <w:sz w:val="18"/>
               </w:rPr>
-              <w:t>2026-05-21</w:t>
+              <w:t>2026-05-31</w:t>
             </w:r>
           </w:p>
         </w:tc>
@@ -35092,7 +35038,7 @@
               <w:rPr>
                 <w:sz w:val="18"/>
               </w:rPr>
-              <w:t>feat(phase3): add response caching + structured logging with correlation IDs</w:t>
+              <w:t>fix: SSR mounted guards, E2E auth route mock, Logo component integration</w:t>
             </w:r>
           </w:p>
         </w:tc>
@@ -35120,7 +35066,7 @@
               <w:rPr>
                 <w:sz w:val="18"/>
               </w:rPr>
-              <w:t>e5f3703</w:t>
+              <w:t>19aac91</w:t>
             </w:r>
           </w:p>
         </w:tc>
@@ -35133,7 +35079,7 @@
               <w:rPr>
                 <w:sz w:val="18"/>
               </w:rPr>
-              <w:t>2026-05-21</w:t>
+              <w:t>2026-05-31</w:t>
             </w:r>
           </w:p>
         </w:tc>
@@ -35146,7 +35092,7 @@
               <w:rPr>
                 <w:sz w:val="18"/>
               </w:rPr>
-              <w:t>docs: add Phase 3 implementation plan</w:t>
+              <w:t>fix: CI — translations tracked, E2E text mismatches, gitignore, responsive thres</w:t>
             </w:r>
           </w:p>
         </w:tc>
@@ -35174,7 +35120,7 @@
               <w:rPr>
                 <w:sz w:val="18"/>
               </w:rPr>
-              <w:t>0d3442e</w:t>
+              <w:t>b9582f7</w:t>
             </w:r>
           </w:p>
         </w:tc>
@@ -35187,7 +35133,7 @@
               <w:rPr>
                 <w:sz w:val="18"/>
               </w:rPr>
-              <w:t>2026-05-21</w:t>
+              <w:t>2026-05-30</w:t>
             </w:r>
           </w:p>
         </w:tc>
@@ -35200,7 +35146,7 @@
               <w:rPr>
                 <w:sz w:val="18"/>
               </w:rPr>
-              <w:t>test: add user, waze, JWKS, Redis tests + fix timezone import (90+ tests)</w:t>
+              <w:t>Merge remote-tracking branch 'origin/dependabot/pip/backend/kaggle-2.2.0'</w:t>
             </w:r>
           </w:p>
         </w:tc>
@@ -35228,7 +35174,7 @@
               <w:rPr>
                 <w:sz w:val="18"/>
               </w:rPr>
-              <w:t>e1ba834</w:t>
+              <w:t>16d6d4e</w:t>
             </w:r>
           </w:p>
         </w:tc>
@@ -35241,7 +35187,7 @@
               <w:rPr>
                 <w:sz w:val="18"/>
               </w:rPr>
-              <w:t>2026-05-21</w:t>
+              <w:t>2026-05-30</w:t>
             </w:r>
           </w:p>
         </w:tc>
@@ -35254,7 +35200,7 @@
               <w:rPr>
                 <w:sz w:val="18"/>
               </w:rPr>
-              <w:t>test: add MCP, live tracking, and emergency API tests (83% coverage)</w:t>
+              <w:t>Merge remote-tracking branch 'origin/dependabot/pip/backend/pytest-cov-7.1.0'</w:t>
             </w:r>
           </w:p>
         </w:tc>
@@ -35282,7 +35228,7 @@
               <w:rPr>
                 <w:sz w:val="18"/>
               </w:rPr>
-              <w:t>8b76b4d</w:t>
+              <w:t>68379f0</w:t>
             </w:r>
           </w:p>
         </w:tc>
@@ -35295,7 +35241,7 @@
               <w:rPr>
                 <w:sz w:val="18"/>
               </w:rPr>
-              <w:t>2026-05-21</w:t>
+              <w:t>2026-05-30</w:t>
             </w:r>
           </w:p>
         </w:tc>
@@ -35308,7 +35254,61 @@
               <w:rPr>
                 <w:sz w:val="18"/>
               </w:rPr>
-              <w:t>fix(tests): remove unused pytz import causing CI failure</w:t>
+              <w:t>Merge remote-tracking branch 'origin/dependabot/pip/chatbot_service/sentry-sdk-2</w:t>
+            </w:r>
+          </w:p>
+        </w:tc>
+        <w:tc>
+          <w:tcPr>
+            <w:tcW w:type="dxa" w:w="2160"/>
+          </w:tcPr>
+          <w:p>
+            <w:r>
+              <w:rPr>
+                <w:sz w:val="18"/>
+              </w:rPr>
+              <w:t>Bappadala Rohith Kumar Naidu</w:t>
+            </w:r>
+          </w:p>
+        </w:tc>
+      </w:tr>
+      <w:tr>
+        <w:tc>
+          <w:tcPr>
+            <w:tcW w:type="dxa" w:w="2160"/>
+          </w:tcPr>
+          <w:p>
+            <w:r>
+              <w:rPr>
+                <w:sz w:val="18"/>
+              </w:rPr>
+              <w:t>d2c981e</w:t>
+            </w:r>
+          </w:p>
+        </w:tc>
+        <w:tc>
+          <w:tcPr>
+            <w:tcW w:type="dxa" w:w="2160"/>
+          </w:tcPr>
+          <w:p>
+            <w:r>
+              <w:rPr>
+                <w:sz w:val="18"/>
+              </w:rPr>
+              <w:t>2026-05-30</w:t>
+            </w:r>
+          </w:p>
+        </w:tc>
+        <w:tc>
+          <w:tcPr>
+            <w:tcW w:type="dxa" w:w="2160"/>
+          </w:tcPr>
+          <w:p>
+            <w:r>
+              <w:rPr>
+                <w:sz w:val="18"/>
+              </w:rPr>
+              <w:t>Merge remote-tracking branch 'origin/dependabot/pip/chatbot_service/pypdf-6.12.2</w:t>
             </w:r>
           </w:p>
         </w:tc>
@@ -36173,7 +36173,7 @@
               <w:rPr>
                 <w:sz w:val="18"/>
               </w:rPr>
-              <w:t>257</w:t>
+              <w:t>345</w:t>
             </w:r>
           </w:p>
         </w:tc>
@@ -36307,7 +36307,7 @@
         <w:br/>
         <w:t>Generated by scripts/update_master_doc.py</w:t>
         <w:br/>
-        <w:t>Timestamp: 2026-05-22 12:25 IST</w:t>
+        <w:t>Timestamp: 2026-06-08 23:07 IST</w:t>
         <w:br/>
         <w:t>Repository: github.com/SafeVixAI/SafeVixAI</w:t>
       </w:r>

</xml_diff>

<commit_message>
Deployed d792478 with MkDocs version: 1.6.1
</commit_message>
<xml_diff>
--- a/SafeVixAI_MASTER.docx
+++ b/SafeVixAI_MASTER.docx
@@ -33723,7 +33723,7 @@
           <w:i w:val="0"/>
           <w:sz w:val="22"/>
         </w:rPr>
-        <w:t>🕐 Last auto-updated: 2026-06-08 23:07 IST</w:t>
+        <w:t>🕐 Last auto-updated: 2026-06-09 11:52 IST</w:t>
       </w:r>
     </w:p>
     <w:p>
@@ -33923,7 +33923,7 @@
               <w:rPr>
                 <w:sz w:val="18"/>
               </w:rPr>
-              <w:t>2026-06-08</w:t>
+              <w:t>2026-06-09</w:t>
             </w:r>
           </w:p>
         </w:tc>
@@ -33951,7 +33951,7 @@
               <w:rPr>
                 <w:sz w:val="18"/>
               </w:rPr>
-              <w:t>35</w:t>
+              <w:t>2</w:t>
             </w:r>
           </w:p>
         </w:tc>
@@ -34060,7 +34060,7 @@
               <w:rPr>
                 <w:sz w:val="18"/>
               </w:rPr>
-              <w:t>470ms | HTTP 404 | v?</w:t>
+              <w:t>125ms | HTTP 404 | v?</w:t>
             </w:r>
           </w:p>
         </w:tc>
@@ -34101,7 +34101,7 @@
               <w:rPr>
                 <w:sz w:val="18"/>
               </w:rPr>
-              <w:t>484ms | HTTP 404 | v?</w:t>
+              <w:t>156ms | HTTP 404 | v?</w:t>
             </w:r>
           </w:p>
         </w:tc>
@@ -34142,7 +34142,7 @@
               <w:rPr>
                 <w:sz w:val="18"/>
               </w:rPr>
-              <w:t>441ms | HTTP 200 | v?</w:t>
+              <w:t>71ms | HTTP 200 | v?</w:t>
             </w:r>
           </w:p>
         </w:tc>
@@ -34250,7 +34250,7 @@
               <w:rPr>
                 <w:sz w:val="18"/>
               </w:rPr>
-              <w:t>⏳ Branch Protection Checks</w:t>
+              <w:t>⏳ Update Master Document</w:t>
             </w:r>
           </w:p>
         </w:tc>
@@ -34263,7 +34263,7 @@
               <w:rPr>
                 <w:sz w:val="18"/>
               </w:rPr>
-              <w:t>copilot/replace-hardcoded-color-value</w:t>
+              <w:t>main</w:t>
             </w:r>
           </w:p>
         </w:tc>
@@ -34276,7 +34276,7 @@
               <w:rPr>
                 <w:sz w:val="18"/>
               </w:rPr>
-              <w:t>action_required</w:t>
+              <w:t>in_progress</w:t>
             </w:r>
           </w:p>
         </w:tc>
@@ -34289,7 +34289,115 @@
               <w:rPr>
                 <w:sz w:val="18"/>
               </w:rPr>
-              <w:t>2026-06-08</w:t>
+              <w:t>2026-06-09</w:t>
+            </w:r>
+          </w:p>
+        </w:tc>
+      </w:tr>
+      <w:tr>
+        <w:tc>
+          <w:tcPr>
+            <w:tcW w:type="dxa" w:w="2160"/>
+          </w:tcPr>
+          <w:p>
+            <w:r>
+              <w:rPr>
+                <w:sz w:val="18"/>
+              </w:rPr>
+              <w:t>⏳ Deploy Enterprise Docs</w:t>
+            </w:r>
+          </w:p>
+        </w:tc>
+        <w:tc>
+          <w:tcPr>
+            <w:tcW w:type="dxa" w:w="2160"/>
+          </w:tcPr>
+          <w:p>
+            <w:r>
+              <w:rPr>
+                <w:sz w:val="18"/>
+              </w:rPr>
+              <w:t>main</w:t>
+            </w:r>
+          </w:p>
+        </w:tc>
+        <w:tc>
+          <w:tcPr>
+            <w:tcW w:type="dxa" w:w="2160"/>
+          </w:tcPr>
+          <w:p>
+            <w:r>
+              <w:rPr>
+                <w:sz w:val="18"/>
+              </w:rPr>
+              <w:t>in_progress</w:t>
+            </w:r>
+          </w:p>
+        </w:tc>
+        <w:tc>
+          <w:tcPr>
+            <w:tcW w:type="dxa" w:w="2160"/>
+          </w:tcPr>
+          <w:p>
+            <w:r>
+              <w:rPr>
+                <w:sz w:val="18"/>
+              </w:rPr>
+              <w:t>2026-06-09</w:t>
+            </w:r>
+          </w:p>
+        </w:tc>
+      </w:tr>
+      <w:tr>
+        <w:tc>
+          <w:tcPr>
+            <w:tcW w:type="dxa" w:w="2160"/>
+          </w:tcPr>
+          <w:p>
+            <w:r>
+              <w:rPr>
+                <w:sz w:val="18"/>
+              </w:rPr>
+              <w:t>⏳ Contract Tests</w:t>
+            </w:r>
+          </w:p>
+        </w:tc>
+        <w:tc>
+          <w:tcPr>
+            <w:tcW w:type="dxa" w:w="2160"/>
+          </w:tcPr>
+          <w:p>
+            <w:r>
+              <w:rPr>
+                <w:sz w:val="18"/>
+              </w:rPr>
+              <w:t>main</w:t>
+            </w:r>
+          </w:p>
+        </w:tc>
+        <w:tc>
+          <w:tcPr>
+            <w:tcW w:type="dxa" w:w="2160"/>
+          </w:tcPr>
+          <w:p>
+            <w:r>
+              <w:rPr>
+                <w:sz w:val="18"/>
+              </w:rPr>
+              <w:t>in_progress</w:t>
+            </w:r>
+          </w:p>
+        </w:tc>
+        <w:tc>
+          <w:tcPr>
+            <w:tcW w:type="dxa" w:w="2160"/>
+          </w:tcPr>
+          <w:p>
+            <w:r>
+              <w:rPr>
+                <w:sz w:val="18"/>
+              </w:rPr>
+              <w:t>2026-06-09</w:t>
             </w:r>
           </w:p>
         </w:tc>
@@ -34317,7 +34425,223 @@
               <w:rPr>
                 <w:sz w:val="18"/>
               </w:rPr>
-              <w:t>copilot/replace-hardcoded-color-value</w:t>
+              <w:t>main</w:t>
+            </w:r>
+          </w:p>
+        </w:tc>
+        <w:tc>
+          <w:tcPr>
+            <w:tcW w:type="dxa" w:w="2160"/>
+          </w:tcPr>
+          <w:p>
+            <w:r>
+              <w:rPr>
+                <w:sz w:val="18"/>
+              </w:rPr>
+              <w:t>in_progress</w:t>
+            </w:r>
+          </w:p>
+        </w:tc>
+        <w:tc>
+          <w:tcPr>
+            <w:tcW w:type="dxa" w:w="2160"/>
+          </w:tcPr>
+          <w:p>
+            <w:r>
+              <w:rPr>
+                <w:sz w:val="18"/>
+              </w:rPr>
+              <w:t>2026-06-09</w:t>
+            </w:r>
+          </w:p>
+        </w:tc>
+      </w:tr>
+      <w:tr>
+        <w:tc>
+          <w:tcPr>
+            <w:tcW w:type="dxa" w:w="2160"/>
+          </w:tcPr>
+          <w:p>
+            <w:r>
+              <w:rPr>
+                <w:sz w:val="18"/>
+              </w:rPr>
+              <w:t>⏳ Wiki Documentation Sync</w:t>
+            </w:r>
+          </w:p>
+        </w:tc>
+        <w:tc>
+          <w:tcPr>
+            <w:tcW w:type="dxa" w:w="2160"/>
+          </w:tcPr>
+          <w:p>
+            <w:r>
+              <w:rPr>
+                <w:sz w:val="18"/>
+              </w:rPr>
+              <w:t>main</w:t>
+            </w:r>
+          </w:p>
+        </w:tc>
+        <w:tc>
+          <w:tcPr>
+            <w:tcW w:type="dxa" w:w="2160"/>
+          </w:tcPr>
+          <w:p>
+            <w:r>
+              <w:rPr>
+                <w:sz w:val="18"/>
+              </w:rPr>
+              <w:t>in_progress</w:t>
+            </w:r>
+          </w:p>
+        </w:tc>
+        <w:tc>
+          <w:tcPr>
+            <w:tcW w:type="dxa" w:w="2160"/>
+          </w:tcPr>
+          <w:p>
+            <w:r>
+              <w:rPr>
+                <w:sz w:val="18"/>
+              </w:rPr>
+              <w:t>2026-06-09</w:t>
+            </w:r>
+          </w:p>
+        </w:tc>
+      </w:tr>
+      <w:tr>
+        <w:tc>
+          <w:tcPr>
+            <w:tcW w:type="dxa" w:w="2160"/>
+          </w:tcPr>
+          <w:p>
+            <w:r>
+              <w:rPr>
+                <w:sz w:val="18"/>
+              </w:rPr>
+              <w:t>⏳ Code Quality: Push on main</w:t>
+            </w:r>
+          </w:p>
+        </w:tc>
+        <w:tc>
+          <w:tcPr>
+            <w:tcW w:type="dxa" w:w="2160"/>
+          </w:tcPr>
+          <w:p>
+            <w:r>
+              <w:rPr>
+                <w:sz w:val="18"/>
+              </w:rPr>
+              <w:t>main</w:t>
+            </w:r>
+          </w:p>
+        </w:tc>
+        <w:tc>
+          <w:tcPr>
+            <w:tcW w:type="dxa" w:w="2160"/>
+          </w:tcPr>
+          <w:p>
+            <w:r>
+              <w:rPr>
+                <w:sz w:val="18"/>
+              </w:rPr>
+              <w:t>in_progress</w:t>
+            </w:r>
+          </w:p>
+        </w:tc>
+        <w:tc>
+          <w:tcPr>
+            <w:tcW w:type="dxa" w:w="2160"/>
+          </w:tcPr>
+          <w:p>
+            <w:r>
+              <w:rPr>
+                <w:sz w:val="18"/>
+              </w:rPr>
+              <w:t>2026-06-09</w:t>
+            </w:r>
+          </w:p>
+        </w:tc>
+      </w:tr>
+      <w:tr>
+        <w:tc>
+          <w:tcPr>
+            <w:tcW w:type="dxa" w:w="2160"/>
+          </w:tcPr>
+          <w:p>
+            <w:r>
+              <w:rPr>
+                <w:sz w:val="18"/>
+              </w:rPr>
+              <w:t>⏳ Push on main</w:t>
+            </w:r>
+          </w:p>
+        </w:tc>
+        <w:tc>
+          <w:tcPr>
+            <w:tcW w:type="dxa" w:w="2160"/>
+          </w:tcPr>
+          <w:p>
+            <w:r>
+              <w:rPr>
+                <w:sz w:val="18"/>
+              </w:rPr>
+              <w:t>main</w:t>
+            </w:r>
+          </w:p>
+        </w:tc>
+        <w:tc>
+          <w:tcPr>
+            <w:tcW w:type="dxa" w:w="2160"/>
+          </w:tcPr>
+          <w:p>
+            <w:r>
+              <w:rPr>
+                <w:sz w:val="18"/>
+              </w:rPr>
+              <w:t>in_progress</w:t>
+            </w:r>
+          </w:p>
+        </w:tc>
+        <w:tc>
+          <w:tcPr>
+            <w:tcW w:type="dxa" w:w="2160"/>
+          </w:tcPr>
+          <w:p>
+            <w:r>
+              <w:rPr>
+                <w:sz w:val="18"/>
+              </w:rPr>
+              <w:t>2026-06-09</w:t>
+            </w:r>
+          </w:p>
+        </w:tc>
+      </w:tr>
+      <w:tr>
+        <w:tc>
+          <w:tcPr>
+            <w:tcW w:type="dxa" w:w="2160"/>
+          </w:tcPr>
+          <w:p>
+            <w:r>
+              <w:rPr>
+                <w:sz w:val="18"/>
+              </w:rPr>
+              <w:t>⏳ Branch Protection Checks</w:t>
+            </w:r>
+          </w:p>
+        </w:tc>
+        <w:tc>
+          <w:tcPr>
+            <w:tcW w:type="dxa" w:w="2160"/>
+          </w:tcPr>
+          <w:p>
+            <w:r>
+              <w:rPr>
+                <w:sz w:val="18"/>
+              </w:rPr>
+              <w:t>copilot/fix-271806273-1189775594-56109f09-207f-4c1f-b6e9-92a559241e8f</w:t>
             </w:r>
           </w:p>
         </w:tc>
@@ -34343,331 +34667,7 @@
               <w:rPr>
                 <w:sz w:val="18"/>
               </w:rPr>
-              <w:t>2026-06-08</w:t>
-            </w:r>
-          </w:p>
-        </w:tc>
-      </w:tr>
-      <w:tr>
-        <w:tc>
-          <w:tcPr>
-            <w:tcW w:type="dxa" w:w="2160"/>
-          </w:tcPr>
-          <w:p>
-            <w:r>
-              <w:rPr>
-                <w:sz w:val="18"/>
-              </w:rPr>
-              <w:t>⏳ Render Deploy Readiness</w:t>
-            </w:r>
-          </w:p>
-        </w:tc>
-        <w:tc>
-          <w:tcPr>
-            <w:tcW w:type="dxa" w:w="2160"/>
-          </w:tcPr>
-          <w:p>
-            <w:r>
-              <w:rPr>
-                <w:sz w:val="18"/>
-              </w:rPr>
-              <w:t>copilot/replace-hardcoded-color-value</w:t>
-            </w:r>
-          </w:p>
-        </w:tc>
-        <w:tc>
-          <w:tcPr>
-            <w:tcW w:type="dxa" w:w="2160"/>
-          </w:tcPr>
-          <w:p>
-            <w:r>
-              <w:rPr>
-                <w:sz w:val="18"/>
-              </w:rPr>
-              <w:t>action_required</w:t>
-            </w:r>
-          </w:p>
-        </w:tc>
-        <w:tc>
-          <w:tcPr>
-            <w:tcW w:type="dxa" w:w="2160"/>
-          </w:tcPr>
-          <w:p>
-            <w:r>
-              <w:rPr>
-                <w:sz w:val="18"/>
-              </w:rPr>
-              <w:t>2026-06-08</w:t>
-            </w:r>
-          </w:p>
-        </w:tc>
-      </w:tr>
-      <w:tr>
-        <w:tc>
-          <w:tcPr>
-            <w:tcW w:type="dxa" w:w="2160"/>
-          </w:tcPr>
-          <w:p>
-            <w:r>
-              <w:rPr>
-                <w:sz w:val="18"/>
-              </w:rPr>
-              <w:t>⏳ Security Scan</w:t>
-            </w:r>
-          </w:p>
-        </w:tc>
-        <w:tc>
-          <w:tcPr>
-            <w:tcW w:type="dxa" w:w="2160"/>
-          </w:tcPr>
-          <w:p>
-            <w:r>
-              <w:rPr>
-                <w:sz w:val="18"/>
-              </w:rPr>
-              <w:t>copilot/replace-hardcoded-color-value</w:t>
-            </w:r>
-          </w:p>
-        </w:tc>
-        <w:tc>
-          <w:tcPr>
-            <w:tcW w:type="dxa" w:w="2160"/>
-          </w:tcPr>
-          <w:p>
-            <w:r>
-              <w:rPr>
-                <w:sz w:val="18"/>
-              </w:rPr>
-              <w:t>action_required</w:t>
-            </w:r>
-          </w:p>
-        </w:tc>
-        <w:tc>
-          <w:tcPr>
-            <w:tcW w:type="dxa" w:w="2160"/>
-          </w:tcPr>
-          <w:p>
-            <w:r>
-              <w:rPr>
-                <w:sz w:val="18"/>
-              </w:rPr>
-              <w:t>2026-06-08</w:t>
-            </w:r>
-          </w:p>
-        </w:tc>
-      </w:tr>
-      <w:tr>
-        <w:tc>
-          <w:tcPr>
-            <w:tcW w:type="dxa" w:w="2160"/>
-          </w:tcPr>
-          <w:p>
-            <w:r>
-              <w:rPr>
-                <w:sz w:val="18"/>
-              </w:rPr>
-              <w:t>⏳ Running Copilot cloud agent</w:t>
-            </w:r>
-          </w:p>
-        </w:tc>
-        <w:tc>
-          <w:tcPr>
-            <w:tcW w:type="dxa" w:w="2160"/>
-          </w:tcPr>
-          <w:p>
-            <w:r>
-              <w:rPr>
-                <w:sz w:val="18"/>
-              </w:rPr>
-              <w:t>copilot/replace-hardcoded-color-value</w:t>
-            </w:r>
-          </w:p>
-        </w:tc>
-        <w:tc>
-          <w:tcPr>
-            <w:tcW w:type="dxa" w:w="2160"/>
-          </w:tcPr>
-          <w:p>
-            <w:r>
-              <w:rPr>
-                <w:sz w:val="18"/>
-              </w:rPr>
-              <w:t>in_progress</w:t>
-            </w:r>
-          </w:p>
-        </w:tc>
-        <w:tc>
-          <w:tcPr>
-            <w:tcW w:type="dxa" w:w="2160"/>
-          </w:tcPr>
-          <w:p>
-            <w:r>
-              <w:rPr>
-                <w:sz w:val="18"/>
-              </w:rPr>
-              <w:t>2026-06-08</w:t>
-            </w:r>
-          </w:p>
-        </w:tc>
-      </w:tr>
-      <w:tr>
-        <w:tc>
-          <w:tcPr>
-            <w:tcW w:type="dxa" w:w="2160"/>
-          </w:tcPr>
-          <w:p>
-            <w:r>
-              <w:rPr>
-                <w:sz w:val="18"/>
-              </w:rPr>
-              <w:t>✅ Code Quality: PR #167</w:t>
-            </w:r>
-          </w:p>
-        </w:tc>
-        <w:tc>
-          <w:tcPr>
-            <w:tcW w:type="dxa" w:w="2160"/>
-          </w:tcPr>
-          <w:p>
-            <w:r>
-              <w:rPr>
-                <w:sz w:val="18"/>
-              </w:rPr>
-              <w:t>refs/pull/167/head</w:t>
-            </w:r>
-          </w:p>
-        </w:tc>
-        <w:tc>
-          <w:tcPr>
-            <w:tcW w:type="dxa" w:w="2160"/>
-          </w:tcPr>
-          <w:p>
-            <w:r>
-              <w:rPr>
-                <w:sz w:val="18"/>
-              </w:rPr>
-              <w:t>success</w:t>
-            </w:r>
-          </w:p>
-        </w:tc>
-        <w:tc>
-          <w:tcPr>
-            <w:tcW w:type="dxa" w:w="2160"/>
-          </w:tcPr>
-          <w:p>
-            <w:r>
-              <w:rPr>
-                <w:sz w:val="18"/>
-              </w:rPr>
-              <w:t>2026-06-08</w:t>
-            </w:r>
-          </w:p>
-        </w:tc>
-      </w:tr>
-      <w:tr>
-        <w:tc>
-          <w:tcPr>
-            <w:tcW w:type="dxa" w:w="2160"/>
-          </w:tcPr>
-          <w:p>
-            <w:r>
-              <w:rPr>
-                <w:sz w:val="18"/>
-              </w:rPr>
-              <w:t>✅ PR #167</w:t>
-            </w:r>
-          </w:p>
-        </w:tc>
-        <w:tc>
-          <w:tcPr>
-            <w:tcW w:type="dxa" w:w="2160"/>
-          </w:tcPr>
-          <w:p>
-            <w:r>
-              <w:rPr>
-                <w:sz w:val="18"/>
-              </w:rPr>
-              <w:t>refs/pull/167/head</w:t>
-            </w:r>
-          </w:p>
-        </w:tc>
-        <w:tc>
-          <w:tcPr>
-            <w:tcW w:type="dxa" w:w="2160"/>
-          </w:tcPr>
-          <w:p>
-            <w:r>
-              <w:rPr>
-                <w:sz w:val="18"/>
-              </w:rPr>
-              <w:t>success</w:t>
-            </w:r>
-          </w:p>
-        </w:tc>
-        <w:tc>
-          <w:tcPr>
-            <w:tcW w:type="dxa" w:w="2160"/>
-          </w:tcPr>
-          <w:p>
-            <w:r>
-              <w:rPr>
-                <w:sz w:val="18"/>
-              </w:rPr>
-              <w:t>2026-06-08</w:t>
-            </w:r>
-          </w:p>
-        </w:tc>
-      </w:tr>
-      <w:tr>
-        <w:tc>
-          <w:tcPr>
-            <w:tcW w:type="dxa" w:w="2160"/>
-          </w:tcPr>
-          <w:p>
-            <w:r>
-              <w:rPr>
-                <w:sz w:val="18"/>
-              </w:rPr>
-              <w:t>⏳ Blue-Green Deployment</w:t>
-            </w:r>
-          </w:p>
-        </w:tc>
-        <w:tc>
-          <w:tcPr>
-            <w:tcW w:type="dxa" w:w="2160"/>
-          </w:tcPr>
-          <w:p>
-            <w:r>
-              <w:rPr>
-                <w:sz w:val="18"/>
-              </w:rPr>
-              <w:t>main</w:t>
-            </w:r>
-          </w:p>
-        </w:tc>
-        <w:tc>
-          <w:tcPr>
-            <w:tcW w:type="dxa" w:w="2160"/>
-          </w:tcPr>
-          <w:p>
-            <w:r>
-              <w:rPr>
-                <w:sz w:val="18"/>
-              </w:rPr>
-              <w:t>skipped</w:t>
-            </w:r>
-          </w:p>
-        </w:tc>
-        <w:tc>
-          <w:tcPr>
-            <w:tcW w:type="dxa" w:w="2160"/>
-          </w:tcPr>
-          <w:p>
-            <w:r>
-              <w:rPr>
-                <w:sz w:val="18"/>
-              </w:rPr>
-              <w:t>2026-06-08</w:t>
+              <w:t>2026-06-09</w:t>
             </w:r>
           </w:p>
         </w:tc>
@@ -34796,7 +34796,7 @@
               <w:rPr>
                 <w:sz w:val="18"/>
               </w:rPr>
-              <w:t>de21aa0</w:t>
+              <w:t>52397b4</w:t>
             </w:r>
           </w:p>
         </w:tc>
@@ -34809,7 +34809,7 @@
               <w:rPr>
                 <w:sz w:val="18"/>
               </w:rPr>
-              <w:t>2026-06-08</w:t>
+              <w:t>2026-06-09</w:t>
             </w:r>
           </w:p>
         </w:tc>
@@ -34822,7 +34822,7 @@
               <w:rPr>
                 <w:sz w:val="18"/>
               </w:rPr>
-              <w:t>100% test coverage: fix skipped tests + OpenAPI validation + production bug</w:t>
+              <w:t>Merge pull request #100 from SafeVixAI/docs-wiki-auto-update</w:t>
             </w:r>
           </w:p>
         </w:tc>
@@ -34850,7 +34850,7 @@
               <w:rPr>
                 <w:sz w:val="18"/>
               </w:rPr>
-              <w:t>45115a0</w:t>
+              <w:t>425db96</w:t>
             </w:r>
           </w:p>
         </w:tc>
@@ -34863,7 +34863,7 @@
               <w:rPr>
                 <w:sz w:val="18"/>
               </w:rPr>
-              <w:t>2026-06-08</w:t>
+              <w:t>2026-06-09</w:t>
             </w:r>
           </w:p>
         </w:tc>
@@ -34876,7 +34876,61 @@
               <w:rPr>
                 <w:sz w:val="18"/>
               </w:rPr>
-              <w:t>Enterprise: landing page integration + auth E2E tests</w:t>
+              <w:t>docs(wiki): auto-sync wiki documentation [automated]</w:t>
+            </w:r>
+          </w:p>
+        </w:tc>
+        <w:tc>
+          <w:tcPr>
+            <w:tcW w:type="dxa" w:w="2160"/>
+          </w:tcPr>
+          <w:p>
+            <w:r>
+              <w:rPr>
+                <w:sz w:val="18"/>
+              </w:rPr>
+              <w:t>rohitkumarnaidu</w:t>
+            </w:r>
+          </w:p>
+        </w:tc>
+      </w:tr>
+      <w:tr>
+        <w:tc>
+          <w:tcPr>
+            <w:tcW w:type="dxa" w:w="2160"/>
+          </w:tcPr>
+          <w:p>
+            <w:r>
+              <w:rPr>
+                <w:sz w:val="18"/>
+              </w:rPr>
+              <w:t>7c3823f</w:t>
+            </w:r>
+          </w:p>
+        </w:tc>
+        <w:tc>
+          <w:tcPr>
+            <w:tcW w:type="dxa" w:w="2160"/>
+          </w:tcPr>
+          <w:p>
+            <w:r>
+              <w:rPr>
+                <w:sz w:val="18"/>
+              </w:rPr>
+              <w:t>2026-06-09</w:t>
+            </w:r>
+          </w:p>
+        </w:tc>
+        <w:tc>
+          <w:tcPr>
+            <w:tcW w:type="dxa" w:w="2160"/>
+          </w:tcPr>
+          <w:p>
+            <w:r>
+              <w:rPr>
+                <w:sz w:val="18"/>
+              </w:rPr>
+              <w:t>fix(e2e): automate static asset copying, auto-dismiss SystemStatusBar, and fix o</w:t>
             </w:r>
           </w:p>
         </w:tc>
@@ -34904,7 +34958,7 @@
               <w:rPr>
                 <w:sz w:val="18"/>
               </w:rPr>
-              <w:t>74c45c8</w:t>
+              <w:t>372b126</w:t>
             </w:r>
           </w:p>
         </w:tc>
@@ -34917,7 +34971,7 @@
               <w:rPr>
                 <w:sz w:val="18"/>
               </w:rPr>
-              <w:t>2026-06-08</w:t>
+              <w:t>2026-06-09</w:t>
             </w:r>
           </w:p>
         </w:tc>
@@ -34930,7 +34984,7 @@
               <w:rPr>
                 <w:sz w:val="18"/>
               </w:rPr>
-              <w:t>Zero-warning lint compliance</w:t>
+              <w:t>style: fix remaining auto-fixable python quality findings</w:t>
             </w:r>
           </w:p>
         </w:tc>
@@ -34958,7 +35012,7 @@
               <w:rPr>
                 <w:sz w:val="18"/>
               </w:rPr>
-              <w:t>1201708</w:t>
+              <w:t>97c854f</w:t>
             </w:r>
           </w:p>
         </w:tc>
@@ -34971,7 +35025,7 @@
               <w:rPr>
                 <w:sz w:val="18"/>
               </w:rPr>
-              <w:t>2026-06-01</w:t>
+              <w:t>2026-06-09</w:t>
             </w:r>
           </w:p>
         </w:tc>
@@ -34984,7 +35038,7 @@
               <w:rPr>
                 <w:sz w:val="18"/>
               </w:rPr>
-              <w:t>Fix GSAP SSR crash &amp; E2E test flakiness</w:t>
+              <w:t>fix(e2e): copy .next/static into standalone output for JS/CSS hydration</w:t>
             </w:r>
           </w:p>
         </w:tc>
@@ -35012,7 +35066,7 @@
               <w:rPr>
                 <w:sz w:val="18"/>
               </w:rPr>
-              <w:t>208d0f0</w:t>
+              <w:t>d74dfa9</w:t>
             </w:r>
           </w:p>
         </w:tc>
@@ -35025,7 +35079,7 @@
               <w:rPr>
                 <w:sz w:val="18"/>
               </w:rPr>
-              <w:t>2026-05-31</w:t>
+              <w:t>2026-06-09</w:t>
             </w:r>
           </w:p>
         </w:tc>
@@ -35038,7 +35092,7 @@
               <w:rPr>
                 <w:sz w:val="18"/>
               </w:rPr>
-              <w:t>fix: SSR mounted guards, E2E auth route mock, Logo component integration</w:t>
+              <w:t>style: run ruff check --fix --unsafe-fixes to resolve python maintainability fin</w:t>
             </w:r>
           </w:p>
         </w:tc>
@@ -35066,7 +35120,7 @@
               <w:rPr>
                 <w:sz w:val="18"/>
               </w:rPr>
-              <w:t>19aac91</w:t>
+              <w:t>b6808fa</w:t>
             </w:r>
           </w:p>
         </w:tc>
@@ -35079,7 +35133,7 @@
               <w:rPr>
                 <w:sz w:val="18"/>
               </w:rPr>
-              <w:t>2026-05-31</w:t>
+              <w:t>2026-06-09</w:t>
             </w:r>
           </w:p>
         </w:tc>
@@ -35092,7 +35146,7 @@
               <w:rPr>
                 <w:sz w:val="18"/>
               </w:rPr>
-              <w:t>fix: CI — translations tracked, E2E text mismatches, gitignore, responsive thres</w:t>
+              <w:t>security: upgrade base OS packages inside all Dockerfiles to resolve Trivy RCE a</w:t>
             </w:r>
           </w:p>
         </w:tc>
@@ -35120,7 +35174,7 @@
               <w:rPr>
                 <w:sz w:val="18"/>
               </w:rPr>
-              <w:t>b9582f7</w:t>
+              <w:t>9503986</w:t>
             </w:r>
           </w:p>
         </w:tc>
@@ -35133,7 +35187,7 @@
               <w:rPr>
                 <w:sz w:val="18"/>
               </w:rPr>
-              <w:t>2026-05-30</w:t>
+              <w:t>2026-06-09</w:t>
             </w:r>
           </w:p>
         </w:tc>
@@ -35146,7 +35200,7 @@
               <w:rPr>
                 <w:sz w:val="18"/>
               </w:rPr>
-              <w:t>Merge remote-tracking branch 'origin/dependabot/pip/backend/kaggle-2.2.0'</w:t>
+              <w:t>security: upgrade chromadb to 1.5.9 to resolve pre-auth RCE vulnerability and up</w:t>
             </w:r>
           </w:p>
         </w:tc>
@@ -35174,7 +35228,7 @@
               <w:rPr>
                 <w:sz w:val="18"/>
               </w:rPr>
-              <w:t>16d6d4e</w:t>
+              <w:t>86b8ecf</w:t>
             </w:r>
           </w:p>
         </w:tc>
@@ -35187,7 +35241,7 @@
               <w:rPr>
                 <w:sz w:val="18"/>
               </w:rPr>
-              <w:t>2026-05-30</w:t>
+              <w:t>2026-06-09</w:t>
             </w:r>
           </w:p>
         </w:tc>
@@ -35200,7 +35254,7 @@
               <w:rPr>
                 <w:sz w:val="18"/>
               </w:rPr>
-              <w:t>Merge remote-tracking branch 'origin/dependabot/pip/backend/pytest-cov-7.1.0'</w:t>
+              <w:t>fix: apply PR #170 changes — IMPLEMENTATION_PLAN corrections, E2E type safety, d</w:t>
             </w:r>
           </w:p>
         </w:tc>
@@ -35228,7 +35282,7 @@
               <w:rPr>
                 <w:sz w:val="18"/>
               </w:rPr>
-              <w:t>68379f0</w:t>
+              <w:t>7c3d484</w:t>
             </w:r>
           </w:p>
         </w:tc>
@@ -35241,7 +35295,7 @@
               <w:rPr>
                 <w:sz w:val="18"/>
               </w:rPr>
-              <w:t>2026-05-30</w:t>
+              <w:t>2026-06-09</w:t>
             </w:r>
           </w:p>
         </w:tc>
@@ -35254,61 +35308,7 @@
               <w:rPr>
                 <w:sz w:val="18"/>
               </w:rPr>
-              <w:t>Merge remote-tracking branch 'origin/dependabot/pip/chatbot_service/sentry-sdk-2</w:t>
-            </w:r>
-          </w:p>
-        </w:tc>
-        <w:tc>
-          <w:tcPr>
-            <w:tcW w:type="dxa" w:w="2160"/>
-          </w:tcPr>
-          <w:p>
-            <w:r>
-              <w:rPr>
-                <w:sz w:val="18"/>
-              </w:rPr>
-              <w:t>Bappadala Rohith Kumar Naidu</w:t>
-            </w:r>
-          </w:p>
-        </w:tc>
-      </w:tr>
-      <w:tr>
-        <w:tc>
-          <w:tcPr>
-            <w:tcW w:type="dxa" w:w="2160"/>
-          </w:tcPr>
-          <w:p>
-            <w:r>
-              <w:rPr>
-                <w:sz w:val="18"/>
-              </w:rPr>
-              <w:t>d2c981e</w:t>
-            </w:r>
-          </w:p>
-        </w:tc>
-        <w:tc>
-          <w:tcPr>
-            <w:tcW w:type="dxa" w:w="2160"/>
-          </w:tcPr>
-          <w:p>
-            <w:r>
-              <w:rPr>
-                <w:sz w:val="18"/>
-              </w:rPr>
-              <w:t>2026-05-30</w:t>
-            </w:r>
-          </w:p>
-        </w:tc>
-        <w:tc>
-          <w:tcPr>
-            <w:tcW w:type="dxa" w:w="2160"/>
-          </w:tcPr>
-          <w:p>
-            <w:r>
-              <w:rPr>
-                <w:sz w:val="18"/>
-              </w:rPr>
-              <w:t>Merge remote-tracking branch 'origin/dependabot/pip/chatbot_service/pypdf-6.12.2</w:t>
+              <w:t>fix: apply PR #169 changes — UIUX typo fixes and deterministic E2E offline check</w:t>
             </w:r>
           </w:p>
         </w:tc>
@@ -36173,7 +36173,7 @@
               <w:rPr>
                 <w:sz w:val="18"/>
               </w:rPr>
-              <w:t>345</w:t>
+              <w:t>374</w:t>
             </w:r>
           </w:p>
         </w:tc>
@@ -36307,7 +36307,7 @@
         <w:br/>
         <w:t>Generated by scripts/update_master_doc.py</w:t>
         <w:br/>
-        <w:t>Timestamp: 2026-06-08 23:07 IST</w:t>
+        <w:t>Timestamp: 2026-06-09 11:52 IST</w:t>
         <w:br/>
         <w:t>Repository: github.com/SafeVixAI/SafeVixAI</w:t>
       </w:r>

</xml_diff>